<commit_message>
patent disclosure v2: core claim is two-stage selection (anchor map prefilter + single-head sign screen + continuous injection), with E03 negative and E04 confirmatory data
Co-Authored-By: Claude Opus 5.5 <noreply@anthropic.com>
</commit_message>
<xml_diff>
--- a/patent/交底书-基于内容不变锚点的属性承载注意力头定位与调控.docx
+++ b/patent/交底书-基于内容不变锚点的属性承载注意力头定位与调控.docx
@@ -7,7 +7,7 @@
         <w:pStyle w:val="Title"/>
       </w:pPr>
       <w:r>
-        <w:t>技术交底书（草稿）</w:t>
+        <w:t>技术交底书（草稿 v2）</w:t>
       </w:r>
     </w:p>
     <w:p>
@@ -33,6 +33,63 @@
           <w:i/>
         </w:rPr>
         <w:t>本草稿由研发方整理，不构成法律意见。新颖性和创造性结论、权利要求的最终措辞，以专利代理人检索和撰写为准。</w:t>
+      </w:r>
+    </w:p>
+    <w:p>
+      <w:r>
+        <w:rPr>
+          <w:b/>
+          <w:i/>
+        </w:rPr>
+        <w:t>v2 相对 v1 的变化（2026-10-07）</w:t>
+      </w:r>
+      <w:r>
+        <w:rPr>
+          <w:b w:val="0"/>
+          <w:i/>
+        </w:rPr>
+        <w:t>：</w:t>
+      </w:r>
+    </w:p>
+    <w:p>
+      <w:r>
+        <w:rPr>
+          <w:b w:val="0"/>
+          <w:i/>
+        </w:rPr>
+        <w:t>- 核心方案改为</w:t>
+      </w:r>
+      <w:r>
+        <w:rPr>
+          <w:b/>
+          <w:i/>
+        </w:rPr>
+        <w:t>两阶段选择</w:t>
+      </w:r>
+      <w:r>
+        <w:rPr>
+          <w:b w:val="0"/>
+          <w:i/>
+        </w:rPr>
+        <w:t>：先用锚点承载分数预筛，再用单头方向筛选。</w:t>
+      </w:r>
+    </w:p>
+    <w:p>
+      <w:r>
+        <w:rPr>
+          <w:b w:val="0"/>
+          <w:i/>
+        </w:rPr>
+        <w:t>- 补充了 8B 模型的阴性结果，说明“只按承载分数取前 k 个”为什么不够。</w:t>
+      </w:r>
+    </w:p>
+    <w:p>
+      <w:r>
+        <w:rPr>
+          <w:b w:val="0"/>
+          <w:i/>
+        </w:rPr>
+        <w:t>- 补充了 14B 模型的确认性实验，全部预设门槛通过。</w:t>
       </w:r>
     </w:p>
     <w:tbl>
@@ -96,7 +153,7 @@
               <w:rPr>
                 <w:b w:val="0"/>
               </w:rPr>
-              <w:t>一种基于内容不变锚点的大语言模型属性承载注意力头定位方法、调控方法、装置及存储介质</w:t>
+              <w:t>一种基于内容不变锚点预筛与单头方向筛选的大语言模型属性调控头选择方法、调控方法、装置及存储介质</w:t>
             </w:r>
           </w:p>
         </w:tc>
@@ -267,7 +324,7 @@
         <w:rPr>
           <w:b w:val="0"/>
         </w:rPr>
-        <w:t>在基于 Transformer 的大语言模型中，定位承载文本属性（如情绪、语气、态度）的注意力头；</w:t>
+        <w:t>在基于 Transformer 的大语言模型中，选择用于调控文本属性（如情绪、语气、态度）的注意力头；</w:t>
       </w:r>
     </w:p>
     <w:p>
@@ -278,7 +335,7 @@
         <w:rPr>
           <w:b w:val="0"/>
         </w:rPr>
-        <w:t>利用定位结果，对模型生成文本的属性进行调控；</w:t>
+        <w:t>利用所选注意力头，对生成文本的属性进行调控；</w:t>
       </w:r>
     </w:p>
     <w:p>
@@ -289,7 +346,7 @@
         <w:rPr>
           <w:b w:val="0"/>
         </w:rPr>
-        <w:t>利用定位结果，对模型内部的属性状态进行实时读出。</w:t>
+        <w:t>利用所选注意力头，对模型内部属性状态进行读出。</w:t>
       </w:r>
     </w:p>
     <w:p>
@@ -313,7 +370,7 @@
         <w:rPr>
           <w:b w:val="0"/>
         </w:rPr>
-        <w:t>大语言模型生成的文本带有情绪、语气等属性。情感陪伴、客服、虚拟形象驱动、AI 安全监测等应用，需要知道这些属性在模型内部由哪些部件承载，以便：</w:t>
+        <w:t>情感陪伴、客服、虚拟形象驱动、AI 安全等应用，需要做两件事：</w:t>
       </w:r>
     </w:p>
     <w:p>
@@ -324,7 +381,7 @@
         <w:rPr>
           <w:b w:val="0"/>
         </w:rPr>
-        <w:t>调控生成文本的属性，例如让回复更温和，或保持指定的情绪；</w:t>
+        <w:t>调控大语言模型生成文本的属性，例如让回复更温和，或保持指定情绪；</w:t>
       </w:r>
     </w:p>
     <w:p>
@@ -335,7 +392,27 @@
         <w:rPr>
           <w:b w:val="0"/>
         </w:rPr>
-        <w:t>在文字生成之前或生成过程中，读出模型内部的属性状态，用于驱动表情或提前预警。</w:t>
+        <w:t>读出模型内部的属性状态。</w:t>
+      </w:r>
+    </w:p>
+    <w:p>
+      <w:r>
+        <w:rPr>
+          <w:b w:val="0"/>
+        </w:rPr>
+        <w:t>一类有效的做法，是在少数注意力头上注入“属性方向”向量。这类做法的关键难点在于：</w:t>
+      </w:r>
+      <w:r>
+        <w:rPr>
+          <w:b/>
+        </w:rPr>
+        <w:t>选哪些头</w:t>
+      </w:r>
+      <w:r>
+        <w:rPr>
+          <w:b w:val="0"/>
+        </w:rPr>
+        <w:t>。</w:t>
       </w:r>
     </w:p>
     <w:p>
@@ -359,7 +436,7 @@
         <w:rPr>
           <w:b w:val="0"/>
         </w:rPr>
-        <w:t>来源：Li 等人，“Inference-Time Intervention: Eliciting Truthful Answers from a Language Model”，NeurIPS 2023，arXiv:2306.03341。</w:t>
+        <w:t>来源：Li 等人，NeurIPS 2023，arXiv:2306.03341。</w:t>
       </w:r>
     </w:p>
     <w:p>
@@ -367,40 +444,7 @@
         <w:rPr>
           <w:b w:val="0"/>
         </w:rPr>
-        <w:t>做法：</w:t>
-      </w:r>
-    </w:p>
-    <w:p>
-      <w:pPr>
-        <w:pStyle w:val="ListNumber"/>
-      </w:pPr>
-      <w:r>
-        <w:rPr>
-          <w:b w:val="0"/>
-        </w:rPr>
-        <w:t>对每个注意力头的输出训练线性探针；</w:t>
-      </w:r>
-    </w:p>
-    <w:p>
-      <w:pPr>
-        <w:pStyle w:val="ListNumber"/>
-      </w:pPr>
-      <w:r>
-        <w:rPr>
-          <w:b w:val="0"/>
-        </w:rPr>
-        <w:t>按探针准确度选出前 K 个头；</w:t>
-      </w:r>
-    </w:p>
-    <w:p>
-      <w:pPr>
-        <w:pStyle w:val="ListNumber"/>
-      </w:pPr>
-      <w:r>
-        <w:rPr>
-          <w:b w:val="0"/>
-        </w:rPr>
-        <w:t>推理时沿真/假两类均值差方向平移这些头的输出。</w:t>
+        <w:t>做法：对每个注意力头的输出训练线性探针，按探针准确度选出前 K 个头，然后沿类别均值差方向平移这些头的输出。</w:t>
       </w:r>
     </w:p>
     <w:p>
@@ -419,7 +463,7 @@
         <w:rPr>
           <w:b w:val="0"/>
         </w:rPr>
-        <w:t>需要为每个头单独训练探针。</w:t>
+        <w:t>要为每个头训练探针。</w:t>
       </w:r>
     </w:p>
     <w:p>
@@ -430,7 +474,7 @@
         <w:rPr>
           <w:b w:val="0"/>
         </w:rPr>
-        <w:t>探针读取的位置和属性本身的字面表达处于同一位置，所以准确度高的头，可能只是在“读字面”（比如直接看到“生气”这个词），并不一定把属性传递到后续文本。</w:t>
+        <w:t>按“可读性”选头，但可读性高不等于推动效果为正（见 2.3）。</w:t>
       </w:r>
     </w:p>
     <w:p>
@@ -441,7 +485,7 @@
         <w:rPr>
           <w:b w:val="0"/>
         </w:rPr>
-        <w:t>选头依据是可读性，而不是承载程度。</w:t>
+        <w:t>探针读取的位置与属性的字面表达在同一处，容易选到只是“读字面”的头。</w:t>
       </w:r>
     </w:p>
     <w:p>
@@ -457,7 +501,7 @@
         <w:rPr>
           <w:b w:val="0"/>
         </w:rPr>
-        <w:t>来源：Wang 等人，“Do LLMs ‘Feel’? Emotion Circuits Discovery and Control”，arXiv:2510.11328，2025。</w:t>
+        <w:t>来源：Wang 等人，arXiv:2510.11328，2025。</w:t>
       </w:r>
     </w:p>
     <w:p>
@@ -465,51 +509,7 @@
         <w:rPr>
           <w:b w:val="0"/>
         </w:rPr>
-        <w:t>做法：</w:t>
-      </w:r>
-    </w:p>
-    <w:p>
-      <w:pPr>
-        <w:pStyle w:val="ListNumber"/>
-      </w:pPr>
-      <w:r>
-        <w:rPr>
-          <w:b w:val="0"/>
-        </w:rPr>
-        <w:t>构造事件语义决定情绪、参与者和情境固定的数据；</w:t>
-      </w:r>
-    </w:p>
-    <w:p>
-      <w:pPr>
-        <w:pStyle w:val="ListNumber"/>
-      </w:pPr>
-      <w:r>
-        <w:rPr>
-          <w:b w:val="0"/>
-        </w:rPr>
-        <w:t>在用户输入的最后一个 token 处读取残差流；</w:t>
-      </w:r>
-    </w:p>
-    <w:p>
-      <w:pPr>
-        <w:pStyle w:val="ListNumber"/>
-      </w:pPr>
-      <w:r>
-        <w:rPr>
-          <w:b w:val="0"/>
-        </w:rPr>
-        <w:t>逐个将注意力头置零（因果消融），测量其对情绪方向投影的影响，以此给头排序；</w:t>
-      </w:r>
-    </w:p>
-    <w:p>
-      <w:pPr>
-        <w:pStyle w:val="ListNumber"/>
-      </w:pPr>
-      <w:r>
-        <w:rPr>
-          <w:b w:val="0"/>
-        </w:rPr>
-        <w:t>在最后一个 token 位置注入情绪差向量。</w:t>
+        <w:t>做法：在用户输入的最后一个 token 处读取残差流，逐个将注意力头置零（因果消融）给头排序，然后在最后一个 token 位置注入情绪差向量。</w:t>
       </w:r>
     </w:p>
     <w:p>
@@ -528,7 +528,7 @@
         <w:rPr>
           <w:b w:val="0"/>
         </w:rPr>
-        <w:t>需要逐头做干预实验，计算量随头数线性增长。</w:t>
+        <w:t>要对全部头逐个做干预，计算量随头数线性增长。</w:t>
       </w:r>
     </w:p>
     <w:p>
@@ -539,7 +539,7 @@
         <w:rPr>
           <w:b w:val="0"/>
         </w:rPr>
-        <w:t>读取位置是输入末尾，无法区分“编码情绪”和“把情绪传递到后续内容”的部件。</w:t>
+        <w:t>读取位置无法区分“编码情绪”和“把情绪传递到后续内容”。</w:t>
       </w:r>
     </w:p>
     <w:p>
@@ -566,7 +566,7 @@
         <w:rPr>
           <w:b w:val="0"/>
         </w:rPr>
-        <w:t>来源：如 Zou 等人 2023 年的 Representation Engineering。</w:t>
+        <w:t>做法：在整层残差流上加入属性方向。</w:t>
       </w:r>
     </w:p>
     <w:p>
@@ -574,7 +574,15 @@
         <w:rPr>
           <w:b w:val="0"/>
         </w:rPr>
-        <w:t>做法：在残差流的整层上加入属性方向。</w:t>
+        <w:t>缺点：粒度粗，容易影响流畅度和事实性，也不提供部件级的选择。</w:t>
+      </w:r>
+    </w:p>
+    <w:p>
+      <w:r>
+        <w:rPr>
+          <w:b/>
+        </w:rPr>
+        <w:t>现有技术四：逐部件激活修补（activation patching）定位</w:t>
       </w:r>
     </w:p>
     <w:p>
@@ -582,18 +590,23 @@
         <w:rPr>
           <w:b w:val="0"/>
         </w:rPr>
-        <w:t>缺点：</w:t>
+        <w:t>缺点：计算量大。研发方实验中，仅在 512 个头的层窗口内做单头修补，就耗时约 2682 秒（单张 RTX 5090）。</w:t>
       </w:r>
     </w:p>
     <w:p>
       <w:pPr>
-        <w:pStyle w:val="ListNumber"/>
-      </w:pPr>
+        <w:pStyle w:val="Heading2"/>
+      </w:pPr>
+      <w:r>
+        <w:t>2.3 研发方发现的、现有“按可读性选头”做法的内在缺陷</w:t>
+      </w:r>
+    </w:p>
+    <w:p>
       <w:r>
         <w:rPr>
           <w:b w:val="0"/>
         </w:rPr>
-        <w:t>作用于整层，粒度粗。</w:t>
+        <w:t>研发方在 Qwen3-8B 上按预先登记的方案做了检验：</w:t>
       </w:r>
     </w:p>
     <w:p>
@@ -604,7 +617,7 @@
         <w:rPr>
           <w:b w:val="0"/>
         </w:rPr>
-        <w:t>容易影响流畅度和事实性。</w:t>
+        <w:t>用“锚点承载分数”（本发明第一阶段，属于一种“可读性”指标）取前 12 个头；</w:t>
       </w:r>
     </w:p>
     <w:p>
@@ -615,23 +628,27 @@
         <w:rPr>
           <w:b w:val="0"/>
         </w:rPr>
-        <w:t>不提供部件级的定位。</w:t>
+        <w:t>在这 12 个头上持续注入愤怒导向向量。</w:t>
       </w:r>
     </w:p>
     <w:p>
+      <w:r>
+        <w:rPr>
+          <w:b w:val="0"/>
+        </w:rPr>
+        <w:t>结果：生成文本的愤怒程度</w:t>
+      </w:r>
       <w:r>
         <w:rPr>
           <w:b/>
         </w:rPr>
-        <w:t>现有技术四：基于激活修补（activation patching）的定位</w:t>
-      </w:r>
-    </w:p>
-    <w:p>
+        <w:t>与不干预无差别</w:t>
+      </w:r>
       <w:r>
         <w:rPr>
           <w:b w:val="0"/>
         </w:rPr>
-        <w:t>做法：对每个候选部件分别做“供体→受体”替换实验。</w:t>
+        <w:t>，+0.03，95% 置信区间 [−0.09, 0.14]。</w:t>
       </w:r>
     </w:p>
     <w:p>
@@ -639,143 +656,468 @@
         <w:rPr>
           <w:b w:val="0"/>
         </w:rPr>
-        <w:t>缺点：计算量大。在研发方的实验中，仅在 512 个头的层窗口内做单头修补，就耗时约 2682 秒（单张 RTX 5090 GPU），峰值显存约 10.4 GiB。</w:t>
+        <w:t>随后逐个测量单头的导向效果，发现：</w:t>
       </w:r>
     </w:p>
     <w:p>
       <w:pPr>
-        <w:pStyle w:val="Heading2"/>
-      </w:pPr>
-      <w:r>
-        <w:t>2.3 本发明要解决的技术问题</w:t>
-      </w:r>
-    </w:p>
-    <w:p>
-      <w:pPr>
-        <w:pStyle w:val="ListNumber"/>
-      </w:pPr>
+        <w:pStyle w:val="ListBullet"/>
+      </w:pPr>
+      <w:r>
+        <w:rPr>
+          <w:b w:val="0"/>
+        </w:rPr>
+        <w:t>承载分数前 60 名中，有 50 个头的导向效果显著；随机 60 个头中只有 24 个（Fisher 检验 p = 1.7×10⁻⁶）。说明可读性确实能找出</w:t>
+      </w:r>
       <w:r>
         <w:rPr>
           <w:b/>
         </w:rPr>
-        <w:t>如何以低计算成本、不训练逐头探针、不做逐头干预的方式，定位真正把文本属性传递到后续内容的注意力头</w:t>
+        <w:t>与属性相关</w:t>
       </w:r>
       <w:r>
         <w:rPr>
           <w:b w:val="0"/>
         </w:rPr>
-        <w:t>，并且避免把只读取字面属性词的头误判进来。</w:t>
+        <w:t>的头。</w:t>
       </w:r>
     </w:p>
     <w:p>
       <w:pPr>
-        <w:pStyle w:val="ListNumber"/>
+        <w:pStyle w:val="ListBullet"/>
       </w:pPr>
       <w:r>
         <w:rPr>
           <w:b w:val="0"/>
         </w:rPr>
-        <w:t>如何利用定位结果，稳定、特异、不明显损害流畅度地调控生成属性。</w:t>
-      </w:r>
-    </w:p>
-    <w:p>
-      <w:pPr>
-        <w:pStyle w:val="ListNumber"/>
-      </w:pPr>
+        <w:t>但其中 15 个头的效果</w:t>
+      </w:r>
+      <w:r>
+        <w:rPr>
+          <w:b/>
+        </w:rPr>
+        <w:t>方向相反</w:t>
+      </w:r>
       <w:r>
         <w:rPr>
           <w:b w:val="0"/>
         </w:rPr>
-        <w:t>如何把上述定位方法迁移到新的模型上，而不必重复昂贵的因果搜索。</w:t>
+        <w:t>：沿属性方向推它，属性表达反而减弱。前 12 名里恰好包含两个强反向头（L17H19 −0.56、L22H16 −0.41），与正向头相互抵消。</w:t>
       </w:r>
     </w:p>
     <w:p>
-      <w:pPr>
-        <w:pStyle w:val="Heading1"/>
-      </w:pPr>
-      <w:r>
-        <w:t>三、技术方案</w:t>
-      </w:r>
-    </w:p>
-    <w:p>
-      <w:pPr>
-        <w:pStyle w:val="Heading2"/>
-      </w:pPr>
-      <w:r>
-        <w:t>3.1 核心构思</w:t>
-      </w:r>
-    </w:p>
-    <w:p>
+      <w:r>
+        <w:rPr>
+          <w:b/>
+        </w:rPr>
+        <w:t>结论</w:t>
+      </w:r>
       <w:r>
         <w:rPr>
           <w:b w:val="0"/>
         </w:rPr>
-        <w:t>构造一组输入。每个输入由三段依次组成：</w:t>
-      </w:r>
-    </w:p>
-    <w:p>
-      <w:pPr>
-        <w:pStyle w:val="ListNumber"/>
-      </w:pPr>
+        <w:t>：可读性（包括 ITI 的探针准确度、本发明的承载分数）能指出“哪些头参与了属性的传递”，但</w:t>
+      </w:r>
       <w:r>
         <w:rPr>
           <w:b/>
         </w:rPr>
-        <w:t>属性承载段</w:t>
+        <w:t>不能给出推动方向</w:t>
       </w:r>
       <w:r>
         <w:rPr>
           <w:b w:val="0"/>
         </w:rPr>
-        <w:t>：带有目标属性；</w:t>
+        <w:t>。按可读性直接取前 k 个头做导向，在某些模型上会失败。</w:t>
       </w:r>
     </w:p>
     <w:p>
       <w:pPr>
+        <w:pStyle w:val="Heading2"/>
+      </w:pPr>
+      <w:r>
+        <w:t>2.4 本发明要解决的技术问题</w:t>
+      </w:r>
+    </w:p>
+    <w:p>
+      <w:pPr>
         <w:pStyle w:val="ListNumber"/>
       </w:pPr>
+      <w:r>
+        <w:rPr>
+          <w:b w:val="0"/>
+        </w:rPr>
+        <w:t>以低计算成本选出</w:t>
+      </w:r>
       <w:r>
         <w:rPr>
           <w:b/>
         </w:rPr>
-        <w:t>共享前缀段</w:t>
+        <w:t>确实能把生成属性往目标方向推动</w:t>
       </w:r>
       <w:r>
         <w:rPr>
           <w:b w:val="0"/>
         </w:rPr>
-        <w:t>：可选；</w:t>
+        <w:t>的注意力头，并排除反向（抑制性）头。</w:t>
       </w:r>
     </w:p>
     <w:p>
       <w:pPr>
         <w:pStyle w:val="ListNumber"/>
       </w:pPr>
+      <w:r>
+        <w:rPr>
+          <w:b w:val="0"/>
+        </w:rPr>
+        <w:t>计算量要远低于对全部头逐一做因果干预。</w:t>
+      </w:r>
+    </w:p>
+    <w:p>
+      <w:pPr>
+        <w:pStyle w:val="ListNumber"/>
+      </w:pPr>
+      <w:r>
+        <w:rPr>
+          <w:b w:val="0"/>
+        </w:rPr>
+        <w:t>用所选的头稳定、特异地调控生成属性，对流畅度和事实性的影响可控。</w:t>
+      </w:r>
+    </w:p>
+    <w:p>
+      <w:pPr>
+        <w:pStyle w:val="Heading1"/>
+      </w:pPr>
+      <w:r>
+        <w:t>三、技术方案</w:t>
+      </w:r>
+    </w:p>
+    <w:p>
+      <w:pPr>
+        <w:pStyle w:val="Heading2"/>
+      </w:pPr>
+      <w:r>
+        <w:t>3.1 核心构思（两阶段选择）</w:t>
+      </w:r>
+    </w:p>
+    <w:p>
       <w:r>
         <w:rPr>
           <w:b/>
         </w:rPr>
-        <w:t>内容不变锚点段</w:t>
-      </w:r>
+        <w:t>第一阶段：锚点承载分数预筛（低成本、不干预）。</w:t>
+      </w:r>
+    </w:p>
+    <w:p>
       <w:r>
         <w:rPr>
           <w:b w:val="0"/>
         </w:rPr>
-        <w:t>：在同一内容组内逐 token 完全相同。</w:t>
+        <w:t>构造锚点对照样本。每个输入依次包含：</w:t>
       </w:r>
     </w:p>
     <w:p>
+      <w:pPr>
+        <w:pStyle w:val="ListBullet"/>
+      </w:pPr>
       <w:r>
         <w:rPr>
           <w:b w:val="0"/>
         </w:rPr>
-        <w:t>锚点段在同一内容组的不同属性变体之间逐字相同，其字面不携带属性信息。因此，在锚点位置读到的属性差异，</w:t>
+        <w:t>共享前缀；</w:t>
+      </w:r>
+    </w:p>
+    <w:p>
+      <w:pPr>
+        <w:pStyle w:val="ListBullet"/>
+      </w:pPr>
+      <w:r>
+        <w:rPr>
+          <w:b w:val="0"/>
+        </w:rPr>
+        <w:t>属性承载段；</w:t>
+      </w:r>
+    </w:p>
+    <w:p>
+      <w:pPr>
+        <w:pStyle w:val="ListBullet"/>
+      </w:pPr>
+      <w:r>
+        <w:rPr>
+          <w:b w:val="0"/>
+        </w:rPr>
+        <w:t>在同一内容组内逐 token 相同的锚点段。</w:t>
+      </w:r>
+    </w:p>
+    <w:p>
+      <w:r>
+        <w:rPr>
+          <w:b w:val="0"/>
+        </w:rPr>
+        <w:t>只在锚点位置读取各注意力头的输出，计算“扣除内容差异后，属性能解释的方差比例”（承载分数），取前 N 个头作为候选。</w:t>
+      </w:r>
+    </w:p>
+    <w:p>
+      <w:r>
+        <w:rPr>
+          <w:b w:val="0"/>
+        </w:rPr>
+        <w:t>锚点在各属性变体之间逐字相同，所以在锚点上读到的属性差异，只能来自模型经注意力</w:t>
       </w:r>
       <w:r>
         <w:rPr>
           <w:b/>
         </w:rPr>
-        <w:t>只能来自模型经注意力从前文搬运来的信息</w:t>
+        <w:t>搬运</w:t>
+      </w:r>
+      <w:r>
+        <w:rPr>
+          <w:b w:val="0"/>
+        </w:rPr>
+        <w:t>来的信息。这一阶段只需前向计算，计算量与头数无关。</w:t>
+      </w:r>
+    </w:p>
+    <w:p>
+      <w:r>
+        <w:rPr>
+          <w:b/>
+        </w:rPr>
+        <w:t>第二阶段：单头方向筛选（只对候选头做轻量干预）。</w:t>
+      </w:r>
+    </w:p>
+    <w:p>
+      <w:r>
+        <w:rPr>
+          <w:b w:val="0"/>
+        </w:rPr>
+        <w:t>对每个候选头，在教师强制下单独注入属性导向向量，各头推力相同，测量它对“目标属性参照续写相对参照属性续写的对数概率差”的影响。</w:t>
+      </w:r>
+    </w:p>
+    <w:p>
+      <w:r>
+        <w:rPr>
+          <w:b w:val="0"/>
+        </w:rPr>
+        <w:t>只保留影响</w:t>
+      </w:r>
+      <w:r>
+        <w:rPr>
+          <w:b/>
+        </w:rPr>
+        <w:t>显著为正</w:t>
+      </w:r>
+      <w:r>
+        <w:rPr>
+          <w:b w:val="0"/>
+        </w:rPr>
+        <w:t>的头，按效果大小取前 M 个，作为调控头。这一阶段只对 N 个候选头做干预，并且不需要生成文本。</w:t>
+      </w:r>
+    </w:p>
+    <w:p>
+      <w:r>
+        <w:rPr>
+          <w:b/>
+        </w:rPr>
+        <w:t>调控：</w:t>
+      </w:r>
+      <w:r>
+        <w:rPr>
+          <w:b w:val="0"/>
+        </w:rPr>
+        <w:t xml:space="preserve"> 在所选头上，在提示末尾位置以及之后每一个生成步</w:t>
+      </w:r>
+      <w:r>
+        <w:rPr>
+          <w:b/>
+        </w:rPr>
+        <w:t>持续</w:t>
+      </w:r>
+      <w:r>
+        <w:rPr>
+          <w:b w:val="0"/>
+        </w:rPr>
+        <w:t>注入导向向量。</w:t>
+      </w:r>
+    </w:p>
+    <w:p>
+      <w:pPr>
+        <w:pStyle w:val="Heading2"/>
+      </w:pPr>
+      <w:r>
+        <w:t>3.2 步骤一：构造锚点对照样本集</w:t>
+      </w:r>
+    </w:p>
+    <w:p>
+      <w:pPr>
+        <w:pStyle w:val="ListNumber"/>
+      </w:pPr>
+      <w:r>
+        <w:rPr>
+          <w:b w:val="0"/>
+        </w:rPr>
+        <w:t>选取 S 个内容组（场景）。每组对应一段共享前缀 P_s（事实或指令）。</w:t>
+      </w:r>
+    </w:p>
+    <w:p>
+      <w:pPr>
+        <w:pStyle w:val="ListNumber"/>
+      </w:pPr>
+      <w:r>
+        <w:rPr>
+          <w:b w:val="0"/>
+        </w:rPr>
+        <w:t>对每组构造 K 个属性变体，其中包括一个参照属性（例如中性）。每个变体有属性承载段 L_{s,k}。可以加入不含属性类别词的改写版本。</w:t>
+      </w:r>
+    </w:p>
+    <w:p>
+      <w:pPr>
+        <w:pStyle w:val="ListNumber"/>
+      </w:pPr>
+      <w:r>
+        <w:rPr>
+          <w:b w:val="0"/>
+        </w:rPr>
+        <w:t>为每组构造锚点段 A_s，例如“事实摘要 + 我的看法是：”，要求分词后在组内逐 token 相同。</w:t>
+      </w:r>
+    </w:p>
+    <w:p>
+      <w:pPr>
+        <w:pStyle w:val="ListNumber"/>
+      </w:pPr>
+      <w:r>
+        <w:rPr>
+          <w:b w:val="0"/>
+        </w:rPr>
+        <w:t>输入为 X_{s,k} = Template(P_s) ⊕ L_{s,k} ⊕ A_s。实施例中，P_s 放在用户回合，L_{s,k} ⊕ A_s 放在助手回合的开头。</w:t>
+      </w:r>
+    </w:p>
+    <w:p>
+      <w:pPr>
+        <w:pStyle w:val="ListNumber"/>
+      </w:pPr>
+      <w:r>
+        <w:rPr>
+          <w:b w:val="0"/>
+        </w:rPr>
+        <w:t>每组还准备两段参照续写，供第二阶段使用：一段带目标属性，一段带参照属性。可以直接使用目标属性变体和参照属性变体的参考续写。</w:t>
+      </w:r>
+    </w:p>
+    <w:p>
+      <w:pPr>
+        <w:pStyle w:val="Heading2"/>
+      </w:pPr>
+      <w:r>
+        <w:t>3.3 步骤二（第一阶段）：锚点承载分数</w:t>
+      </w:r>
+    </w:p>
+    <w:p>
+      <w:pPr>
+        <w:pStyle w:val="ListNumber"/>
+      </w:pPr>
+      <w:r>
+        <w:rPr>
+          <w:b w:val="0"/>
+        </w:rPr>
+        <w:t>对每个 X_{s,k} 做一次教师强制前向计算。</w:t>
+      </w:r>
+    </w:p>
+    <w:p>
+      <w:pPr>
+        <w:pStyle w:val="ListNumber"/>
+      </w:pPr>
+      <w:r>
+        <w:rPr>
+          <w:b w:val="0"/>
+        </w:rPr>
+        <w:t>对每层 l、每个头 h，取该头在锚点 token 上的输出（W_O 输入中属于头 h 的分量），取平均，得到 o_{s,k}^{l,h}。</w:t>
+      </w:r>
+    </w:p>
+    <w:p>
+      <w:pPr>
+        <w:pStyle w:val="ListNumber"/>
+      </w:pPr>
+      <w:r>
+        <w:rPr>
+          <w:b w:val="0"/>
+        </w:rPr>
+        <w:t>对每个头 (l, h) 计算：</w:t>
+      </w:r>
+    </w:p>
+    <w:p>
+      <w:pPr>
+        <w:pStyle w:val="ListBullet2"/>
+      </w:pPr>
+      <w:r>
+        <w:rPr>
+          <w:b w:val="0"/>
+        </w:rPr>
+        <w:t>内容组均值 μ_s；</w:t>
+      </w:r>
+    </w:p>
+    <w:p>
+      <w:pPr>
+        <w:pStyle w:val="ListBullet2"/>
+      </w:pPr>
+      <w:r>
+        <w:rPr>
+          <w:b w:val="0"/>
+        </w:rPr>
+        <w:t>组内残差 r = o − μ_{s}；</w:t>
+      </w:r>
+    </w:p>
+    <w:p>
+      <w:pPr>
+        <w:pStyle w:val="ListBullet2"/>
+      </w:pPr>
+      <w:r>
+        <w:rPr>
+          <w:b w:val="0"/>
+        </w:rPr>
+        <w:t>各属性在残差上的均值 m_k；</w:t>
+      </w:r>
+    </w:p>
+    <w:p>
+      <w:pPr>
+        <w:pStyle w:val="ListBullet2"/>
+      </w:pPr>
+      <w:r>
+        <w:rPr>
+          <w:b w:val="0"/>
+        </w:rPr>
+        <w:t>总平方和 SS_tot = Σ‖o − ō‖²；</w:t>
+      </w:r>
+    </w:p>
+    <w:p>
+      <w:pPr>
+        <w:pStyle w:val="ListBullet2"/>
+      </w:pPr>
+      <w:r>
+        <w:rPr>
+          <w:b w:val="0"/>
+        </w:rPr>
+        <w:t>内容平方和 SS_scn = Σ‖μ_s − ō‖²；</w:t>
+      </w:r>
+    </w:p>
+    <w:p>
+      <w:pPr>
+        <w:pStyle w:val="ListBullet2"/>
+      </w:pPr>
+      <w:r>
+        <w:rPr>
+          <w:b w:val="0"/>
+        </w:rPr>
+        <w:t>属性平方和 SS_attr = Σ‖m_k‖²。</w:t>
+      </w:r>
+    </w:p>
+    <w:p>
+      <w:pPr>
+        <w:pStyle w:val="ListNumber"/>
+      </w:pPr>
+      <w:r>
+        <w:rPr>
+          <w:b/>
+        </w:rPr>
+        <w:t>承载分数 C(l,h) = SS_attr / (SS_tot − SS_scn)</w:t>
       </w:r>
       <w:r>
         <w:rPr>
@@ -785,459 +1127,195 @@
       </w:r>
     </w:p>
     <w:p>
+      <w:pPr>
+        <w:pStyle w:val="ListNumber"/>
+      </w:pPr>
       <w:r>
         <w:rPr>
           <w:b w:val="0"/>
         </w:rPr>
-        <w:t>在锚点位置收集每个注意力头的输出后，用一个</w:t>
-      </w:r>
+        <w:t>按 C 排序，取前 N 个头作为候选集合 H_N（实施例 N = 60）。</w:t>
+      </w:r>
+    </w:p>
+    <w:p>
+      <w:pPr>
+        <w:pStyle w:val="ListNumber"/>
+      </w:pPr>
+      <w:r>
+        <w:rPr>
+          <w:b w:val="0"/>
+        </w:rPr>
+        <w:t>同时计算导向向量：v_h = mean(o^h | 目标属性) − mean(o^h | 参照属性)，在锚点位置上取均值。</w:t>
+      </w:r>
+    </w:p>
+    <w:p>
+      <w:pPr>
+        <w:pStyle w:val="Heading2"/>
+      </w:pPr>
+      <w:r>
+        <w:t>3.4 步骤三（第二阶段）：单头方向筛选</w:t>
+      </w:r>
+    </w:p>
+    <w:p>
+      <w:pPr>
+        <w:pStyle w:val="ListNumber"/>
+      </w:pPr>
       <w:r>
         <w:rPr>
           <w:b/>
         </w:rPr>
-        <w:t>组内属性方差占比</w:t>
+        <w:t>输入</w:t>
       </w:r>
       <w:r>
         <w:rPr>
           <w:b w:val="0"/>
         </w:rPr>
-        <w:t>统计量给头排序。这个统计量只需前向计算，不需要训练，也不需要干预；排名靠前的头即为属性承载头。</w:t>
+        <w:t>：使用参照属性变体的输入（参照属性段 + 锚点），各内容组、各改写版本都用上。实施例中共 120 条输入。</w:t>
       </w:r>
     </w:p>
     <w:p>
+      <w:pPr>
+        <w:pStyle w:val="ListNumber"/>
+      </w:pPr>
+      <w:r>
+        <w:rPr>
+          <w:b/>
+        </w:rPr>
+        <w:t>基线</w:t>
+      </w:r>
       <w:r>
         <w:rPr>
           <w:b w:val="0"/>
         </w:rPr>
-        <w:t>随后，可以在这些头上，于锚点位置以及之后每个生成步</w:t>
-      </w:r>
+        <w:t>：对每条输入，在不干预的情况下，计算两项平均每 token 对数概率：</w:t>
+      </w:r>
+    </w:p>
+    <w:p>
+      <w:pPr>
+        <w:pStyle w:val="ListBullet2"/>
+      </w:pPr>
+      <w:r>
+        <w:rPr>
+          <w:b w:val="0"/>
+        </w:rPr>
+        <w:t>目标属性参照续写的；</w:t>
+      </w:r>
+    </w:p>
+    <w:p>
+      <w:pPr>
+        <w:pStyle w:val="ListBullet2"/>
+      </w:pPr>
+      <w:r>
+        <w:rPr>
+          <w:b w:val="0"/>
+        </w:rPr>
+        <w:t>参照属性参照续写的。</w:t>
+      </w:r>
+    </w:p>
+    <w:p>
+      <w:r>
+        <w:rPr>
+          <w:b w:val="0"/>
+        </w:rPr>
+        <w:t>两者之差记为 d₀。</w:t>
+      </w:r>
+    </w:p>
+    <w:p>
+      <w:pPr>
+        <w:pStyle w:val="ListNumber"/>
+      </w:pPr>
       <w:r>
         <w:rPr>
           <w:b/>
         </w:rPr>
-        <w:t>持续</w:t>
+        <w:t>单头干预</w:t>
       </w:r>
       <w:r>
         <w:rPr>
           <w:b w:val="0"/>
         </w:rPr>
-        <w:t>注入属性导向向量，以调控生成；也可以在这些头或其所在层上读出属性状态。</w:t>
+        <w:t>：对每个候选头 h ∈ H_N，把 v_h 缩放到统一推力：使 ‖W_O[:, h]·v‖ 等于一个固定值（实施例中取排名第一的头在 λ = 8 时的残差改变量）。在锚点位置和参照续写的每个位置注入该向量，得到 d_h。</w:t>
       </w:r>
     </w:p>
     <w:p>
       <w:pPr>
-        <w:pStyle w:val="Heading2"/>
-      </w:pPr>
-      <w:r>
-        <w:t>3.2 步骤一：构造锚点对照样本集</w:t>
-      </w:r>
-    </w:p>
-    <w:p>
-      <w:pPr>
         <w:pStyle w:val="ListNumber"/>
       </w:pPr>
+      <w:r>
+        <w:rPr>
+          <w:b/>
+        </w:rPr>
+        <w:t>效果</w:t>
+      </w:r>
       <w:r>
         <w:rPr>
           <w:b w:val="0"/>
         </w:rPr>
-        <w:t>选取 S 个内容组（场景）s = 1…S。每个内容组对应一段共享的事实或指令前缀 P_s，例如“请根据下面事实，以第一人称写一段简短回应……事实：……”。</w:t>
+        <w:t>：e_h = mean(d_h − d₀)，标准误为 SE_h（在输入之间计算）。</w:t>
       </w:r>
     </w:p>
     <w:p>
       <w:pPr>
         <w:pStyle w:val="ListNumber"/>
       </w:pPr>
+      <w:r>
+        <w:rPr>
+          <w:b/>
+        </w:rPr>
+        <w:t>选择规则</w:t>
+      </w:r>
       <w:r>
         <w:rPr>
           <w:b w:val="0"/>
         </w:rPr>
-        <w:t>对每个内容组，构造 K 个属性变体 k = 1…K，其中包含一个参照属性（例如中性）。</w:t>
+        <w:t>：保留 e_h &gt; 2·SE_h 的头，按 e_h 从大到小取前 M 个（实施例 M = 12），作为调控头集合 H*。</w:t>
       </w:r>
     </w:p>
     <w:p>
       <w:pPr>
-        <w:pStyle w:val="ListBullet2"/>
-      </w:pPr>
+        <w:pStyle w:val="ListNumber"/>
+      </w:pPr>
+      <w:r>
+        <w:rPr>
+          <w:b/>
+        </w:rPr>
+        <w:t>停止规则</w:t>
+      </w:r>
       <w:r>
         <w:rPr>
           <w:b w:val="0"/>
         </w:rPr>
-        <w:t>每个变体有一个属性承载段 L_{s,k}，例如“我挺开心的，以后买东西方便多了。”或“真让人火大……”。</w:t>
+        <w:t>：若保留下来的头少于预设下限（实施例为 4 个），则判定该属性在此模型上不适合用本方法调控，转而报告。</w:t>
       </w:r>
     </w:p>
     <w:p>
       <w:pPr>
-        <w:pStyle w:val="ListBullet2"/>
+        <w:pStyle w:val="Heading2"/>
+      </w:pPr>
+      <w:r>
+        <w:t>3.5 步骤四：持续注入式调控</w:t>
+      </w:r>
+    </w:p>
+    <w:p>
+      <w:pPr>
+        <w:pStyle w:val="ListNumber"/>
       </w:pPr>
       <w:r>
         <w:rPr>
           <w:b w:val="0"/>
         </w:rPr>
-        <w:t>可选地，每个变体还可以有一个改写版本，例如不含情绪类别词的改写。</w:t>
+        <w:t>对每个 h ∈ H*，在生成时把 λ·v_h 加在该头输出上（W_O 之前）。注入位置包括：</w:t>
       </w:r>
     </w:p>
     <w:p>
       <w:pPr>
-        <w:pStyle w:val="ListNumber"/>
+        <w:pStyle w:val="ListBullet2"/>
       </w:pPr>
       <w:r>
         <w:rPr>
           <w:b w:val="0"/>
         </w:rPr>
-        <w:t>为每个内容组构造一个锚点段 A_s，例如“便利店扩大一倍，门口长椅被撤掉。我的看法是：”。A_s 在该组所有 K 个变体中逐 token 相同。</w:t>
-      </w:r>
-    </w:p>
-    <w:p>
-      <w:pPr>
-        <w:pStyle w:val="ListNumber"/>
-      </w:pPr>
-      <w:r>
-        <w:rPr>
-          <w:b w:val="0"/>
-        </w:rPr>
-        <w:t>将输入拼接为 X_{s,k} = Template(P_s) ⊕ L_{s,k} ⊕ A_s。其中 Template 为模型的对话模板，例如把 P_s 放在用户回合，把 L_{s,k} ⊕ A_s 放在助手回合的开头。</w:t>
-      </w:r>
-    </w:p>
-    <w:p>
-      <w:pPr>
-        <w:pStyle w:val="ListNumber"/>
-      </w:pPr>
-      <w:r>
-        <w:rPr>
-          <w:b/>
-        </w:rPr>
-        <w:t>校验</w:t>
-      </w:r>
-      <w:r>
-        <w:rPr>
-          <w:b w:val="0"/>
-        </w:rPr>
-        <w:t>：同组内 A_s 在分词后的 token 序列完全一致。若属性段末尾与锚点段开头发生分词合并，则调整锚点开头（例如加标点），或只取完全落在锚点区间内的 token。</w:t>
-      </w:r>
-    </w:p>
-    <w:p>
-      <w:pPr>
-        <w:pStyle w:val="Heading2"/>
-      </w:pPr>
-      <w:r>
-        <w:t>3.3 步骤二：前向计算并收集锚点位置的头输出</w:t>
-      </w:r>
-    </w:p>
-    <w:p>
-      <w:pPr>
-        <w:pStyle w:val="ListNumber"/>
-      </w:pPr>
-      <w:r>
-        <w:rPr>
-          <w:b w:val="0"/>
-        </w:rPr>
-        <w:t>将每个 X_{s,k} 以教师强制方式送入目标模型，做一次前向计算，不需要生成。</w:t>
-      </w:r>
-    </w:p>
-    <w:p>
-      <w:pPr>
-        <w:pStyle w:val="ListNumber"/>
-      </w:pPr>
-      <w:r>
-        <w:rPr>
-          <w:b w:val="0"/>
-        </w:rPr>
-        <w:t>对每一层 l、每个注意力头 h，取该头在锚点段各 token 位置的输出，并在锚点 token 上取平均，得到向量 o_{s,k}^{l,h}（维度为 d_head）。</w:t>
-      </w:r>
-    </w:p>
-    <w:p>
-      <w:pPr>
-        <w:pStyle w:val="ListBullet2"/>
-      </w:pPr>
-      <w:r>
-        <w:rPr>
-          <w:b w:val="0"/>
-        </w:rPr>
-        <w:t>实施例中，“头的输出”取该层注意力输出投影矩阵 W_O 的输入中属于头 h 的那一段。</w:t>
-      </w:r>
-    </w:p>
-    <w:p>
-      <w:pPr>
-        <w:pStyle w:val="ListBullet2"/>
-      </w:pPr>
-      <w:r>
-        <w:rPr>
-          <w:b w:val="0"/>
-        </w:rPr>
-        <w:t>替代地，也可以取该头经 W_O 映射后对残差流的贡献 o·W_O^{(h)}。</w:t>
-      </w:r>
-    </w:p>
-    <w:p>
-      <w:pPr>
-        <w:pStyle w:val="ListNumber"/>
-      </w:pPr>
-      <w:r>
-        <w:rPr>
-          <w:b w:val="0"/>
-        </w:rPr>
-        <w:t>可选：同时收集各层残差流在锚点位置的平均向量，用于步骤四的层窗口选择。</w:t>
-      </w:r>
-    </w:p>
-    <w:p>
-      <w:pPr>
-        <w:pStyle w:val="Heading2"/>
-      </w:pPr>
-      <w:r>
-        <w:t>3.4 步骤三：计算组内属性方差占比并排序</w:t>
-      </w:r>
-    </w:p>
-    <w:p>
-      <w:r>
-        <w:rPr>
-          <w:b w:val="0"/>
-        </w:rPr>
-        <w:t>对每个 (l, h)，记 o_i 为第 i 个样本的向量，s(i) 为其内容组，k(i) 为其属性，计算：</w:t>
-      </w:r>
-    </w:p>
-    <w:p>
-      <w:pPr>
-        <w:pStyle w:val="ListBullet"/>
-      </w:pPr>
-      <w:r>
-        <w:rPr>
-          <w:b w:val="0"/>
-        </w:rPr>
-        <w:t>总均值：ō = mean_i o_i</w:t>
-      </w:r>
-    </w:p>
-    <w:p>
-      <w:pPr>
-        <w:pStyle w:val="ListBullet"/>
-      </w:pPr>
-      <w:r>
-        <w:rPr>
-          <w:b w:val="0"/>
-        </w:rPr>
-        <w:t>内容组均值：μ_s = mean_{i: s(i)=s} o_i</w:t>
-      </w:r>
-    </w:p>
-    <w:p>
-      <w:pPr>
-        <w:pStyle w:val="ListBullet"/>
-      </w:pPr>
-      <w:r>
-        <w:rPr>
-          <w:b w:val="0"/>
-        </w:rPr>
-        <w:t>组内残差：r_i = o_i − μ_{s(i)}</w:t>
-      </w:r>
-    </w:p>
-    <w:p>
-      <w:pPr>
-        <w:pStyle w:val="ListBullet"/>
-      </w:pPr>
-      <w:r>
-        <w:rPr>
-          <w:b w:val="0"/>
-        </w:rPr>
-        <w:t>属性均值（在组内残差上）：m_k = mean_{i: k(i)=k} r_i</w:t>
-      </w:r>
-    </w:p>
-    <w:p>
-      <w:pPr>
-        <w:pStyle w:val="ListBullet"/>
-      </w:pPr>
-      <w:r>
-        <w:rPr>
-          <w:b w:val="0"/>
-        </w:rPr>
-        <w:t>总平方和：SS_tot = Σ_i ‖o_i − ō‖²</w:t>
-      </w:r>
-    </w:p>
-    <w:p>
-      <w:pPr>
-        <w:pStyle w:val="ListBullet"/>
-      </w:pPr>
-      <w:r>
-        <w:rPr>
-          <w:b w:val="0"/>
-        </w:rPr>
-        <w:t>内容平方和：SS_scn = Σ_i ‖μ_{s(i)} − ō‖²</w:t>
-      </w:r>
-    </w:p>
-    <w:p>
-      <w:pPr>
-        <w:pStyle w:val="ListBullet"/>
-      </w:pPr>
-      <w:r>
-        <w:rPr>
-          <w:b w:val="0"/>
-        </w:rPr>
-        <w:t>属性平方和：SS_attr = Σ_i ‖m_{k(i)}‖²</w:t>
-      </w:r>
-    </w:p>
-    <w:p>
-      <w:r>
-        <w:rPr>
-          <w:b/>
-        </w:rPr>
-        <w:t>承载分数 C(l,h) = SS_attr / (SS_tot − SS_scn)</w:t>
-      </w:r>
-      <w:r>
-        <w:rPr>
-          <w:b w:val="0"/>
-        </w:rPr>
-        <w:t>，即在扣除内容差异之后，属性能解释的方差比例，取值 0–1。</w:t>
-      </w:r>
-    </w:p>
-    <w:p>
-      <w:r>
-        <w:rPr>
-          <w:b w:val="0"/>
-        </w:rPr>
-        <w:t>按 C(l,h) 从高到低给全部注意力头排序，取前 N 个，或取 C 超过阈值的头，作为属性承载头集合 H*。</w:t>
-      </w:r>
-    </w:p>
-    <w:p>
-      <w:r>
-        <w:rPr>
-          <w:b w:val="0"/>
-        </w:rPr>
-        <w:t>可选的第二指标：</w:t>
-      </w:r>
-    </w:p>
-    <w:p>
-      <w:pPr>
-        <w:pStyle w:val="ListBullet"/>
-      </w:pPr>
-      <w:r>
-        <w:rPr>
-          <w:b w:val="0"/>
-        </w:rPr>
-        <w:t>以 o^{l,h} 为特征，按内容组分组做交叉验证，训练一个多分类线性分类器，得到属性可读性 AUROC。</w:t>
-      </w:r>
-    </w:p>
-    <w:p>
-      <w:pPr>
-        <w:pStyle w:val="ListBullet"/>
-      </w:pPr>
-      <w:r>
-        <w:rPr>
-          <w:b w:val="0"/>
-        </w:rPr>
-        <w:t>与 C 加权组合，或作为并列排序依据。</w:t>
-      </w:r>
-    </w:p>
-    <w:p>
-      <w:pPr>
-        <w:pStyle w:val="ListBullet"/>
-      </w:pPr>
-      <w:r>
-        <w:rPr>
-          <w:b w:val="0"/>
-        </w:rPr>
-        <w:t>实施例中，两种排序都能找回下文所述的因果承载头，其中 C 的效果更好。</w:t>
-      </w:r>
-    </w:p>
-    <w:p>
-      <w:pPr>
-        <w:pStyle w:val="Heading2"/>
-      </w:pPr>
-      <w:r>
-        <w:t>3.5 步骤四（可选）：层窗口选择</w:t>
-      </w:r>
-    </w:p>
-    <w:p>
-      <w:pPr>
-        <w:pStyle w:val="ListNumber"/>
-      </w:pPr>
-      <w:r>
-        <w:rPr>
-          <w:b w:val="0"/>
-        </w:rPr>
-        <w:t>对每层残差流在锚点位置的平均向量，计算属性可读性，可以用上述 AUROC，也可以用 SS_attr / SS_tot。</w:t>
-      </w:r>
-    </w:p>
-    <w:p>
-      <w:pPr>
-        <w:pStyle w:val="ListNumber"/>
-      </w:pPr>
-      <w:r>
-        <w:rPr>
-          <w:b w:val="0"/>
-        </w:rPr>
-        <w:t>以可读性峰值所在层为中心，取一个层窗口，例如相对深度 0.3–0.7，或峰值层 ±4 层。</w:t>
-      </w:r>
-    </w:p>
-    <w:p>
-      <w:pPr>
-        <w:pStyle w:val="ListNumber"/>
-      </w:pPr>
-      <w:r>
-        <w:rPr>
-          <w:b w:val="0"/>
-        </w:rPr>
-        <w:t>可选：把 H* 限制在该窗口内。</w:t>
-      </w:r>
-    </w:p>
-    <w:p>
-      <w:r>
-        <w:rPr>
-          <w:b w:val="0"/>
-        </w:rPr>
-        <w:t>实施例中，三种不同模型的峰值都位于相对深度 0.43–0.56，峰值之后可读性下降。</w:t>
-      </w:r>
-    </w:p>
-    <w:p>
-      <w:pPr>
-        <w:pStyle w:val="Heading2"/>
-      </w:pPr>
-      <w:r>
-        <w:t>3.6 步骤五（应用一）：持续注入式属性调控</w:t>
-      </w:r>
-    </w:p>
-    <w:p>
-      <w:pPr>
-        <w:pStyle w:val="ListNumber"/>
-      </w:pPr>
-      <w:r>
-        <w:rPr>
-          <w:b w:val="0"/>
-        </w:rPr>
-        <w:t>对每个 h ∈ H*，计算导向向量：</w:t>
-      </w:r>
-    </w:p>
-    <w:p>
-      <w:r>
-        <w:rPr>
-          <w:b w:val="0"/>
-        </w:rPr>
-        <w:t>v_h = mean(o^{h} | 目标属性) − mean(o^{h} | 参照属性)</w:t>
-      </w:r>
-    </w:p>
-    <w:p>
-      <w:r>
-        <w:rPr>
-          <w:b w:val="0"/>
-        </w:rPr>
-        <w:t>取在锚点位置、对应样本集上的均值差。</w:t>
-      </w:r>
-    </w:p>
-    <w:p>
-      <w:pPr>
-        <w:pStyle w:val="ListNumber"/>
-      </w:pPr>
-      <w:r>
-        <w:rPr>
-          <w:b w:val="0"/>
-        </w:rPr>
-        <w:t>在生成时，对每个 h ∈ H*，在其输出上加 λ·v_h（加在 W_O 之前的头输出切片上）。注入位置包括：</w:t>
-      </w:r>
-    </w:p>
-    <w:p>
-      <w:pPr>
-        <w:pStyle w:val="ListBullet2"/>
-      </w:pPr>
-      <w:r>
-        <w:rPr>
-          <w:b w:val="0"/>
-        </w:rPr>
-        <w:t>输入中锚点（或提示末尾）的位置；</w:t>
+        <w:t>提示中锚点的位置，或提示末尾；</w:t>
       </w:r>
     </w:p>
     <w:p>
@@ -1254,7 +1332,7 @@
         <w:rPr>
           <w:b w:val="0"/>
         </w:rPr>
-        <w:t>，即持续注入。</w:t>
+        <w:t>。</w:t>
       </w:r>
     </w:p>
     <w:p>
@@ -1265,7 +1343,7 @@
         <w:rPr>
           <w:b w:val="0"/>
         </w:rPr>
-        <w:t>λ 在验证集上选取，兼顾属性强度和流畅度。实施例中 λ = 2。</w:t>
+        <w:t>λ 在验证集上选取，兼顾属性强度、流畅度和事实性。</w:t>
       </w:r>
     </w:p>
     <w:p>
@@ -1276,7 +1354,7 @@
         <w:rPr>
           <w:b w:val="0"/>
         </w:rPr>
-        <w:t>可选：只在前 M 个生成 token 内注入，以降低对事实一致性的影响；也可以按生成进度逐步衰减 λ。</w:t>
+        <w:t>可选：只在前 T 个生成步内注入，或让 λ 随生成步数衰减，以控制对流畅度和事实性的影响。</w:t>
       </w:r>
     </w:p>
     <w:p>
@@ -1284,7 +1362,7 @@
         <w:pStyle w:val="Heading2"/>
       </w:pPr>
       <w:r>
-        <w:t>3.7 步骤六（应用二）：属性状态读出</w:t>
+        <w:t>3.6 步骤五（可选）：属性状态读出</w:t>
       </w:r>
     </w:p>
     <w:p>
@@ -1292,7 +1370,7 @@
         <w:rPr>
           <w:b w:val="0"/>
         </w:rPr>
-        <w:t>在 H* 所在的层或层窗口上，训练或直接使用属性方向，读出模型在生成前或生成中的属性状态。读出结果可以用于：</w:t>
+        <w:t>在 H* 或其所在层上读出属性状态。读数可以用于：</w:t>
       </w:r>
     </w:p>
     <w:p>
@@ -1303,7 +1381,7 @@
         <w:rPr>
           <w:b w:val="0"/>
         </w:rPr>
-        <w:t>驱动虚拟形象或机器人的表情；</w:t>
+        <w:t>驱动虚拟形象或机器人表情；</w:t>
       </w:r>
     </w:p>
     <w:p>
@@ -1314,7 +1392,7 @@
         <w:rPr>
           <w:b w:val="0"/>
         </w:rPr>
-        <w:t>安全监测预警；</w:t>
+        <w:t>安全预警；</w:t>
       </w:r>
     </w:p>
     <w:p>
@@ -1330,51 +1408,18 @@
     </w:p>
     <w:p>
       <w:pPr>
-        <w:pStyle w:val="Heading2"/>
-      </w:pPr>
-      <w:r>
-        <w:t>3.8 步骤七（应用三）：新模型上的快速定位</w:t>
+        <w:pStyle w:val="Heading1"/>
+      </w:pPr>
+      <w:r>
+        <w:t>四、有益效果（附实验数据）</w:t>
       </w:r>
     </w:p>
     <w:p>
-      <w:r>
-        <w:rPr>
-          <w:b w:val="0"/>
-        </w:rPr>
-        <w:t>对一个新的目标模型，只需用同一锚点对照样本集重复步骤二到步骤四，即可得到该模型的属性承载头和层窗口，无需逐头修补或逐头消融。</w:t>
-      </w:r>
-    </w:p>
-    <w:p>
-      <w:pPr>
-        <w:pStyle w:val="Heading1"/>
-      </w:pPr>
-      <w:r>
-        <w:t>四、有益效果（附实验数据）</w:t>
-      </w:r>
-    </w:p>
-    <w:p>
-      <w:r>
-        <w:rPr>
-          <w:b w:val="0"/>
-        </w:rPr>
-        <w:t>实验模型和数据：</w:t>
-      </w:r>
-    </w:p>
-    <w:p>
-      <w:pPr>
-        <w:pStyle w:val="ListBullet"/>
-      </w:pPr>
       <w:r>
         <w:rPr>
           <w:b/>
         </w:rPr>
-        <w:t>模型</w:t>
-      </w:r>
-      <w:r>
-        <w:rPr>
-          <w:b w:val="0"/>
-        </w:rPr>
-        <w:t>：Qwen3-4B-Instruct-2507（36 层 × 32 头）、Qwen3-1.7B（28 层 × 16 头）、Llama-3.2-1B-Instruct（16 层 × 32 头）。</w:t>
+        <w:t>通用条件：</w:t>
       </w:r>
     </w:p>
     <w:p>
@@ -1391,7 +1436,7 @@
         <w:rPr>
           <w:b w:val="0"/>
         </w:rPr>
-        <w:t>：120 个中文场景 × 4 种情绪（喜悦、悲伤、愤怒、中性）× 2 种改写。</w:t>
+        <w:t>：120 个中文场景 × 4 种情绪（喜悦、悲伤、愤怒、中性）× 2 种改写，按话题划分为三部分：</w:t>
       </w:r>
     </w:p>
     <w:p>
@@ -1402,7 +1447,7 @@
         <w:rPr>
           <w:b w:val="0"/>
         </w:rPr>
-        <w:t>探索集：80 个场景；</w:t>
+        <w:t>discovery 60 个场景：用于选头和计算向量；</w:t>
       </w:r>
     </w:p>
     <w:p>
@@ -1413,7 +1458,35 @@
         <w:rPr>
           <w:b w:val="0"/>
         </w:rPr>
-        <w:t>留出集：40 个场景，话题与探索集不同。</w:t>
+        <w:t>validation 20 个场景：用于选 λ；</w:t>
+      </w:r>
+    </w:p>
+    <w:p>
+      <w:pPr>
+        <w:pStyle w:val="ListBullet"/>
+      </w:pPr>
+      <w:r>
+        <w:rPr>
+          <w:b w:val="0"/>
+        </w:rPr>
+        <w:t>test 40 个场景：最终检验只开一次。</w:t>
+      </w:r>
+    </w:p>
+    <w:p>
+      <w:pPr>
+        <w:pStyle w:val="ListBullet"/>
+      </w:pPr>
+      <w:r>
+        <w:rPr>
+          <w:b/>
+        </w:rPr>
+        <w:t>评分</w:t>
+      </w:r>
+      <w:r>
+        <w:rPr>
+          <w:b w:val="0"/>
+        </w:rPr>
+        <w:t>：生成文本由两路独立的大语言模型盲评打分（0–4 分），尚未做人工校准。</w:t>
       </w:r>
     </w:p>
     <w:p>
@@ -1430,7 +1503,7 @@
         <w:rPr>
           <w:b w:val="0"/>
         </w:rPr>
-        <w:t>：分析方法与检验条件在查看留出集数据之前已书面固定并提交版本库（commit f32ddd3、d368ffa）。</w:t>
+        <w:t>：每个实验的方案、门槛和选择规则都在产生数据之前写好，并提交版本库留痕。</w:t>
       </w:r>
     </w:p>
     <w:p>
@@ -1438,375 +1511,90 @@
         <w:pStyle w:val="Heading2"/>
       </w:pPr>
       <w:r>
-        <w:t>4.1 无需干预即可找回因果承载头</w:t>
+        <w:t>4.1 确认性实验：Qwen3-14B（40 层 × 40 头，此前从未用于本研究）</w:t>
       </w:r>
     </w:p>
     <w:p>
+      <w:r>
+        <w:rPr>
+          <w:b/>
+        </w:rPr>
+        <w:t>选择过程</w:t>
+      </w:r>
       <w:r>
         <w:rPr>
           <w:b w:val="0"/>
         </w:rPr>
-        <w:t>在 Qwen3-4B 上，研发方此前用激活修补和持续导向（见 4.3）独立确定了 12 个情绪承载头。用本方法的承载分数 C 在留出集上给全部 1152 个头排序：</w:t>
+        <w:t>（只用 discovery）：</w:t>
       </w:r>
     </w:p>
-    <w:tbl>
-      <w:tblPr>
-        <w:tblStyle w:val="TableGrid"/>
-        <w:tblW w:type="auto" w:w="0"/>
-        <w:tblLook w:firstColumn="1" w:firstRow="1" w:lastColumn="0" w:lastRow="0" w:noHBand="0" w:noVBand="1" w:val="04A0"/>
-      </w:tblPr>
-      <w:tblGrid>
-        <w:gridCol w:w="4320"/>
-        <w:gridCol w:w="4320"/>
-      </w:tblGrid>
-      <w:tr>
-        <w:tc>
-          <w:tcPr>
-            <w:tcW w:type="dxa" w:w="4320"/>
-          </w:tcPr>
-          <w:p>
-            <w:r>
-              <w:rPr>
-                <w:b/>
-              </w:rPr>
-              <w:t>指标</w:t>
-            </w:r>
-          </w:p>
-        </w:tc>
-        <w:tc>
-          <w:tcPr>
-            <w:tcW w:type="dxa" w:w="4320"/>
-          </w:tcPr>
-          <w:p>
-            <w:r>
-              <w:rPr>
-                <w:b/>
-              </w:rPr>
-              <w:t>结果</w:t>
-            </w:r>
-          </w:p>
-        </w:tc>
-      </w:tr>
-      <w:tr>
-        <w:tc>
-          <w:tcPr>
-            <w:tcW w:type="dxa" w:w="4320"/>
-          </w:tcPr>
-          <w:p>
-            <w:r>
-              <w:rPr>
-                <w:b w:val="0"/>
-              </w:rPr>
-              <w:t>12 个因果头中落入前 10% 的个数</w:t>
-            </w:r>
-          </w:p>
-        </w:tc>
-        <w:tc>
-          <w:tcPr>
-            <w:tcW w:type="dxa" w:w="4320"/>
-          </w:tcPr>
-          <w:p>
-            <w:r>
-              <w:rPr>
-                <w:b/>
-              </w:rPr>
-              <w:t>8 个</w:t>
-            </w:r>
-          </w:p>
-        </w:tc>
-      </w:tr>
-      <w:tr>
-        <w:tc>
-          <w:tcPr>
-            <w:tcW w:type="dxa" w:w="4320"/>
-          </w:tcPr>
-          <w:p>
-            <w:r>
-              <w:rPr>
-                <w:b w:val="0"/>
-              </w:rPr>
-              <w:t>置换检验（从同一层窗口 L12–27 随机抽 12 个头，10000 次）</w:t>
-            </w:r>
-          </w:p>
-        </w:tc>
-        <w:tc>
-          <w:tcPr>
-            <w:tcW w:type="dxa" w:w="4320"/>
-          </w:tcPr>
-          <w:p>
-            <w:r>
-              <w:rPr>
-                <w:b w:val="0"/>
-              </w:rPr>
-              <w:t>p &lt; 0.0001</w:t>
-            </w:r>
-          </w:p>
-        </w:tc>
-      </w:tr>
-      <w:tr>
-        <w:tc>
-          <w:tcPr>
-            <w:tcW w:type="dxa" w:w="4320"/>
-          </w:tcPr>
-          <w:p>
-            <w:r>
-              <w:rPr>
-                <w:b w:val="0"/>
-              </w:rPr>
-              <w:t>关键头 L14H25 的排名</w:t>
-            </w:r>
-          </w:p>
-        </w:tc>
-        <w:tc>
-          <w:tcPr>
-            <w:tcW w:type="dxa" w:w="4320"/>
-          </w:tcPr>
-          <w:p>
-            <w:r>
-              <w:rPr>
-                <w:b w:val="0"/>
-              </w:rPr>
-              <w:t>第 2</w:t>
-            </w:r>
-          </w:p>
-        </w:tc>
-      </w:tr>
-      <w:tr>
-        <w:tc>
-          <w:tcPr>
-            <w:tcW w:type="dxa" w:w="4320"/>
-          </w:tcPr>
-          <w:p>
-            <w:r>
-              <w:rPr>
-                <w:b w:val="0"/>
-              </w:rPr>
-              <w:t>探索集与留出集的头排名一致性（Spearman ρ）</w:t>
-            </w:r>
-          </w:p>
-        </w:tc>
-        <w:tc>
-          <w:tcPr>
-            <w:tcW w:type="dxa" w:w="4320"/>
-          </w:tcPr>
-          <w:p>
-            <w:r>
-              <w:rPr>
-                <w:b w:val="0"/>
-              </w:rPr>
-              <w:t>0.93，换话题后仍稳定</w:t>
-            </w:r>
-          </w:p>
-        </w:tc>
-      </w:tr>
-    </w:tbl>
-    <w:p/>
     <w:p>
       <w:pPr>
-        <w:pStyle w:val="Heading2"/>
-      </w:pPr>
-      <w:r>
-        <w:t>4.2 计算成本显著降低</w:t>
-      </w:r>
-    </w:p>
-    <w:tbl>
-      <w:tblPr>
-        <w:tblStyle w:val="TableGrid"/>
-        <w:tblW w:type="auto" w:w="0"/>
-        <w:tblLook w:firstColumn="1" w:firstRow="1" w:lastColumn="0" w:lastRow="0" w:noHBand="0" w:noVBand="1" w:val="04A0"/>
-      </w:tblPr>
-      <w:tblGrid>
-        <w:gridCol w:w="2160"/>
-        <w:gridCol w:w="2160"/>
-        <w:gridCol w:w="2160"/>
-        <w:gridCol w:w="2160"/>
-      </w:tblGrid>
-      <w:tr>
-        <w:tc>
-          <w:tcPr>
-            <w:tcW w:type="dxa" w:w="2160"/>
-          </w:tcPr>
-          <w:p>
-            <w:r>
-              <w:rPr>
-                <w:b/>
-              </w:rPr>
-              <w:t>方法</w:t>
-            </w:r>
-          </w:p>
-        </w:tc>
-        <w:tc>
-          <w:tcPr>
-            <w:tcW w:type="dxa" w:w="2160"/>
-          </w:tcPr>
-          <w:p>
-            <w:r>
-              <w:rPr>
-                <w:b/>
-              </w:rPr>
-              <w:t>覆盖范围</w:t>
-            </w:r>
-          </w:p>
-        </w:tc>
-        <w:tc>
-          <w:tcPr>
-            <w:tcW w:type="dxa" w:w="2160"/>
-          </w:tcPr>
-          <w:p>
-            <w:r>
-              <w:rPr>
-                <w:b/>
-              </w:rPr>
-              <w:t>硬件</w:t>
-            </w:r>
-          </w:p>
-        </w:tc>
-        <w:tc>
-          <w:tcPr>
-            <w:tcW w:type="dxa" w:w="2160"/>
-          </w:tcPr>
-          <w:p>
-            <w:r>
-              <w:rPr>
-                <w:b/>
-              </w:rPr>
-              <w:t>耗时</w:t>
-            </w:r>
-          </w:p>
-        </w:tc>
-      </w:tr>
-      <w:tr>
-        <w:tc>
-          <w:tcPr>
-            <w:tcW w:type="dxa" w:w="2160"/>
-          </w:tcPr>
-          <w:p>
-            <w:r>
-              <w:rPr>
-                <w:b w:val="0"/>
-              </w:rPr>
-              <w:t>现有方法（单头激活修补）</w:t>
-            </w:r>
-          </w:p>
-        </w:tc>
-        <w:tc>
-          <w:tcPr>
-            <w:tcW w:type="dxa" w:w="2160"/>
-          </w:tcPr>
-          <w:p>
-            <w:r>
-              <w:rPr>
-                <w:b w:val="0"/>
-              </w:rPr>
-              <w:t>512 个头的窗口</w:t>
-            </w:r>
-          </w:p>
-        </w:tc>
-        <w:tc>
-          <w:tcPr>
-            <w:tcW w:type="dxa" w:w="2160"/>
-          </w:tcPr>
-          <w:p>
-            <w:r>
-              <w:rPr>
-                <w:b w:val="0"/>
-              </w:rPr>
-              <w:t>RTX 5090</w:t>
-            </w:r>
-          </w:p>
-        </w:tc>
-        <w:tc>
-          <w:tcPr>
-            <w:tcW w:type="dxa" w:w="2160"/>
-          </w:tcPr>
-          <w:p>
-            <w:r>
-              <w:rPr>
-                <w:b w:val="0"/>
-              </w:rPr>
-              <w:t>约 2682 秒</w:t>
-            </w:r>
-          </w:p>
-        </w:tc>
-      </w:tr>
-      <w:tr>
-        <w:tc>
-          <w:tcPr>
-            <w:tcW w:type="dxa" w:w="2160"/>
-          </w:tcPr>
-          <w:p>
-            <w:r>
-              <w:rPr>
-                <w:b w:val="0"/>
-              </w:rPr>
-              <w:t>本方法</w:t>
-            </w:r>
-          </w:p>
-        </w:tc>
-        <w:tc>
-          <w:tcPr>
-            <w:tcW w:type="dxa" w:w="2160"/>
-          </w:tcPr>
-          <w:p>
-            <w:r>
-              <w:rPr>
-                <w:b w:val="0"/>
-              </w:rPr>
-              <w:t>全部 1152 个头</w:t>
-            </w:r>
-          </w:p>
-        </w:tc>
-        <w:tc>
-          <w:tcPr>
-            <w:tcW w:type="dxa" w:w="2160"/>
-          </w:tcPr>
-          <w:p>
-            <w:r>
-              <w:rPr>
-                <w:b w:val="0"/>
-              </w:rPr>
-              <w:t>Apple M4 笔记本</w:t>
-            </w:r>
-          </w:p>
-        </w:tc>
-        <w:tc>
-          <w:tcPr>
-            <w:tcW w:type="dxa" w:w="2160"/>
-          </w:tcPr>
-          <w:p>
-            <w:r>
-              <w:rPr>
-                <w:b w:val="0"/>
-              </w:rPr>
-              <w:t>前向特征提取约 282 秒（640 条样本）；承载分数为闭式计算，秒级完成</w:t>
-            </w:r>
-          </w:p>
-        </w:tc>
-      </w:tr>
-    </w:tbl>
-    <w:p/>
-    <w:p>
+        <w:pStyle w:val="ListBullet"/>
+      </w:pPr>
       <w:r>
         <w:rPr>
           <w:b w:val="0"/>
         </w:rPr>
-        <w:t>本方法每条样本只需一次前向计算，计算量与头数无关。逐头修补或消融的计算量则与头数成正比。</w:t>
+        <w:t>第一阶段：前向特征提取约 28 秒，残差峰值在相对深度 0.436。</w:t>
       </w:r>
     </w:p>
     <w:p>
       <w:pPr>
-        <w:pStyle w:val="Heading2"/>
-      </w:pPr>
-      <w:r>
-        <w:t>4.3 持续注入的调控效果</w:t>
-      </w:r>
-    </w:p>
-    <w:p>
+        <w:pStyle w:val="ListBullet"/>
+      </w:pPr>
       <w:r>
         <w:rPr>
           <w:b w:val="0"/>
         </w:rPr>
-        <w:t>在 Qwen3-4B 的 12 个承载头上持续注入，λ = 2，在封存测试集上（40 个场景，360 条续写，由两路独立的大语言模型盲评打分，评分者间相关 0.84–0.97，尚未做人工校准）的结果：</w:t>
+        <w:t>第二阶段：候选 60 个头加对照 60 个随机头，共 120 个头，筛选约 24 分钟（单张 48 GB GPU）；方法本身只需筛候选的 60 个，约 12 分钟。</w:t>
+      </w:r>
+    </w:p>
+    <w:p>
+      <w:pPr>
+        <w:pStyle w:val="ListBullet"/>
+      </w:pPr>
+      <w:r>
+        <w:rPr>
+          <w:b w:val="0"/>
+        </w:rPr>
+        <w:t>承载分数前 60 名中，27 个显著正向，13 个显著反向。</w:t>
+      </w:r>
+    </w:p>
+    <w:p>
+      <w:pPr>
+        <w:pStyle w:val="ListBullet"/>
+      </w:pPr>
+      <w:r>
+        <w:rPr>
+          <w:b w:val="0"/>
+        </w:rPr>
+        <w:t>随机 60 个头中，6 个正向，19 个反向。</w:t>
+      </w:r>
+    </w:p>
+    <w:p>
+      <w:pPr>
+        <w:pStyle w:val="ListBullet"/>
+      </w:pPr>
+      <w:r>
+        <w:rPr>
+          <w:b w:val="0"/>
+        </w:rPr>
+        <w:t>选出的 12 个调控头：L15H14、L18H14、L16H25、L17H18、L15H11、L27H22、L22H28、L16H17、L25H16、L16H11、L16H29、L18H13。</w:t>
+      </w:r>
+    </w:p>
+    <w:p>
+      <w:r>
+        <w:rPr>
+          <w:b/>
+        </w:rPr>
+        <w:t>test 集结果</w:t>
+      </w:r>
+      <w:r>
+        <w:rPr>
+          <w:b w:val="0"/>
+        </w:rPr>
+        <w:t>（λ = 8，40 个场景，600 条续写；愤怒程度满分 4）：</w:t>
       </w:r>
     </w:p>
     <w:tbl>
@@ -1830,7 +1618,7 @@
               <w:rPr>
                 <w:b/>
               </w:rPr>
-              <w:t>对照</w:t>
+              <w:t>对比</w:t>
             </w:r>
           </w:p>
         </w:tc>
@@ -1843,7 +1631,7 @@
               <w:rPr>
                 <w:b/>
               </w:rPr>
-              <w:t>愤怒程度变化（满分 4）</w:t>
+              <w:t>差值</w:t>
             </w:r>
           </w:p>
         </w:tc>
@@ -1871,7 +1659,7 @@
               <w:rPr>
                 <w:b w:val="0"/>
               </w:rPr>
-              <w:t>相对幅度匹配的随机方向</w:t>
+              <w:t>本方法 − 同一组头加幅度匹配的随机方向</w:t>
             </w:r>
           </w:p>
         </w:tc>
@@ -1884,7 +1672,7 @@
               <w:rPr>
                 <w:b/>
               </w:rPr>
-              <w:t>+1.19</w:t>
+              <w:t>+1.90</w:t>
             </w:r>
           </w:p>
         </w:tc>
@@ -1897,7 +1685,7 @@
               <w:rPr>
                 <w:b w:val="0"/>
               </w:rPr>
-              <w:t>[0.96, 1.42]</w:t>
+              <w:t>[1.60, 2.18]</w:t>
             </w:r>
           </w:p>
         </w:tc>
@@ -1912,7 +1700,20 @@
               <w:rPr>
                 <w:b w:val="0"/>
               </w:rPr>
-              <w:t>相对不干预</w:t>
+              <w:t>本方法 − 不干预</w:t>
+            </w:r>
+          </w:p>
+        </w:tc>
+        <w:tc>
+          <w:tcPr>
+            <w:tcW w:type="dxa" w:w="2880"/>
+          </w:tcPr>
+          <w:p>
+            <w:r>
+              <w:rPr>
+                <w:b/>
+              </w:rPr>
+              <w:t>+1.76</w:t>
             </w:r>
           </w:p>
         </w:tc>
@@ -1925,7 +1726,35 @@
               <w:rPr>
                 <w:b w:val="0"/>
               </w:rPr>
-              <w:t>+1.19</w:t>
+              <w:t>[1.41, 2.09]</w:t>
+            </w:r>
+          </w:p>
+        </w:tc>
+      </w:tr>
+      <w:tr>
+        <w:tc>
+          <w:tcPr>
+            <w:tcW w:type="dxa" w:w="2880"/>
+          </w:tcPr>
+          <w:p>
+            <w:r>
+              <w:rPr>
+                <w:b w:val="0"/>
+              </w:rPr>
+              <w:t>本方法 − 随机 12 个头（各用自身导向向量，总推力相同）</w:t>
+            </w:r>
+          </w:p>
+        </w:tc>
+        <w:tc>
+          <w:tcPr>
+            <w:tcW w:type="dxa" w:w="2880"/>
+          </w:tcPr>
+          <w:p>
+            <w:r>
+              <w:rPr>
+                <w:b/>
+              </w:rPr>
+              <w:t>+1.74</w:t>
             </w:r>
           </w:p>
         </w:tc>
@@ -1938,7 +1767,171 @@
               <w:rPr>
                 <w:b w:val="0"/>
               </w:rPr>
-              <w:t>[0.95, 1.43]</w:t>
+              <w:t>[1.40, 2.05]</w:t>
+            </w:r>
+          </w:p>
+        </w:tc>
+      </w:tr>
+      <w:tr>
+        <w:tc>
+          <w:tcPr>
+            <w:tcW w:type="dxa" w:w="2880"/>
+          </w:tcPr>
+          <w:p>
+            <w:r>
+              <w:rPr>
+                <w:b w:val="0"/>
+              </w:rPr>
+              <w:t>本方法 − 仅按承载分数取前 12（只做第一阶段）</w:t>
+            </w:r>
+          </w:p>
+        </w:tc>
+        <w:tc>
+          <w:tcPr>
+            <w:tcW w:type="dxa" w:w="2880"/>
+          </w:tcPr>
+          <w:p>
+            <w:r>
+              <w:rPr>
+                <w:b/>
+              </w:rPr>
+              <w:t>+0.71</w:t>
+            </w:r>
+          </w:p>
+        </w:tc>
+        <w:tc>
+          <w:tcPr>
+            <w:tcW w:type="dxa" w:w="2880"/>
+          </w:tcPr>
+          <w:p>
+            <w:r>
+              <w:rPr>
+                <w:b w:val="0"/>
+              </w:rPr>
+              <w:t>[0.40, 1.04]</w:t>
+            </w:r>
+          </w:p>
+        </w:tc>
+      </w:tr>
+      <w:tr>
+        <w:tc>
+          <w:tcPr>
+            <w:tcW w:type="dxa" w:w="2880"/>
+          </w:tcPr>
+          <w:p>
+            <w:r>
+              <w:rPr>
+                <w:b w:val="0"/>
+              </w:rPr>
+              <w:t>本方法 − 不做预筛、直接在 60 个随机头中做方向筛选</w:t>
+            </w:r>
+          </w:p>
+        </w:tc>
+        <w:tc>
+          <w:tcPr>
+            <w:tcW w:type="dxa" w:w="2880"/>
+          </w:tcPr>
+          <w:p>
+            <w:r>
+              <w:rPr>
+                <w:b w:val="0"/>
+              </w:rPr>
+              <w:t>+1.81</w:t>
+            </w:r>
+          </w:p>
+        </w:tc>
+        <w:tc>
+          <w:tcPr>
+            <w:tcW w:type="dxa" w:w="2880"/>
+          </w:tcPr>
+          <w:p>
+            <w:r>
+              <w:rPr>
+                <w:b w:val="0"/>
+              </w:rPr>
+              <w:t>[1.46, 2.13]</w:t>
+            </w:r>
+          </w:p>
+        </w:tc>
+      </w:tr>
+      <w:tr>
+        <w:tc>
+          <w:tcPr>
+            <w:tcW w:type="dxa" w:w="2880"/>
+          </w:tcPr>
+          <w:p>
+            <w:r>
+              <w:rPr>
+                <w:b w:val="0"/>
+              </w:rPr>
+              <w:t>特异性：愤怒的上升 − 喜悦的上升 / − 悲伤的上升</w:t>
+            </w:r>
+          </w:p>
+        </w:tc>
+        <w:tc>
+          <w:tcPr>
+            <w:tcW w:type="dxa" w:w="2880"/>
+          </w:tcPr>
+          <w:p>
+            <w:r>
+              <w:rPr>
+                <w:b w:val="0"/>
+              </w:rPr>
+              <w:t>+2.00 / +1.38</w:t>
+            </w:r>
+          </w:p>
+        </w:tc>
+        <w:tc>
+          <w:tcPr>
+            <w:tcW w:type="dxa" w:w="2880"/>
+          </w:tcPr>
+          <w:p>
+            <w:r>
+              <w:rPr>
+                <w:b w:val="0"/>
+              </w:rPr>
+              <w:t>置信区间均 &gt; 0</w:t>
+            </w:r>
+          </w:p>
+        </w:tc>
+      </w:tr>
+      <w:tr>
+        <w:tc>
+          <w:tcPr>
+            <w:tcW w:type="dxa" w:w="2880"/>
+          </w:tcPr>
+          <w:p>
+            <w:r>
+              <w:rPr>
+                <w:b w:val="0"/>
+              </w:rPr>
+              <w:t>参照：直接写一句愤怒的开头 − 不干预</w:t>
+            </w:r>
+          </w:p>
+        </w:tc>
+        <w:tc>
+          <w:tcPr>
+            <w:tcW w:type="dxa" w:w="2880"/>
+          </w:tcPr>
+          <w:p>
+            <w:r>
+              <w:rPr>
+                <w:b w:val="0"/>
+              </w:rPr>
+              <w:t>+1.11</w:t>
+            </w:r>
+          </w:p>
+        </w:tc>
+        <w:tc>
+          <w:tcPr>
+            <w:tcW w:type="dxa" w:w="2880"/>
+          </w:tcPr>
+          <w:p>
+            <w:r>
+              <w:rPr>
+                <w:b w:val="0"/>
+              </w:rPr>
+              <w:t>[0.76, 1.44]</w:t>
             </w:r>
           </w:p>
         </w:tc>
@@ -1948,26 +1941,297 @@
     <w:p>
       <w:r>
         <w:rPr>
-          <w:b w:val="0"/>
+          <w:b/>
         </w:rPr>
-        <w:t>其他结果：</w:t>
+        <w:t>各条件的愤怒均值：</w:t>
       </w:r>
     </w:p>
+    <w:tbl>
+      <w:tblPr>
+        <w:tblStyle w:val="TableGrid"/>
+        <w:tblW w:type="auto" w:w="0"/>
+        <w:tblLook w:firstColumn="1" w:firstRow="1" w:lastColumn="0" w:lastRow="0" w:noHBand="0" w:noVBand="1" w:val="04A0"/>
+      </w:tblPr>
+      <w:tblGrid>
+        <w:gridCol w:w="4320"/>
+        <w:gridCol w:w="4320"/>
+      </w:tblGrid>
+      <w:tr>
+        <w:tc>
+          <w:tcPr>
+            <w:tcW w:type="dxa" w:w="4320"/>
+          </w:tcPr>
+          <w:p>
+            <w:r>
+              <w:rPr>
+                <w:b/>
+              </w:rPr>
+              <w:t>条件</w:t>
+            </w:r>
+          </w:p>
+        </w:tc>
+        <w:tc>
+          <w:tcPr>
+            <w:tcW w:type="dxa" w:w="4320"/>
+          </w:tcPr>
+          <w:p>
+            <w:r>
+              <w:rPr>
+                <w:b/>
+              </w:rPr>
+              <w:t>愤怒均值</w:t>
+            </w:r>
+          </w:p>
+        </w:tc>
+      </w:tr>
+      <w:tr>
+        <w:tc>
+          <w:tcPr>
+            <w:tcW w:type="dxa" w:w="4320"/>
+          </w:tcPr>
+          <w:p>
+            <w:r>
+              <w:rPr>
+                <w:b w:val="0"/>
+              </w:rPr>
+              <w:t>不干预</w:t>
+            </w:r>
+          </w:p>
+        </w:tc>
+        <w:tc>
+          <w:tcPr>
+            <w:tcW w:type="dxa" w:w="4320"/>
+          </w:tcPr>
+          <w:p>
+            <w:r>
+              <w:rPr>
+                <w:b w:val="0"/>
+              </w:rPr>
+              <w:t>0.46</w:t>
+            </w:r>
+          </w:p>
+        </w:tc>
+      </w:tr>
+      <w:tr>
+        <w:tc>
+          <w:tcPr>
+            <w:tcW w:type="dxa" w:w="4320"/>
+          </w:tcPr>
+          <w:p>
+            <w:r>
+              <w:rPr>
+                <w:b w:val="0"/>
+              </w:rPr>
+              <w:t>愤怒开头</w:t>
+            </w:r>
+          </w:p>
+        </w:tc>
+        <w:tc>
+          <w:tcPr>
+            <w:tcW w:type="dxa" w:w="4320"/>
+          </w:tcPr>
+          <w:p>
+            <w:r>
+              <w:rPr>
+                <w:b w:val="0"/>
+              </w:rPr>
+              <w:t>1.58</w:t>
+            </w:r>
+          </w:p>
+        </w:tc>
+      </w:tr>
+      <w:tr>
+        <w:tc>
+          <w:tcPr>
+            <w:tcW w:type="dxa" w:w="4320"/>
+          </w:tcPr>
+          <w:p>
+            <w:r>
+              <w:rPr>
+                <w:b/>
+              </w:rPr>
+              <w:t>本方法</w:t>
+            </w:r>
+          </w:p>
+        </w:tc>
+        <w:tc>
+          <w:tcPr>
+            <w:tcW w:type="dxa" w:w="4320"/>
+          </w:tcPr>
+          <w:p>
+            <w:r>
+              <w:rPr>
+                <w:b/>
+              </w:rPr>
+              <w:t>2.23</w:t>
+            </w:r>
+          </w:p>
+        </w:tc>
+      </w:tr>
+      <w:tr>
+        <w:tc>
+          <w:tcPr>
+            <w:tcW w:type="dxa" w:w="4320"/>
+          </w:tcPr>
+          <w:p>
+            <w:r>
+              <w:rPr>
+                <w:b w:val="0"/>
+              </w:rPr>
+              <w:t>仅第一阶段</w:t>
+            </w:r>
+          </w:p>
+        </w:tc>
+        <w:tc>
+          <w:tcPr>
+            <w:tcW w:type="dxa" w:w="4320"/>
+          </w:tcPr>
+          <w:p>
+            <w:r>
+              <w:rPr>
+                <w:b w:val="0"/>
+              </w:rPr>
+              <w:t>1.51</w:t>
+            </w:r>
+          </w:p>
+        </w:tc>
+      </w:tr>
+      <w:tr>
+        <w:tc>
+          <w:tcPr>
+            <w:tcW w:type="dxa" w:w="4320"/>
+          </w:tcPr>
+          <w:p>
+            <w:r>
+              <w:rPr>
+                <w:b w:val="0"/>
+              </w:rPr>
+              <w:t>随机头</w:t>
+            </w:r>
+          </w:p>
+        </w:tc>
+        <w:tc>
+          <w:tcPr>
+            <w:tcW w:type="dxa" w:w="4320"/>
+          </w:tcPr>
+          <w:p>
+            <w:r>
+              <w:rPr>
+                <w:b w:val="0"/>
+              </w:rPr>
+              <w:t>0.49</w:t>
+            </w:r>
+          </w:p>
+        </w:tc>
+      </w:tr>
+      <w:tr>
+        <w:tc>
+          <w:tcPr>
+            <w:tcW w:type="dxa" w:w="4320"/>
+          </w:tcPr>
+          <w:p>
+            <w:r>
+              <w:rPr>
+                <w:b w:val="0"/>
+              </w:rPr>
+              <w:t>随机方向</w:t>
+            </w:r>
+          </w:p>
+        </w:tc>
+        <w:tc>
+          <w:tcPr>
+            <w:tcW w:type="dxa" w:w="4320"/>
+          </w:tcPr>
+          <w:p>
+            <w:r>
+              <w:rPr>
+                <w:b w:val="0"/>
+              </w:rPr>
+              <w:t>0.33</w:t>
+            </w:r>
+          </w:p>
+        </w:tc>
+      </w:tr>
+      <w:tr>
+        <w:tc>
+          <w:tcPr>
+            <w:tcW w:type="dxa" w:w="4320"/>
+          </w:tcPr>
+          <w:p>
+            <w:r>
+              <w:rPr>
+                <w:b w:val="0"/>
+              </w:rPr>
+              <w:t>只做筛选、不预筛</w:t>
+            </w:r>
+          </w:p>
+        </w:tc>
+        <w:tc>
+          <w:tcPr>
+            <w:tcW w:type="dxa" w:w="4320"/>
+          </w:tcPr>
+          <w:p>
+            <w:r>
+              <w:rPr>
+                <w:b w:val="0"/>
+              </w:rPr>
+              <w:t>0.41</w:t>
+            </w:r>
+          </w:p>
+        </w:tc>
+      </w:tr>
+    </w:tbl>
+    <w:p/>
     <w:p>
-      <w:pPr>
-        <w:pStyle w:val="ListBullet"/>
-      </w:pPr>
       <w:r>
         <w:rPr>
           <w:b/>
         </w:rPr>
-        <w:t>特异性</w:t>
+        <w:t>质量</w:t>
       </w:r>
       <w:r>
         <w:rPr>
           <w:b w:val="0"/>
         </w:rPr>
-        <w:t>：愤怒的上升大于喜悦（差 +1.38）、大于悲伤（差 +0.96），两个置信区间的下限均大于 0。</w:t>
+        <w:t>：</w:t>
+      </w:r>
+    </w:p>
+    <w:p>
+      <w:pPr>
+        <w:pStyle w:val="ListBullet"/>
+      </w:pPr>
+      <w:r>
+        <w:rPr>
+          <w:b w:val="0"/>
+        </w:rPr>
+        <w:t>流畅度 −0.29（满分 5）；</w:t>
+      </w:r>
+    </w:p>
+    <w:p>
+      <w:pPr>
+        <w:pStyle w:val="ListBullet"/>
+      </w:pPr>
+      <w:r>
+        <w:rPr>
+          <w:b w:val="0"/>
+        </w:rPr>
+        <w:t>事实错误率 16%，不干预为 11%，相差约 5 个百分点。</w:t>
+      </w:r>
+    </w:p>
+    <w:p>
+      <w:r>
+        <w:rPr>
+          <w:b w:val="0"/>
+        </w:rPr>
+        <w:t>两项都在预设的容忍范围内。在 λ = 4 时，效果约为 +1.15，质量代价更小（验证集数据）。</w:t>
+      </w:r>
+    </w:p>
+    <w:p>
+      <w:pPr>
+        <w:pStyle w:val="Heading2"/>
+      </w:pPr>
+      <w:r>
+        <w:t>4.2 两个阶段各自不可缺少</w:t>
       </w:r>
     </w:p>
     <w:p>
@@ -1978,13 +2242,13 @@
         <w:rPr>
           <w:b/>
         </w:rPr>
-        <w:t>流畅度</w:t>
+        <w:t>缺少第二阶段</w:t>
       </w:r>
       <w:r>
         <w:rPr>
           <w:b w:val="0"/>
         </w:rPr>
-        <w:t>：+0.06，置信区间 [−0.13, 0.28]，无明显损害。</w:t>
+        <w:t>：只按承载分数取前 12（2.3 节，Qwen3-8B）在确认性检验中完全无效（+0.03）。在 Qwen3-14B 上也明显弱于两阶段（差 0.71）。原因是候选头中混有反向的抑制头。</w:t>
       </w:r>
     </w:p>
     <w:p>
@@ -1995,13 +2259,21 @@
         <w:rPr>
           <w:b/>
         </w:rPr>
-        <w:t>对照：只在锚点位置做一次性干预</w:t>
+        <w:t>缺少第一阶段</w:t>
       </w:r>
       <w:r>
         <w:rPr>
           <w:b w:val="0"/>
         </w:rPr>
-        <w:t>：在验证集上，只在锚点位置把这 12 个头的输出替换为愤怒供体样本的输出，生成后仅 +0.04，置信区间 [−0.07, 0.16]，几乎无效。这说明作用必须覆盖生成过程，“持续注入”是取得效果的关键特征。</w:t>
+        <w:t>：直接在随机 60 个头中做同样的方向筛选，只找到 6 个弱正向头，调控无效（比本方法低 1.81）。原因是与属性相关的头在全部头中占比很低，第一阶段把它们集中到了候选集里。</w:t>
+      </w:r>
+    </w:p>
+    <w:p>
+      <w:pPr>
+        <w:pStyle w:val="Heading2"/>
+      </w:pPr>
+      <w:r>
+        <w:t>4.3 计算成本</w:t>
       </w:r>
     </w:p>
     <w:p>
@@ -2012,56 +2284,60 @@
         <w:rPr>
           <w:b/>
         </w:rPr>
-        <w:t>局限</w:t>
+        <w:t>本方法</w:t>
       </w:r>
       <w:r>
         <w:rPr>
           <w:b w:val="0"/>
         </w:rPr>
-        <w:t>：事实一致性均值下降 6.2 个百分点（置信区间跨 0）。实施例中可以采用 3.6 第 4 项的限位或衰减方案缓解。</w:t>
+        <w:t>：</w:t>
       </w:r>
     </w:p>
     <w:p>
       <w:pPr>
-        <w:pStyle w:val="Heading2"/>
-      </w:pPr>
-      <w:r>
-        <w:t>4.4 跨模型普适</w:t>
-      </w:r>
-    </w:p>
-    <w:p>
+        <w:pStyle w:val="ListBullet"/>
+      </w:pPr>
       <w:r>
         <w:rPr>
           <w:b w:val="0"/>
         </w:rPr>
-        <w:t>在三个模型上，锚点位置的属性可读性都在相对深度 0.43–0.56 达到峰值，随后下降。这为步骤四的层窗口选择提供了跨模型依据，三个模型的留出集检验均通过。</w:t>
+        <w:t>第一阶段只做前向计算，计算量与头数无关，Qwen3-14B 约 28 秒。</w:t>
       </w:r>
     </w:p>
     <w:p>
       <w:pPr>
-        <w:pStyle w:val="Heading2"/>
-      </w:pPr>
-      <w:r>
-        <w:t>4.5 定位结果反映的是“搬运”，而不是字面</w:t>
-      </w:r>
-    </w:p>
-    <w:p>
+        <w:pStyle w:val="ListBullet"/>
+      </w:pPr>
       <w:r>
         <w:rPr>
           <w:b w:val="0"/>
         </w:rPr>
-        <w:t>在锚点位置，属性只解释约 3–5% 的方差（内容约占 90%），但仍能以 AUROC ≥ 0.99 读出。这说明：</w:t>
+        <w:t>第二阶段只对 N 个候选头做教师强制的单头干预，不需要生成文本。N = 60 时，在单张 48 GB GPU 上约 12 分钟（实验中另筛了 60 个随机头作对照，合计 120 个头约 24 分钟）。</w:t>
       </w:r>
     </w:p>
     <w:p>
       <w:pPr>
         <w:pStyle w:val="ListBullet"/>
       </w:pPr>
+      <w:r>
+        <w:rPr>
+          <w:b/>
+        </w:rPr>
+        <w:t>对全部头逐个干预（现有技术二、四）</w:t>
+      </w:r>
       <w:r>
         <w:rPr>
           <w:b w:val="0"/>
         </w:rPr>
-        <w:t>按方差大小或激活强度挑选部件，主要会挑到承载内容的部件；</w:t>
+        <w:t>：Qwen3-14B 共 1600 个头，干预次数约为本方法第二阶段的 27 倍。</w:t>
+      </w:r>
+    </w:p>
+    <w:p>
+      <w:pPr>
+        <w:pStyle w:val="Heading2"/>
+      </w:pPr>
+      <w:r>
+        <w:t>4.4 承载分数本身的稳定性与跨模型规律</w:t>
       </w:r>
     </w:p>
     <w:p>
@@ -2072,23 +2348,83 @@
         <w:rPr>
           <w:b w:val="0"/>
         </w:rPr>
-        <w:t>承载分数在扣除内容之后计算，所以能把真正的属性承载部件挑出来。</w:t>
+        <w:t>在 Qwen3-4B 上，承载分数排名在不同话题之间高度一致（Spearman ρ = 0.93）。</w:t>
       </w:r>
     </w:p>
     <w:p>
       <w:pPr>
-        <w:pStyle w:val="Heading1"/>
-      </w:pPr>
-      <w:r>
-        <w:t>五、实施例</w:t>
+        <w:pStyle w:val="ListBullet"/>
+      </w:pPr>
+      <w:r>
+        <w:rPr>
+          <w:b w:val="0"/>
+        </w:rPr>
+        <w:t>因果修补找到的 12 个头中，有 8 个落入前 10%（p &lt; 0.0001）。</w:t>
       </w:r>
     </w:p>
     <w:p>
       <w:pPr>
+        <w:pStyle w:val="ListBullet"/>
+      </w:pPr>
+      <w:r>
+        <w:rPr>
+          <w:b w:val="0"/>
+        </w:rPr>
+        <w:t>在 3 个模型上，锚点位置的属性可读性都在相对深度约 0.43–0.56 达到峰值。</w:t>
+      </w:r>
+    </w:p>
+    <w:p>
+      <w:pPr>
         <w:pStyle w:val="Heading2"/>
       </w:pPr>
       <w:r>
-        <w:t>实施例一：Qwen3-4B-Instruct-2507，愤怒属性</w:t>
+        <w:t>4.5 （探索性，尚未确认）同一模型家族内按头编号迁移</w:t>
+      </w:r>
+    </w:p>
+    <w:p>
+      <w:r>
+        <w:rPr>
+          <w:b w:val="0"/>
+        </w:rPr>
+        <w:t>研发方在 Qwen3-4B 上用因果修补确定了 12 个头。在同为 36 层 × 32 头的 Qwen3-8B 上，按相同的“层号 + 头号”直接注入 8B 自己的导向向量，教师强制指标上的效果为 +1.15 ± 0.09，是所有测试配置中最强的。</w:t>
+      </w:r>
+    </w:p>
+    <w:p>
+      <w:r>
+        <w:rPr>
+          <w:b w:val="0"/>
+        </w:rPr>
+        <w:t>8B 单头效果最强的前 10 个头中，有 5 个与 4B 的因果头编号相同。</w:t>
+      </w:r>
+    </w:p>
+    <w:p>
+      <w:r>
+        <w:rPr>
+          <w:b/>
+        </w:rPr>
+        <w:t>该结果是事后探索得到的，尚未经过预先登记的确认实验。</w:t>
+      </w:r>
+      <w:r>
+        <w:rPr>
+          <w:b w:val="0"/>
+        </w:rPr>
+        <w:t xml:space="preserve"> 建议作为从属权利要求，并在优先权期内补充确认数据。</w:t>
+      </w:r>
+    </w:p>
+    <w:p>
+      <w:pPr>
+        <w:pStyle w:val="Heading1"/>
+      </w:pPr>
+      <w:r>
+        <w:t>五、实施例</w:t>
+      </w:r>
+    </w:p>
+    <w:p>
+      <w:pPr>
+        <w:pStyle w:val="Heading2"/>
+      </w:pPr>
+      <w:r>
+        <w:t>实施例一：Qwen3-14B，愤怒属性（对应 4.1）</w:t>
       </w:r>
     </w:p>
     <w:p>
@@ -2105,7 +2441,7 @@
         <w:rPr>
           <w:b w:val="0"/>
         </w:rPr>
-        <w:t>：120 个场景，每个场景是一个“收获 + 失去所珍视之物 + 他人不当决定”的三要素混合事件。四种情绪的属性段由大语言模型起草，并经 8 轮独立大语言模型盲评筛选；尚未做人工审校。锚点为该场景事实摘要加“我的看法是：”。探索集与留出集按话题划分。</w:t>
+        <w:t>：每个场景都是“收获 + 失去所珍视之物 + 他人不当决定”的三要素混合事件。属性段由大语言模型起草，并经多轮独立盲评筛选。锚点为事实摘要加“我的看法是：”。</w:t>
       </w:r>
     </w:p>
     <w:p>
@@ -2116,13 +2452,13 @@
         <w:rPr>
           <w:b/>
         </w:rPr>
-        <w:t>特征</w:t>
+        <w:t>第一阶段</w:t>
       </w:r>
       <w:r>
         <w:rPr>
           <w:b w:val="0"/>
         </w:rPr>
-        <w:t>：bfloat16 精度，教师强制前向计算。用 forward_pre_hook 读取 o_proj 的输入并切分为 32 个头（每头 128 维），在锚点 token 上取平均。</w:t>
+        <w:t>：bfloat16 精度，教师强制。在 o_proj 上注册前向预钩子，读取输入并按头切分（每头 128 维），在锚点 token 上取平均。计算承载分数，取前 60 名。</w:t>
       </w:r>
     </w:p>
     <w:p>
@@ -2133,35 +2469,13 @@
         <w:rPr>
           <w:b/>
         </w:rPr>
-        <w:t>排序</w:t>
+        <w:t>第二阶段</w:t>
       </w:r>
       <w:r>
         <w:rPr>
           <w:b w:val="0"/>
         </w:rPr>
-        <w:t>：按 3.4 计算 C(l,h)。结果包括：</w:t>
-      </w:r>
-    </w:p>
-    <w:p>
-      <w:pPr>
-        <w:pStyle w:val="ListBullet2"/>
-      </w:pPr>
-      <w:r>
-        <w:rPr>
-          <w:b w:val="0"/>
-        </w:rPr>
-        <w:t>前 10% 中包含 L14H25、L17H16、L17H19 等头；</w:t>
-      </w:r>
-    </w:p>
-    <w:p>
-      <w:pPr>
-        <w:pStyle w:val="ListBullet2"/>
-      </w:pPr>
-      <w:r>
-        <w:rPr>
-          <w:b w:val="0"/>
-        </w:rPr>
-        <w:t>L14H25 在描述性分析中，有 48% 的注意力从锚点指向属性段。</w:t>
+        <w:t>：使用 discovery 集 60 个场景 × 2 种改写，各头统一推力，计算 e_h 和 SE_h。保留 e_h &gt; 2·SE_h 的头，取前 12 个。</w:t>
       </w:r>
     </w:p>
     <w:p>
@@ -2178,23 +2492,18 @@
         <w:rPr>
           <w:b w:val="0"/>
         </w:rPr>
-        <w:t>：在 12 个承载头上以 λ = 2 持续注入愤怒−中性导向向量，最大生成 64 个 token。效果见 4.3。</w:t>
+        <w:t>：λ 网格 {1, 2, 4, 8}，在验证集上按预设规则选出 λ = 8。在 12 个头上，于锚点位置和每个生成步持续注入，最多生成 64 个 token。</w:t>
       </w:r>
     </w:p>
     <w:p>
       <w:pPr>
-        <w:pStyle w:val="Heading2"/>
-      </w:pPr>
-      <w:r>
-        <w:t>实施例二：Qwen3-1.7B 与 Llama-3.2-1B-Instruct</w:t>
-      </w:r>
-    </w:p>
-    <w:p>
+        <w:pStyle w:val="ListNumber"/>
+      </w:pPr>
       <w:r>
         <w:rPr>
           <w:b w:val="0"/>
         </w:rPr>
-        <w:t>以相同样本集重复步骤二至四。可读性峰值分别位于第 15 层（相对深度 0.56）和第 7 层（相对深度 0.47）。每个模型在 Apple M4 上的特征提取时间约为 1 至 2 分钟。</w:t>
+        <w:t>效果见 4.1。</w:t>
       </w:r>
     </w:p>
     <w:p>
@@ -2202,7 +2511,7 @@
         <w:pStyle w:val="Heading2"/>
       </w:pPr>
       <w:r>
-        <w:t>实施例三（可选扩展）：其他属性</w:t>
+        <w:t>实施例二：Qwen3-8B（对比例，说明第二阶段的必要性）</w:t>
       </w:r>
     </w:p>
     <w:p>
@@ -2210,7 +2519,23 @@
         <w:rPr>
           <w:b w:val="0"/>
         </w:rPr>
-        <w:t>把“情绪”替换为其他可在属性段中表达、且需要传递到后续内容的属性，同样适用：</w:t>
+        <w:t>只做第一阶段，取前 12 个头做持续注入，确认性检验无效。单头筛选揭示了反向头（见 2.3）。</w:t>
+      </w:r>
+    </w:p>
+    <w:p>
+      <w:pPr>
+        <w:pStyle w:val="Heading2"/>
+      </w:pPr>
+      <w:r>
+        <w:t>实施例三（可选扩展）：其他属性</w:t>
+      </w:r>
+    </w:p>
+    <w:p>
+      <w:r>
+        <w:rPr>
+          <w:b w:val="0"/>
+        </w:rPr>
+        <w:t>情绪以外的、可在属性段中表达并需要传递到后续内容的属性，均可同样处理：</w:t>
       </w:r>
     </w:p>
     <w:p>
@@ -2265,7 +2590,15 @@
         <w:rPr>
           <w:b w:val="0"/>
         </w:rPr>
-        <w:t>敌意或攻击性。</w:t>
+        <w:t>攻击性。</w:t>
+      </w:r>
+    </w:p>
+    <w:p>
+      <w:r>
+        <w:rPr>
+          <w:b w:val="0"/>
+        </w:rPr>
+        <w:t>“降低”某属性时，把参照属性与目标属性对调即可，例如由愤怒导向平和。</w:t>
       </w:r>
     </w:p>
     <w:p>
@@ -2337,7 +2670,7 @@
               <w:rPr>
                 <w:b w:val="0"/>
               </w:rPr>
-              <w:t>方法总流程图：样本构造 → 前向计算 → 锚点位置头输出 → 承载分数 → 排序 → 调控、读出、迁移</w:t>
+              <w:t>方法总流程：样本构造 → 第一阶段（承载分数预筛）→ 第二阶段（单头方向筛选）→ 持续注入调控 / 读出</w:t>
             </w:r>
           </w:p>
         </w:tc>
@@ -2365,7 +2698,7 @@
               <w:rPr>
                 <w:b w:val="0"/>
               </w:rPr>
-              <w:t>锚点对照样本的结构示意：前缀、属性段、逐字相同的锚点段</w:t>
+              <w:t>锚点对照样本结构：前缀、属性段、逐字相同的锚点段、两段参照续写</w:t>
             </w:r>
           </w:p>
         </w:tc>
@@ -2393,7 +2726,7 @@
               <w:rPr>
                 <w:b w:val="0"/>
               </w:rPr>
-              <w:t>承载分数的方差分解示意：总方差、内容方差、组内属性方差</w:t>
+              <w:t>承载分数的方差分解示意</w:t>
             </w:r>
           </w:p>
         </w:tc>
@@ -2421,7 +2754,7 @@
               <w:rPr>
                 <w:b w:val="0"/>
               </w:rPr>
-              <w:t>Qwen3-4B 全部注意力头的承载分数热力图（横轴层、纵轴头），并圈出因果承载头</w:t>
+              <w:t>单头方向筛选示意：统一推力注入、两段参照续写的对数概率差</w:t>
             </w:r>
           </w:p>
         </w:tc>
@@ -2449,7 +2782,7 @@
               <w:rPr>
                 <w:b w:val="0"/>
               </w:rPr>
-              <w:t>三个模型锚点位置属性可读性随相对深度变化的曲线</w:t>
+              <w:t>Qwen3-8B 单头效果与承载分数排名的散点图，标出正向头和反向头</w:t>
             </w:r>
           </w:p>
         </w:tc>
@@ -2477,7 +2810,7 @@
               <w:rPr>
                 <w:b w:val="0"/>
               </w:rPr>
-              <w:t>持续注入示意：注入位置覆盖锚点及之后每个生成步</w:t>
+              <w:t>Qwen3-14B 测试集各条件的愤怒均值柱状图（本方法、仅第一阶段、仅第二阶段、随机头、随机方向、不干预、愤怒开头）</w:t>
             </w:r>
           </w:p>
         </w:tc>
@@ -2505,7 +2838,35 @@
               <w:rPr>
                 <w:b w:val="0"/>
               </w:rPr>
-              <w:t>装置结构框图：样本构造模块、特征采集模块、承载评分模块、调控模块、读出模块</w:t>
+              <w:t>持续注入示意：注入位置覆盖锚点及之后每个生成步</w:t>
+            </w:r>
+          </w:p>
+        </w:tc>
+      </w:tr>
+      <w:tr>
+        <w:tc>
+          <w:tcPr>
+            <w:tcW w:type="dxa" w:w="4320"/>
+          </w:tcPr>
+          <w:p>
+            <w:r>
+              <w:rPr>
+                <w:b w:val="0"/>
+              </w:rPr>
+              <w:t>图 8</w:t>
+            </w:r>
+          </w:p>
+        </w:tc>
+        <w:tc>
+          <w:tcPr>
+            <w:tcW w:type="dxa" w:w="4320"/>
+          </w:tcPr>
+          <w:p>
+            <w:r>
+              <w:rPr>
+                <w:b w:val="0"/>
+              </w:rPr>
+              <w:t>装置结构框图</w:t>
             </w:r>
           </w:p>
         </w:tc>
@@ -2513,14 +2874,6 @@
     </w:tbl>
     <w:p/>
     <w:p>
-      <w:r>
-        <w:rPr>
-          <w:b w:val="0"/>
-        </w:rPr>
-        <w:t>图 4 和图 5 的数据与示意图已在研究报告中生成，可提供给代理人重绘为黑白线条图。</w:t>
-      </w:r>
-    </w:p>
-    <w:p>
       <w:pPr>
         <w:pStyle w:val="Heading1"/>
       </w:pPr>
@@ -2539,18 +2892,24 @@
         <w:rPr>
           <w:b w:val="0"/>
         </w:rPr>
-        <w:t>（独立方法权利要求）一种大语言模型中属性承载注意力头的定位方法，其特征在于，包括：</w:t>
+        <w:t>（独立方法权利要求）一种大语言模型中用于属性调控的注意力头选择方法，其特征在于，包括：</w:t>
       </w:r>
     </w:p>
     <w:p>
       <w:pPr>
         <w:pStyle w:val="ListBullet"/>
       </w:pPr>
+      <w:r>
+        <w:rPr>
+          <w:b/>
+        </w:rPr>
+        <w:t>构造锚点对照输入</w:t>
+      </w:r>
       <w:r>
         <w:rPr>
           <w:b w:val="0"/>
         </w:rPr>
-        <w:t>获取多个内容组。对每个内容组构造多个属性变体输入，每个属性变体输入依次包含：</w:t>
+        <w:t>：获取多个内容组；对每个内容组构造多个属性变体输入，每个属性变体输入依次包含：</w:t>
       </w:r>
     </w:p>
     <w:p>
@@ -2581,20 +2940,15 @@
       </w:pPr>
       <w:r>
         <w:rPr>
-          <w:b w:val="0"/>
+          <w:b/>
         </w:rPr>
-        <w:t>将各属性变体输入送入大语言模型做前向计算，获取各注意力头在所述锚点段对应 token 位置上的输出，并聚合为每个输入、每个注意力头的锚点特征向量。</w:t>
-      </w:r>
-    </w:p>
-    <w:p>
-      <w:pPr>
-        <w:pStyle w:val="ListBullet"/>
-      </w:pPr>
+        <w:t>第一阶段，预筛</w:t>
+      </w:r>
       <w:r>
         <w:rPr>
           <w:b w:val="0"/>
         </w:rPr>
-        <w:t>对每个注意力头，基于所述锚点特征向量计算承载分数。所述承载分数表征：在扣除内容组之间的差异后，属性变体之间的差异所解释的变化比例。</w:t>
+        <w:t>：</w:t>
       </w:r>
     </w:p>
     <w:p>
@@ -2605,7 +2959,46 @@
         <w:rPr>
           <w:b w:val="0"/>
         </w:rPr>
-        <w:t>根据所述承载分数，从所述注意力头中选出属性承载注意力头。</w:t>
+        <w:t>将所述属性变体输入送入大语言模型做前向计算，获取各注意力头在锚点段 token 位置上的输出，聚合为锚点特征向量；</w:t>
+      </w:r>
+    </w:p>
+    <w:p>
+      <w:pPr>
+        <w:pStyle w:val="ListBullet"/>
+      </w:pPr>
+      <w:r>
+        <w:rPr>
+          <w:b w:val="0"/>
+        </w:rPr>
+        <w:t>对每个注意力头计算承载分数，所述承载分数表征扣除内容组之间差异后，属性变体之间差异所解释的变化比例；</w:t>
+      </w:r>
+    </w:p>
+    <w:p>
+      <w:pPr>
+        <w:pStyle w:val="ListBullet"/>
+      </w:pPr>
+      <w:r>
+        <w:rPr>
+          <w:b w:val="0"/>
+        </w:rPr>
+        <w:t>按承载分数选出候选注意力头集合。</w:t>
+      </w:r>
+    </w:p>
+    <w:p>
+      <w:pPr>
+        <w:pStyle w:val="ListBullet"/>
+      </w:pPr>
+      <w:r>
+        <w:rPr>
+          <w:b/>
+        </w:rPr>
+        <w:t>第二阶段，方向筛选</w:t>
+      </w:r>
+      <w:r>
+        <w:rPr>
+          <w:b w:val="0"/>
+        </w:rPr>
+        <w:t>：对候选集合中的每个注意力头，单独地在该头的输出上加入以该头锚点特征的目标属性均值与参照属性均值之差确定的导向向量，测量该加入对模型生成目标属性文本相对于参照属性文本的倾向的影响；从候选集合中选出所述影响为正、且满足显著性条件的注意力头，作为调控注意力头。</w:t>
       </w:r>
     </w:p>
     <w:p>
@@ -2619,40 +3012,7 @@
         <w:rPr>
           <w:b w:val="0"/>
         </w:rPr>
-        <w:t xml:space="preserve"> 根据权利要求 1 的方法，其特征在于，所述承载分数为 SS_attr / (SS_tot − SS_scn)。其中：</w:t>
-      </w:r>
-    </w:p>
-    <w:p>
-      <w:pPr>
-        <w:pStyle w:val="ListBullet"/>
-      </w:pPr>
-      <w:r>
-        <w:rPr>
-          <w:b w:val="0"/>
-        </w:rPr>
-        <w:t>SS_tot 为锚点特征向量相对总均值的平方和；</w:t>
-      </w:r>
-    </w:p>
-    <w:p>
-      <w:pPr>
-        <w:pStyle w:val="ListBullet"/>
-      </w:pPr>
-      <w:r>
-        <w:rPr>
-          <w:b w:val="0"/>
-        </w:rPr>
-        <w:t>SS_scn 为内容组均值相对总均值的平方和；</w:t>
-      </w:r>
-    </w:p>
-    <w:p>
-      <w:pPr>
-        <w:pStyle w:val="ListBullet"/>
-      </w:pPr>
-      <w:r>
-        <w:rPr>
-          <w:b w:val="0"/>
-        </w:rPr>
-        <w:t>SS_attr 为各属性在组内残差上的均值的平方和。</w:t>
+        <w:t xml:space="preserve"> 根据权利要求 1 的方法，其特征在于，所述承载分数为 SS_attr / (SS_tot − SS_scn)。</w:t>
       </w:r>
     </w:p>
     <w:p>
@@ -2677,7 +3037,7 @@
         <w:rPr>
           <w:b w:val="0"/>
         </w:rPr>
-        <w:t>所述注意力头的输出，为该层注意力输出投影矩阵的输入中对应该注意力头的分量，或者为该注意力头经输出投影后对残差流的贡献；</w:t>
+        <w:t>所述影响通过教师强制方式测量，即注入后目标属性参照续写与参照属性参照续写的平均对数概率之差，相对于不注入时的变化量；</w:t>
       </w:r>
     </w:p>
     <w:p>
@@ -2688,7 +3048,7 @@
         <w:rPr>
           <w:b w:val="0"/>
         </w:rPr>
-        <w:t>所述聚合为在锚点段各 token 位置上取平均。</w:t>
+        <w:t>所述显著性条件为该变化量在多个输入上的均值大于其标准误的预设倍数。</w:t>
       </w:r>
     </w:p>
     <w:p>
@@ -2702,29 +3062,7 @@
         <w:rPr>
           <w:b w:val="0"/>
         </w:rPr>
-        <w:t xml:space="preserve"> 根据权利要求 1 的方法，其特征在于，还包括：</w:t>
-      </w:r>
-    </w:p>
-    <w:p>
-      <w:pPr>
-        <w:pStyle w:val="ListBullet"/>
-      </w:pPr>
-      <w:r>
-        <w:rPr>
-          <w:b w:val="0"/>
-        </w:rPr>
-        <w:t>获取各层残差流在锚点段位置上的特征，确定属性可读性的峰值层；</w:t>
-      </w:r>
-    </w:p>
-    <w:p>
-      <w:pPr>
-        <w:pStyle w:val="ListBullet"/>
-      </w:pPr>
-      <w:r>
-        <w:rPr>
-          <w:b w:val="0"/>
-        </w:rPr>
-        <w:t>将属性承载注意力头的选取范围限制在包含所述峰值层的层窗口内。</w:t>
+        <w:t xml:space="preserve"> 根据权利要求 1 的方法，其特征在于，在测量所述影响时，将各候选注意力头的导向向量缩放到相同的残差流改变幅度。</w:t>
       </w:r>
     </w:p>
     <w:p>
@@ -2738,7 +3076,7 @@
         <w:rPr>
           <w:b w:val="0"/>
         </w:rPr>
-        <w:t xml:space="preserve"> 根据权利要求 1 的方法，其特征在于，还包括：以按内容组分组的交叉验证分类可读性作为第二指标，与所述承载分数组合后用于选取。</w:t>
+        <w:t xml:space="preserve"> 根据权利要求 1 的方法，其特征在于，所述候选注意力头集合为承载分数排名前 N 的注意力头，所述调控注意力头为影响排名前 M 的注意力头，其中 M &lt; N。</w:t>
       </w:r>
     </w:p>
     <w:p>
@@ -2752,18 +3090,21 @@
         <w:rPr>
           <w:b w:val="0"/>
         </w:rPr>
-        <w:t>（调控）一种大语言模型生成属性的调控方法，其特征在于：</w:t>
+        <w:t xml:space="preserve"> 根据权利要求 1 的方法，其特征在于，当满足条件的调控注意力头数量低于预设下限时，输出该属性不适于调控的判定。</w:t>
       </w:r>
     </w:p>
     <w:p>
-      <w:pPr>
-        <w:pStyle w:val="ListBullet"/>
-      </w:pPr>
+      <w:r>
+        <w:rPr>
+          <w:b/>
+        </w:rPr>
+        <w:t>7.</w:t>
+      </w:r>
       <w:r>
         <w:rPr>
           <w:b w:val="0"/>
         </w:rPr>
-        <w:t>采用权利要求 1–5 任一项的方法选出属性承载注意力头；</w:t>
+        <w:t>（调控）一种大语言模型生成属性的调控方法，其特征在于：</w:t>
       </w:r>
     </w:p>
     <w:p>
@@ -2774,7 +3115,7 @@
         <w:rPr>
           <w:b w:val="0"/>
         </w:rPr>
-        <w:t>对每个所选注意力头，以目标属性与参照属性在锚点位置上的特征均值差作为导向向量；</w:t>
+        <w:t>采用权利要求 1–6 任一项的方法选出调控注意力头；</w:t>
       </w:r>
     </w:p>
     <w:p>
@@ -2785,7 +3126,7 @@
         <w:rPr>
           <w:b w:val="0"/>
         </w:rPr>
-        <w:t>在生成过程中，在该注意力头的输出上，于提示末尾位置</w:t>
+        <w:t>在生成过程中，在每个调控注意力头的输出上，于提示末尾位置</w:t>
       </w:r>
       <w:r>
         <w:rPr>
@@ -2797,21 +3138,7 @@
         <w:rPr>
           <w:b w:val="0"/>
         </w:rPr>
-        <w:t>持续加入缩放后的所述导向向量。</w:t>
-      </w:r>
-    </w:p>
-    <w:p>
-      <w:r>
-        <w:rPr>
-          <w:b/>
-        </w:rPr>
-        <w:t>7.</w:t>
-      </w:r>
-      <w:r>
-        <w:rPr>
-          <w:b w:val="0"/>
-        </w:rPr>
-        <w:t xml:space="preserve"> 根据权利要求 6 的方法，其特征在于，所述导向向量仅在前 M 个生成步内加入，或者其缩放系数随生成步数衰减。</w:t>
+        <w:t>持续加入缩放后的导向向量。</w:t>
       </w:r>
     </w:p>
     <w:p>
@@ -2825,40 +3152,7 @@
         <w:rPr>
           <w:b w:val="0"/>
         </w:rPr>
-        <w:t>（读出）一种大语言模型属性状态的读出方法，其特征在于：</w:t>
-      </w:r>
-    </w:p>
-    <w:p>
-      <w:pPr>
-        <w:pStyle w:val="ListBullet"/>
-      </w:pPr>
-      <w:r>
-        <w:rPr>
-          <w:b w:val="0"/>
-        </w:rPr>
-        <w:t>采用权利要求 1–5 任一项的方法确定属性承载注意力头或层窗口；</w:t>
-      </w:r>
-    </w:p>
-    <w:p>
-      <w:pPr>
-        <w:pStyle w:val="ListBullet"/>
-      </w:pPr>
-      <w:r>
-        <w:rPr>
-          <w:b w:val="0"/>
-        </w:rPr>
-        <w:t>在生成之前或生成过程中，读取所述注意力头或层窗口的激活，得到属性读数；</w:t>
-      </w:r>
-    </w:p>
-    <w:p>
-      <w:pPr>
-        <w:pStyle w:val="ListBullet"/>
-      </w:pPr>
-      <w:r>
-        <w:rPr>
-          <w:b w:val="0"/>
-        </w:rPr>
-        <w:t>所述读数用于驱动虚拟形象或机器人表情、触发预警，或反馈调整权利要求 6 中的缩放系数。</w:t>
+        <w:t xml:space="preserve"> 根据权利要求 7 的方法，其特征在于，所述导向向量仅在前 T 个生成步内加入，或其缩放系数随生成步数衰减。</w:t>
       </w:r>
     </w:p>
     <w:p>
@@ -2872,7 +3166,40 @@
         <w:rPr>
           <w:b w:val="0"/>
         </w:rPr>
-        <w:t xml:space="preserve"> 根据权利要求 1 的方法，其特征在于，所述属性为情绪、语气、礼貌程度、态度、人设口吻和攻击性中的至少一种。</w:t>
+        <w:t>（读出）一种大语言模型属性状态的读出方法，其特征在于：</w:t>
+      </w:r>
+    </w:p>
+    <w:p>
+      <w:pPr>
+        <w:pStyle w:val="ListBullet"/>
+      </w:pPr>
+      <w:r>
+        <w:rPr>
+          <w:b w:val="0"/>
+        </w:rPr>
+        <w:t>采用权利要求 1–6 任一项的方法确定调控注意力头或其所在层；</w:t>
+      </w:r>
+    </w:p>
+    <w:p>
+      <w:pPr>
+        <w:pStyle w:val="ListBullet"/>
+      </w:pPr>
+      <w:r>
+        <w:rPr>
+          <w:b w:val="0"/>
+        </w:rPr>
+        <w:t>在生成之前或生成过程中读取其激活，得到属性读数；</w:t>
+      </w:r>
+    </w:p>
+    <w:p>
+      <w:pPr>
+        <w:pStyle w:val="ListBullet"/>
+      </w:pPr>
+      <w:r>
+        <w:rPr>
+          <w:b w:val="0"/>
+        </w:rPr>
+        <w:t>所述读数用于驱动虚拟形象或机器人表情、触发预警，或反馈调整权利要求 7 中的缩放系数。</w:t>
       </w:r>
     </w:p>
     <w:p>
@@ -2886,7 +3213,7 @@
         <w:rPr>
           <w:b w:val="0"/>
         </w:rPr>
-        <w:t xml:space="preserve"> 根据权利要求 1 的方法，其特征在于，对第二个大语言模型使用同一组锚点对照输入，重复所述获取、计算和选取步骤，以确定第二个大语言模型的属性承载注意力头。</w:t>
+        <w:t xml:space="preserve"> 根据权利要求 1 的方法，其特征在于，所述属性为情绪、语气、礼貌程度、态度、人设口吻和攻击性中的至少一种。</w:t>
       </w:r>
     </w:p>
     <w:p>
@@ -2894,21 +3221,96 @@
         <w:rPr>
           <w:b/>
         </w:rPr>
-        <w:t>11–13.</w:t>
+        <w:t>11.</w:t>
       </w:r>
       <w:r>
         <w:rPr>
           <w:b w:val="0"/>
         </w:rPr>
-        <w:t>（装置、电子设备、计算机可读存储介质）与权利要求 1、6、8 对应的装置、设备和介质权利要求，由代理人按惯例撰写。</w:t>
+        <w:t>（从属，证据为探索性）根据权利要求 1 的方法，其特征在于：</w:t>
       </w:r>
     </w:p>
     <w:p>
       <w:pPr>
+        <w:pStyle w:val="ListBullet"/>
+      </w:pPr>
+      <w:r>
+        <w:rPr>
+          <w:b w:val="0"/>
+        </w:rPr>
+        <w:t>对与第一大语言模型结构相同（层数与每层头数相同）的第二大语言模型，以第一大语言模型选出的调控注意力头的层号和头号，确定第二大语言模型的调控注意力头；</w:t>
+      </w:r>
+    </w:p>
+    <w:p>
+      <w:pPr>
+        <w:pStyle w:val="ListBullet"/>
+      </w:pPr>
+      <w:r>
+        <w:rPr>
+          <w:b w:val="0"/>
+        </w:rPr>
+        <w:t>并使用第二大语言模型自身的锚点特征计算导向向量。</w:t>
+      </w:r>
+    </w:p>
+    <w:p>
+      <w:r>
+        <w:rPr>
+          <w:b/>
+        </w:rPr>
+        <w:t>12–14.</w:t>
+      </w:r>
+      <w:r>
+        <w:rPr>
+          <w:b w:val="0"/>
+        </w:rPr>
+        <w:t>（装置、电子设备、计算机可读存储介质）与权利要求 1、7、9 对应，由代理人按惯例撰写。</w:t>
+      </w:r>
+    </w:p>
+    <w:p>
+      <w:pPr>
         <w:pStyle w:val="Heading1"/>
       </w:pPr>
       <w:r>
         <w:t>八、关键保护点（区别于现有技术）</w:t>
+      </w:r>
+    </w:p>
+    <w:p>
+      <w:pPr>
+        <w:pStyle w:val="ListNumber"/>
+      </w:pPr>
+      <w:r>
+        <w:rPr>
+          <w:b/>
+        </w:rPr>
+        <w:t>两阶段选择</w:t>
+      </w:r>
+      <w:r>
+        <w:rPr>
+          <w:b w:val="0"/>
+        </w:rPr>
+        <w:t>：先用不干预的锚点承载分数预筛，再对少量候选头做方向筛选。</w:t>
+      </w:r>
+    </w:p>
+    <w:p>
+      <w:pPr>
+        <w:pStyle w:val="ListBullet2"/>
+      </w:pPr>
+      <w:r>
+        <w:rPr>
+          <w:b w:val="0"/>
+        </w:rPr>
+        <w:t>ITI 只按可读性选头，Wang 等人 2025 对全部头逐个消融，都不具备“可读性预筛 + 方向筛选”的组合。</w:t>
+      </w:r>
+    </w:p>
+    <w:p>
+      <w:pPr>
+        <w:pStyle w:val="ListBullet2"/>
+      </w:pPr>
+      <w:r>
+        <w:rPr>
+          <w:b w:val="0"/>
+        </w:rPr>
+        <w:t>研发方的对比实验表明，两个阶段缺一不可（4.2）。</w:t>
       </w:r>
     </w:p>
     <w:p>
@@ -2925,19 +3327,7 @@
         <w:rPr>
           <w:b w:val="0"/>
         </w:rPr>
-        <w:t>：属性段之后接一个在同一内容组内逐 token 相同的锚点段，</w:t>
-      </w:r>
-      <w:r>
-        <w:rPr>
-          <w:b/>
-        </w:rPr>
-        <w:t>只在锚点位置</w:t>
-      </w:r>
-      <w:r>
-        <w:rPr>
-          <w:b w:val="0"/>
-        </w:rPr>
-        <w:t>读取头输出。这样分离出的是属性的</w:t>
+        <w:t>：只在逐 token 相同的锚点位置读取头输出，分离出属性的</w:t>
       </w:r>
       <w:r>
         <w:rPr>
@@ -2949,7 +3339,7 @@
         <w:rPr>
           <w:b w:val="0"/>
         </w:rPr>
-        <w:t>，而不是字面读取。ITI 和 Wang 等人 2025 的方法都不具备这一点。</w:t>
+        <w:t>，而不是字面读取。</w:t>
       </w:r>
     </w:p>
     <w:p>
@@ -2960,25 +3350,13 @@
         <w:rPr>
           <w:b/>
         </w:rPr>
-        <w:t>组内属性方差占比</w:t>
+        <w:t>方向筛选的具体形式</w:t>
       </w:r>
       <w:r>
         <w:rPr>
           <w:b w:val="0"/>
         </w:rPr>
-        <w:t>：作为承载分数，是闭式计算，</w:t>
-      </w:r>
-      <w:r>
-        <w:rPr>
-          <w:b/>
-        </w:rPr>
-        <w:t>不训练逐头探针、不做逐头干预</w:t>
-      </w:r>
-      <w:r>
-        <w:rPr>
-          <w:b w:val="0"/>
-        </w:rPr>
-        <w:t>，计算量与头数无关，并且在扣除内容方差后计算。</w:t>
+        <w:t>：统一推力、教师强制、两段参照续写的对数概率差、显著性阈值。整个过程不需要生成文本，成本低。</w:t>
       </w:r>
     </w:p>
     <w:p>
@@ -2995,32 +3373,32 @@
         <w:rPr>
           <w:b w:val="0"/>
         </w:rPr>
-        <w:t>：在承载头上于提示末尾及每个生成步持续注入。实验中，只在锚点位置做一次性干预几乎无效（+0.04），持续注入则显著有效（+1.19）。</w:t>
+        <w:t>：在提示末尾以及每个生成步注入。研发方的早期实验显示，只在锚点位置做一次性干预几乎无效（+0.04），持续注入有效。</w:t>
       </w:r>
     </w:p>
     <w:p>
       <w:pPr>
-        <w:pStyle w:val="ListNumber"/>
+        <w:pStyle w:val="Heading1"/>
+      </w:pPr>
+      <w:r>
+        <w:t>九、可替代方案（建议写入说明书以扩大保护范围）</w:t>
+      </w:r>
+    </w:p>
+    <w:p>
+      <w:pPr>
+        <w:pStyle w:val="ListBullet"/>
       </w:pPr>
       <w:r>
         <w:rPr>
           <w:b/>
         </w:rPr>
-        <w:t>跨模型迁移与层窗口</w:t>
+        <w:t>第一阶段的分数</w:t>
       </w:r>
       <w:r>
         <w:rPr>
           <w:b w:val="0"/>
         </w:rPr>
-        <w:t>：同一组锚点样本可直接用于新模型；可读性峰值所在层窗口在多个模型中位于相对深度约 0.43–0.56。</w:t>
-      </w:r>
-    </w:p>
-    <w:p>
-      <w:pPr>
-        <w:pStyle w:val="Heading1"/>
-      </w:pPr>
-      <w:r>
-        <w:t>九、可替代方案（建议写入说明书以扩大保护范围）</w:t>
+        <w:t>：可以换成组内 F 统计量、Fisher 判别比、组内可读性 AUROC、互信息、线性探针准确度等，只要是在锚点位置扣除内容差异后衡量属性差异的指标。</w:t>
       </w:r>
     </w:p>
     <w:p>
@@ -3031,30 +3409,65 @@
         <w:rPr>
           <w:b/>
         </w:rPr>
-        <w:t>锚点</w:t>
+        <w:t>第二阶段的影响测量</w:t>
       </w:r>
       <w:r>
         <w:rPr>
           <w:b w:val="0"/>
         </w:rPr>
-        <w:t>：可以是事实摘要、固定提示语、固定问题，或者任何在组内相同的 token 序列；可以只取锚点的一部分 token，或对锚点 token 加权平均。</w:t>
+        <w:t>：可以换成：</w:t>
       </w:r>
     </w:p>
     <w:p>
       <w:pPr>
         <w:pStyle w:val="ListBullet"/>
       </w:pPr>
-      <w:r>
-        <w:rPr>
-          <w:b/>
-        </w:rPr>
-        <w:t>承载分数</w:t>
-      </w:r>
       <w:r>
         <w:rPr>
           <w:b w:val="0"/>
         </w:rPr>
-        <w:t>：可以替换为组内属性的 F 统计量、组内线性判别比（Fisher 比）、组内可读性 AUROC 或互信息等。凡是“扣除内容组差异之后衡量属性差异”的统计量，都在保护范围内。</w:t>
+        <w:t>对少量生成文本用属性分类器打分；</w:t>
+      </w:r>
+    </w:p>
+    <w:p>
+      <w:pPr>
+        <w:pStyle w:val="ListBullet"/>
+      </w:pPr>
+      <w:r>
+        <w:rPr>
+          <w:b w:val="0"/>
+        </w:rPr>
+        <w:t>读取模型后层的属性探针读数；</w:t>
+      </w:r>
+    </w:p>
+    <w:p>
+      <w:pPr>
+        <w:pStyle w:val="ListBullet"/>
+      </w:pPr>
+      <w:r>
+        <w:rPr>
+          <w:b w:val="0"/>
+        </w:rPr>
+        <w:t>只用目标属性续写的对数概率；</w:t>
+      </w:r>
+    </w:p>
+    <w:p>
+      <w:pPr>
+        <w:pStyle w:val="ListBullet"/>
+      </w:pPr>
+      <w:r>
+        <w:rPr>
+          <w:b w:val="0"/>
+        </w:rPr>
+        <w:t>多 token 自由生成后的属性评分。</w:t>
+      </w:r>
+    </w:p>
+    <w:p>
+      <w:r>
+        <w:rPr>
+          <w:b w:val="0"/>
+        </w:rPr>
+        <w:t>显著性条件可以换成置信区间、置换检验或固定阈值。</w:t>
       </w:r>
     </w:p>
     <w:p>
@@ -3071,7 +3484,7 @@
         <w:rPr>
           <w:b w:val="0"/>
         </w:rPr>
-        <w:t>：除注意力头外，同一方法也适用于 MLP 神经元、稀疏自编码器特征、注意力输出整体或残差流方向。</w:t>
+        <w:t>：除注意力头外，同一两阶段方法也适用于 MLP 神经元、稀疏自编码器特征、注意力输出整体或残差方向。</w:t>
       </w:r>
     </w:p>
     <w:p>
@@ -3082,13 +3495,13 @@
         <w:rPr>
           <w:b/>
         </w:rPr>
-        <w:t>属性取值</w:t>
+        <w:t>组合方式</w:t>
       </w:r>
       <w:r>
         <w:rPr>
           <w:b w:val="0"/>
         </w:rPr>
-        <w:t>：可以是离散类别，也可以是连续值，连续值时用组内回归的 R² 代替方差占比。</w:t>
+        <w:t>：方向筛选后，可以再在所选头上做小规模的组合优化，例如贪心增减头、为各头分配不同 λ。</w:t>
       </w:r>
     </w:p>
     <w:p>
@@ -3105,7 +3518,7 @@
         <w:rPr>
           <w:b w:val="0"/>
         </w:rPr>
-        <w:t>：可以是加法注入、投影消除、乘性缩放，或替换为供体激活。</w:t>
+        <w:t>：加法注入、投影消除、乘性缩放，或替换为供体激活。</w:t>
       </w:r>
     </w:p>
     <w:p>
@@ -3122,7 +3535,7 @@
         <w:rPr>
           <w:b w:val="0"/>
         </w:rPr>
-        <w:t>：仅解码器的 Transformer、编码器-解码器、多模态模型的语言部分、分组查询注意力（GQA）、多查询注意力（MQA）结构都适用。</w:t>
+        <w:t>：仅解码器 Transformer、编码器-解码器、多模态模型的语言部分、分组查询注意力（GQA）、多查询注意力（MQA）等结构都适用。</w:t>
       </w:r>
     </w:p>
     <w:p>
@@ -3155,7 +3568,7 @@
         <w:rPr>
           <w:b w:val="0"/>
         </w:rPr>
-        <w:t>本发明的锚点定位方法、承载分数和持续注入方案，均未在任何论文、预印本或公开网站上披露。</w:t>
+        <w:t>两阶段选择方法、锚点承载分数、方向筛选和持续注入，均未在任何论文、预印本或公开网站上披露。</w:t>
       </w:r>
     </w:p>
     <w:p>
@@ -3166,18 +3579,7 @@
         <w:rPr>
           <w:b w:val="0"/>
         </w:rPr>
-        <w:t>相关代码和实验报告仅存于私有代码仓库。</w:t>
-      </w:r>
-    </w:p>
-    <w:p>
-      <w:pPr>
-        <w:pStyle w:val="ListBullet"/>
-      </w:pPr>
-      <w:r>
-        <w:rPr>
-          <w:b w:val="0"/>
-        </w:rPr>
-        <w:t>研究结果图表页面为私有链接。</w:t>
+        <w:t>相关代码和实验报告仅存于私有代码仓库，研究图表页面为私有链接。</w:t>
       </w:r>
     </w:p>
     <w:p>
@@ -3202,7 +3604,7 @@
         <w:rPr>
           <w:b w:val="0"/>
         </w:rPr>
-        <w:t>基于残差流线性探针、在特定层（第 16、19、22 层）实时监测回复敌意和事实错误的做法；</w:t>
+        <w:t>基于残差流线性探针在特定层（第 16、19、22 层）实时监测回复敌意和事实错误的做法；</w:t>
       </w:r>
     </w:p>
     <w:p>
@@ -3232,7 +3634,7 @@
         <w:rPr>
           <w:b w:val="0"/>
         </w:rPr>
-        <w:t>这些内容与本发明的“锚点承载分数定位”和“持续注入调控”不同。但权利要求 8（读出用途）中，与“回复前读出”重叠的部分，请代理人评估这次公开的影响，以及是否需要调整权利要求 8 的写法。</w:t>
+        <w:t>这些内容与本发明的选择和调控方法不同。但请评估其对权利要求 9（读出用途）的影响。</w:t>
       </w:r>
     </w:p>
     <w:p>
@@ -3304,7 +3706,7 @@
               <w:rPr>
                 <w:b w:val="0"/>
               </w:rPr>
-              <w:t>2026-09-28/EXPERIMENT_REPORT.md（因果定位与持续导向，含预注册与封存测试）</w:t>
+              <w:t>2026-09-28/EXPERIMENT_REPORT.md（4B 因果定位与持续导向，含封存测试）</w:t>
             </w:r>
           </w:p>
         </w:tc>
@@ -3319,7 +3721,7 @@
               <w:rPr>
                 <w:b w:val="0"/>
               </w:rPr>
-              <w:t>E02 研究计划、检验条件、报告</w:t>
+              <w:t>E02 研究报告</w:t>
             </w:r>
           </w:p>
         </w:tc>
@@ -3332,7 +3734,7 @@
               <w:rPr>
                 <w:b w:val="0"/>
               </w:rPr>
-              <w:t>2026-10-06/PLAN.md、CLAIMS.md、REPORT.md</w:t>
+              <w:t>2026-10-06/REPORT.md（3 个模型上承载分数的规律）</w:t>
             </w:r>
           </w:p>
         </w:tc>
@@ -3347,7 +3749,7 @@
               <w:rPr>
                 <w:b w:val="0"/>
               </w:rPr>
-              <w:t>E02 留出集检验结果</w:t>
+              <w:t>E03 实验报告</w:t>
             </w:r>
           </w:p>
         </w:tc>
@@ -3360,7 +3762,63 @@
               <w:rPr>
                 <w:b w:val="0"/>
               </w:rPr>
-              <w:t>2026-10-06/out/checks_holdout.txt</w:t>
+              <w:t>2026-10-07/REPORT_E03.md（8B 只用第一阶段的阴性结果 + 单头筛选的探索性分析）</w:t>
+            </w:r>
+          </w:p>
+        </w:tc>
+      </w:tr>
+      <w:tr>
+        <w:tc>
+          <w:tcPr>
+            <w:tcW w:type="dxa" w:w="4320"/>
+          </w:tcPr>
+          <w:p>
+            <w:r>
+              <w:rPr>
+                <w:b/>
+              </w:rPr>
+              <w:t>E04 实验报告</w:t>
+            </w:r>
+          </w:p>
+        </w:tc>
+        <w:tc>
+          <w:tcPr>
+            <w:tcW w:type="dxa" w:w="4320"/>
+          </w:tcPr>
+          <w:p>
+            <w:r>
+              <w:rPr>
+                <w:b w:val="0"/>
+              </w:rPr>
+              <w:t>2026-10-07/e04/REPORT_E04.md（14B 两阶段确认性实验，全部门槛通过）</w:t>
+            </w:r>
+          </w:p>
+        </w:tc>
+      </w:tr>
+      <w:tr>
+        <w:tc>
+          <w:tcPr>
+            <w:tcW w:type="dxa" w:w="4320"/>
+          </w:tcPr>
+          <w:p>
+            <w:r>
+              <w:rPr>
+                <w:b w:val="0"/>
+              </w:rPr>
+              <w:t>预先登记文件</w:t>
+            </w:r>
+          </w:p>
+        </w:tc>
+        <w:tc>
+          <w:tcPr>
+            <w:tcW w:type="dxa" w:w="4320"/>
+          </w:tcPr>
+          <w:p>
+            <w:r>
+              <w:rPr>
+                <w:b w:val="0"/>
+              </w:rPr>
+              <w:t>2026-10-07/PREREG_E03.md、2026-10-07/e04/PREREG_E04.md</w:t>
             </w:r>
           </w:p>
         </w:tc>
@@ -3388,35 +3846,7 @@
               <w:rPr>
                 <w:b w:val="0"/>
               </w:rPr>
-              <w:t>2026-10-06/feats.py（锚点头输出采集）、2026-10-06/analyze.py（承载分数）、2026-09-28/stageD/steer_causal.py（持续注入）</w:t>
-            </w:r>
-          </w:p>
-        </w:tc>
-      </w:tr>
-      <w:tr>
-        <w:tc>
-          <w:tcPr>
-            <w:tcW w:type="dxa" w:w="4320"/>
-          </w:tcPr>
-          <w:p>
-            <w:r>
-              <w:rPr>
-                <w:b w:val="0"/>
-              </w:rPr>
-              <w:t>研究图表页面</w:t>
-            </w:r>
-          </w:p>
-        </w:tc>
-        <w:tc>
-          <w:tcPr>
-            <w:tcW w:type="dxa" w:w="4320"/>
-          </w:tcPr>
-          <w:p>
-            <w:r>
-              <w:rPr>
-                <w:b w:val="0"/>
-              </w:rPr>
-              <w:t>私有链接，可导出截图</w:t>
+              <w:t>2026-10-06/feats.py（锚点头输出）、2026-10-07/map_select.py（承载分数）、2026-10-07/e04/screen.py（方向筛选）、2026-10-07/e04/steer14b.py（持续注入）</w:t>
             </w:r>
           </w:p>
         </w:tc>

</xml_diff>

<commit_message>
patent disclosure: section 4.5 and claim 11 updated with E05 confirmatory transfer result
Co-Authored-By: Claude Opus 5.5 <noreply@anthropic.com>
</commit_message>
<xml_diff>
--- a/patent/交底书-基于内容不变锚点的属性承载注意力头定位与调控.docx
+++ b/patent/交底书-基于内容不变锚点的属性承载注意力头定位与调控.docx
@@ -90,6 +90,15 @@
           <w:i/>
         </w:rPr>
         <w:t>- 补充了 14B 模型的确认性实验，全部预设门槛通过。</w:t>
+      </w:r>
+    </w:p>
+    <w:p>
+      <w:r>
+        <w:rPr>
+          <w:b w:val="0"/>
+          <w:i/>
+        </w:rPr>
+        <w:t>- 补充了“同家族按编号迁移”的确认性实验（4B → 8B）：迁移不劣于原生选择，部分门槛通过（见 4.5）。</w:t>
       </w:r>
     </w:p>
     <w:tbl>
@@ -2378,23 +2387,62 @@
         <w:pStyle w:val="Heading2"/>
       </w:pPr>
       <w:r>
-        <w:t>4.5 （探索性，尚未确认）同一模型家族内按头编号迁移</w:t>
+        <w:t>4.5 同一模型家族内按头编号迁移（确认性实验，部分通过）</w:t>
       </w:r>
     </w:p>
     <w:p>
+      <w:r>
+        <w:rPr>
+          <w:b/>
+        </w:rPr>
+        <w:t>做法</w:t>
+      </w:r>
       <w:r>
         <w:rPr>
           <w:b w:val="0"/>
         </w:rPr>
-        <w:t>研发方在 Qwen3-4B 上用因果修补确定了 12 个头。在同为 36 层 × 32 头的 Qwen3-8B 上，按相同的“层号 + 头号”直接注入 8B 自己的导向向量，教师强制指标上的效果为 +1.15 ± 0.09，是所有测试配置中最强的。</w:t>
+        <w:t>：</w:t>
       </w:r>
     </w:p>
     <w:p>
+      <w:pPr>
+        <w:pStyle w:val="ListBullet"/>
+      </w:pPr>
       <w:r>
         <w:rPr>
           <w:b w:val="0"/>
         </w:rPr>
-        <w:t>8B 单头效果最强的前 10 个头中，有 5 个与 4B 的因果头编号相同。</w:t>
+        <w:t>在 Qwen3-4B 上用本发明的两阶段方法选出 12 个调控头；</w:t>
+      </w:r>
+    </w:p>
+    <w:p>
+      <w:pPr>
+        <w:pStyle w:val="ListBullet"/>
+      </w:pPr>
+      <w:r>
+        <w:rPr>
+          <w:b w:val="0"/>
+        </w:rPr>
+        <w:t>在结构相同的 Qwen3-8B（同为 36 层 × 32 头）上，按相同的“层号 + 头号”定位这 12 个头，导向向量用 8B 自己的锚点特征计算；</w:t>
+      </w:r>
+    </w:p>
+    <w:p>
+      <w:pPr>
+        <w:pStyle w:val="ListBullet"/>
+      </w:pPr>
+      <w:r>
+        <w:rPr>
+          <w:b w:val="0"/>
+        </w:rPr>
+        <w:t>对照组是在 8B 上直接用两阶段方法选出的 12 个头（“原生选择”）。</w:t>
+      </w:r>
+    </w:p>
+    <w:p>
+      <w:r>
+        <w:rPr>
+          <w:b w:val="0"/>
+        </w:rPr>
+        <w:t>方案在产生数据之前登记。</w:t>
       </w:r>
     </w:p>
     <w:p>
@@ -2402,13 +2450,536 @@
         <w:rPr>
           <w:b/>
         </w:rPr>
-        <w:t>该结果是事后探索得到的，尚未经过预先登记的确认实验。</w:t>
+        <w:t>结果</w:t>
       </w:r>
       <w:r>
         <w:rPr>
           <w:b w:val="0"/>
         </w:rPr>
-        <w:t xml:space="preserve"> 建议作为从属权利要求，并在优先权期内补充确认数据。</w:t>
+        <w:t>（Qwen3-8B 测试集，40 个场景，560 条续写）：</w:t>
+      </w:r>
+    </w:p>
+    <w:tbl>
+      <w:tblPr>
+        <w:tblStyle w:val="TableGrid"/>
+        <w:tblW w:type="auto" w:w="0"/>
+        <w:tblLook w:firstColumn="1" w:firstRow="1" w:lastColumn="0" w:lastRow="0" w:noHBand="0" w:noVBand="1" w:val="04A0"/>
+      </w:tblPr>
+      <w:tblGrid>
+        <w:gridCol w:w="2160"/>
+        <w:gridCol w:w="2160"/>
+        <w:gridCol w:w="2160"/>
+        <w:gridCol w:w="2160"/>
+      </w:tblGrid>
+      <w:tr>
+        <w:tc>
+          <w:tcPr>
+            <w:tcW w:type="dxa" w:w="2160"/>
+          </w:tcPr>
+          <w:p>
+            <w:r>
+              <w:rPr>
+                <w:b/>
+              </w:rPr>
+              <w:t>对比</w:t>
+            </w:r>
+          </w:p>
+        </w:tc>
+        <w:tc>
+          <w:tcPr>
+            <w:tcW w:type="dxa" w:w="2160"/>
+          </w:tcPr>
+          <w:p>
+            <w:r>
+              <w:rPr>
+                <w:b/>
+              </w:rPr>
+              <w:t>差值</w:t>
+            </w:r>
+          </w:p>
+        </w:tc>
+        <w:tc>
+          <w:tcPr>
+            <w:tcW w:type="dxa" w:w="2160"/>
+          </w:tcPr>
+          <w:p>
+            <w:r>
+              <w:rPr>
+                <w:b/>
+              </w:rPr>
+              <w:t>95% 置信区间</w:t>
+            </w:r>
+          </w:p>
+        </w:tc>
+        <w:tc>
+          <w:tcPr>
+            <w:tcW w:type="dxa" w:w="2160"/>
+          </w:tcPr>
+          <w:p>
+            <w:r>
+              <w:rPr>
+                <w:b/>
+              </w:rPr>
+              <w:t>判定</w:t>
+            </w:r>
+          </w:p>
+        </w:tc>
+      </w:tr>
+      <w:tr>
+        <w:tc>
+          <w:tcPr>
+            <w:tcW w:type="dxa" w:w="2160"/>
+          </w:tcPr>
+          <w:p>
+            <w:r>
+              <w:rPr>
+                <w:b/>
+              </w:rPr>
+              <w:t>迁移 − 原生选择（不劣于检验，下限 −0.5）</w:t>
+            </w:r>
+          </w:p>
+        </w:tc>
+        <w:tc>
+          <w:tcPr>
+            <w:tcW w:type="dxa" w:w="2160"/>
+          </w:tcPr>
+          <w:p>
+            <w:r>
+              <w:rPr>
+                <w:b/>
+              </w:rPr>
+              <w:t>+0.06</w:t>
+            </w:r>
+          </w:p>
+        </w:tc>
+        <w:tc>
+          <w:tcPr>
+            <w:tcW w:type="dxa" w:w="2160"/>
+          </w:tcPr>
+          <w:p>
+            <w:r>
+              <w:rPr>
+                <w:b w:val="0"/>
+              </w:rPr>
+              <w:t>[−0.04, 0.18]</w:t>
+            </w:r>
+          </w:p>
+        </w:tc>
+        <w:tc>
+          <w:tcPr>
+            <w:tcW w:type="dxa" w:w="2160"/>
+          </w:tcPr>
+          <w:p>
+            <w:r>
+              <w:rPr>
+                <w:b/>
+              </w:rPr>
+              <w:t>通过</w:t>
+            </w:r>
+          </w:p>
+        </w:tc>
+      </w:tr>
+      <w:tr>
+        <w:tc>
+          <w:tcPr>
+            <w:tcW w:type="dxa" w:w="2160"/>
+          </w:tcPr>
+          <w:p>
+            <w:r>
+              <w:rPr>
+                <w:b w:val="0"/>
+              </w:rPr>
+              <w:t>迁移 − 随机 12 个头（总推力相同）</w:t>
+            </w:r>
+          </w:p>
+        </w:tc>
+        <w:tc>
+          <w:tcPr>
+            <w:tcW w:type="dxa" w:w="2160"/>
+          </w:tcPr>
+          <w:p>
+            <w:r>
+              <w:rPr>
+                <w:b w:val="0"/>
+              </w:rPr>
+              <w:t>+0.21</w:t>
+            </w:r>
+          </w:p>
+        </w:tc>
+        <w:tc>
+          <w:tcPr>
+            <w:tcW w:type="dxa" w:w="2160"/>
+          </w:tcPr>
+          <w:p>
+            <w:r>
+              <w:rPr>
+                <w:b w:val="0"/>
+              </w:rPr>
+              <w:t>[0.08, 0.35]</w:t>
+            </w:r>
+          </w:p>
+        </w:tc>
+        <w:tc>
+          <w:tcPr>
+            <w:tcW w:type="dxa" w:w="2160"/>
+          </w:tcPr>
+          <w:p>
+            <w:r>
+              <w:rPr>
+                <w:b w:val="0"/>
+              </w:rPr>
+              <w:t>通过</w:t>
+            </w:r>
+          </w:p>
+        </w:tc>
+      </w:tr>
+      <w:tr>
+        <w:tc>
+          <w:tcPr>
+            <w:tcW w:type="dxa" w:w="2160"/>
+          </w:tcPr>
+          <w:p>
+            <w:r>
+              <w:rPr>
+                <w:b w:val="0"/>
+              </w:rPr>
+              <w:t>迁移 − 不干预</w:t>
+            </w:r>
+          </w:p>
+        </w:tc>
+        <w:tc>
+          <w:tcPr>
+            <w:tcW w:type="dxa" w:w="2160"/>
+          </w:tcPr>
+          <w:p>
+            <w:r>
+              <w:rPr>
+                <w:b w:val="0"/>
+              </w:rPr>
+              <w:t>+0.24</w:t>
+            </w:r>
+          </w:p>
+        </w:tc>
+        <w:tc>
+          <w:tcPr>
+            <w:tcW w:type="dxa" w:w="2160"/>
+          </w:tcPr>
+          <w:p>
+            <w:r>
+              <w:rPr>
+                <w:b w:val="0"/>
+              </w:rPr>
+              <w:t>[0.08, 0.40]</w:t>
+            </w:r>
+          </w:p>
+        </w:tc>
+        <w:tc>
+          <w:tcPr>
+            <w:tcW w:type="dxa" w:w="2160"/>
+          </w:tcPr>
+          <w:p>
+            <w:r>
+              <w:rPr>
+                <w:b w:val="0"/>
+              </w:rPr>
+              <w:t>通过</w:t>
+            </w:r>
+          </w:p>
+        </w:tc>
+      </w:tr>
+      <w:tr>
+        <w:tc>
+          <w:tcPr>
+            <w:tcW w:type="dxa" w:w="2160"/>
+          </w:tcPr>
+          <w:p>
+            <w:r>
+              <w:rPr>
+                <w:b w:val="0"/>
+              </w:rPr>
+              <w:t>迁移 − 随机方向（要求 ≥ 0.5）</w:t>
+            </w:r>
+          </w:p>
+        </w:tc>
+        <w:tc>
+          <w:tcPr>
+            <w:tcW w:type="dxa" w:w="2160"/>
+          </w:tcPr>
+          <w:p>
+            <w:r>
+              <w:rPr>
+                <w:b w:val="0"/>
+              </w:rPr>
+              <w:t>+0.25</w:t>
+            </w:r>
+          </w:p>
+        </w:tc>
+        <w:tc>
+          <w:tcPr>
+            <w:tcW w:type="dxa" w:w="2160"/>
+          </w:tcPr>
+          <w:p>
+            <w:r>
+              <w:rPr>
+                <w:b w:val="0"/>
+              </w:rPr>
+              <w:t>[0.11, 0.39]</w:t>
+            </w:r>
+          </w:p>
+        </w:tc>
+        <w:tc>
+          <w:tcPr>
+            <w:tcW w:type="dxa" w:w="2160"/>
+          </w:tcPr>
+          <w:p>
+            <w:r>
+              <w:rPr>
+                <w:b w:val="0"/>
+              </w:rPr>
+              <w:t>未达到 0.5</w:t>
+            </w:r>
+          </w:p>
+        </w:tc>
+      </w:tr>
+      <w:tr>
+        <w:tc>
+          <w:tcPr>
+            <w:tcW w:type="dxa" w:w="2160"/>
+          </w:tcPr>
+          <w:p>
+            <w:r>
+              <w:rPr>
+                <w:b w:val="0"/>
+              </w:rPr>
+              <w:t>特异性：比喜悦</w:t>
+            </w:r>
+          </w:p>
+        </w:tc>
+        <w:tc>
+          <w:tcPr>
+            <w:tcW w:type="dxa" w:w="2160"/>
+          </w:tcPr>
+          <w:p>
+            <w:r>
+              <w:rPr>
+                <w:b w:val="0"/>
+              </w:rPr>
+              <w:t>+0.35</w:t>
+            </w:r>
+          </w:p>
+        </w:tc>
+        <w:tc>
+          <w:tcPr>
+            <w:tcW w:type="dxa" w:w="2160"/>
+          </w:tcPr>
+          <w:p>
+            <w:r>
+              <w:rPr>
+                <w:b w:val="0"/>
+              </w:rPr>
+              <w:t>置信区间 &gt; 0</w:t>
+            </w:r>
+          </w:p>
+        </w:tc>
+        <w:tc>
+          <w:tcPr>
+            <w:tcW w:type="dxa" w:w="2160"/>
+          </w:tcPr>
+          <w:p>
+            <w:r>
+              <w:rPr>
+                <w:b w:val="0"/>
+              </w:rPr>
+              <w:t>通过</w:t>
+            </w:r>
+          </w:p>
+        </w:tc>
+      </w:tr>
+      <w:tr>
+        <w:tc>
+          <w:tcPr>
+            <w:tcW w:type="dxa" w:w="2160"/>
+          </w:tcPr>
+          <w:p>
+            <w:r>
+              <w:rPr>
+                <w:b w:val="0"/>
+              </w:rPr>
+              <w:t>特异性：比悲伤</w:t>
+            </w:r>
+          </w:p>
+        </w:tc>
+        <w:tc>
+          <w:tcPr>
+            <w:tcW w:type="dxa" w:w="2160"/>
+          </w:tcPr>
+          <w:p>
+            <w:r>
+              <w:rPr>
+                <w:b w:val="0"/>
+              </w:rPr>
+              <w:t>−0.21</w:t>
+            </w:r>
+          </w:p>
+        </w:tc>
+        <w:tc>
+          <w:tcPr>
+            <w:tcW w:type="dxa" w:w="2160"/>
+          </w:tcPr>
+          <w:p>
+            <w:r>
+              <w:rPr>
+                <w:b w:val="0"/>
+              </w:rPr>
+              <w:t>置信区间跨 0</w:t>
+            </w:r>
+          </w:p>
+        </w:tc>
+        <w:tc>
+          <w:tcPr>
+            <w:tcW w:type="dxa" w:w="2160"/>
+          </w:tcPr>
+          <w:p>
+            <w:r>
+              <w:rPr>
+                <w:b w:val="0"/>
+              </w:rPr>
+              <w:t>未通过</w:t>
+            </w:r>
+          </w:p>
+        </w:tc>
+      </w:tr>
+      <w:tr>
+        <w:tc>
+          <w:tcPr>
+            <w:tcW w:type="dxa" w:w="2160"/>
+          </w:tcPr>
+          <w:p>
+            <w:r>
+              <w:rPr>
+                <w:b w:val="0"/>
+              </w:rPr>
+              <w:t>流畅度 / 事实一致性</w:t>
+            </w:r>
+          </w:p>
+        </w:tc>
+        <w:tc>
+          <w:tcPr>
+            <w:tcW w:type="dxa" w:w="2160"/>
+          </w:tcPr>
+          <w:p>
+            <w:r>
+              <w:rPr>
+                <w:b w:val="0"/>
+              </w:rPr>
+              <w:t>无变化</w:t>
+            </w:r>
+          </w:p>
+        </w:tc>
+        <w:tc>
+          <w:tcPr>
+            <w:tcW w:type="dxa" w:w="2160"/>
+          </w:tcPr>
+          <w:p/>
+        </w:tc>
+        <w:tc>
+          <w:tcPr>
+            <w:tcW w:type="dxa" w:w="2160"/>
+          </w:tcPr>
+          <w:p>
+            <w:r>
+              <w:rPr>
+                <w:b w:val="0"/>
+              </w:rPr>
+              <w:t>通过</w:t>
+            </w:r>
+          </w:p>
+        </w:tc>
+      </w:tr>
+    </w:tbl>
+    <w:p/>
+    <w:p>
+      <w:r>
+        <w:rPr>
+          <w:b/>
+        </w:rPr>
+        <w:t>结论</w:t>
+      </w:r>
+      <w:r>
+        <w:rPr>
+          <w:b w:val="0"/>
+        </w:rPr>
+        <w:t>：</w:t>
+      </w:r>
+    </w:p>
+    <w:p>
+      <w:pPr>
+        <w:pStyle w:val="ListBullet"/>
+      </w:pPr>
+      <w:r>
+        <w:rPr>
+          <w:b w:val="0"/>
+        </w:rPr>
+        <w:t>按编号迁移的头，导向效果</w:t>
+      </w:r>
+      <w:r>
+        <w:rPr>
+          <w:b/>
+        </w:rPr>
+        <w:t>不劣于在目标模型上原生选择的头</w:t>
+      </w:r>
+      <w:r>
+        <w:rPr>
+          <w:b w:val="0"/>
+        </w:rPr>
+        <w:t>（甚至略高）。</w:t>
+      </w:r>
+    </w:p>
+    <w:p>
+      <w:pPr>
+        <w:pStyle w:val="ListBullet"/>
+      </w:pPr>
+      <w:r>
+        <w:rPr>
+          <w:b w:val="0"/>
+        </w:rPr>
+        <w:t>迁移的头也优于同等推力的随机头，说明迁移的是真实的“头功能”。</w:t>
+      </w:r>
+    </w:p>
+    <w:p>
+      <w:pPr>
+        <w:pStyle w:val="ListBullet"/>
+      </w:pPr>
+      <w:r>
+        <w:rPr>
+          <w:b w:val="0"/>
+        </w:rPr>
+        <w:t>两组选出的头有 6/12 编号相同。</w:t>
+      </w:r>
+    </w:p>
+    <w:p>
+      <w:pPr>
+        <w:pStyle w:val="ListBullet"/>
+      </w:pPr>
+      <w:r>
+        <w:rPr>
+          <w:b w:val="0"/>
+        </w:rPr>
+        <w:t>在 Qwen3-4B 上，两阶段方法选出的头与因果修补选出的头有 7/12 相同。</w:t>
+      </w:r>
+    </w:p>
+    <w:p>
+      <w:r>
+        <w:rPr>
+          <w:b/>
+        </w:rPr>
+        <w:t>限制</w:t>
+      </w:r>
+      <w:r>
+        <w:rPr>
+          <w:b w:val="0"/>
+        </w:rPr>
+        <w:t>：Qwen3-8B 在 λ ≥ 2 时事实一致性下降超过预设的 5 个百分点，按规则只能取 λ = 1，所以本实验中迁移头和原生头的效果幅度都较小（约 +0.2）。对 8B 来说，这是“在事实一致性约束下可用的导向强度”的限制，不是迁移本身的限制。Qwen3-14B 在 λ = 8 时的质量代价在容忍范围内（见 4.1）。</w:t>
       </w:r>
     </w:p>
     <w:p>
@@ -3227,7 +3798,7 @@
         <w:rPr>
           <w:b w:val="0"/>
         </w:rPr>
-        <w:t>（从属，证据为探索性）根据权利要求 1 的方法，其特征在于：</w:t>
+        <w:t>（从属；证据见 4.5：不劣于原生选择的确认性检验通过）根据权利要求 1 的方法，其特征在于：</w:t>
       </w:r>
     </w:p>
     <w:p>
@@ -3791,6 +4362,34 @@
                 <w:b w:val="0"/>
               </w:rPr>
               <w:t>2026-10-07/e04/REPORT_E04.md（14B 两阶段确认性实验，全部门槛通过）</w:t>
+            </w:r>
+          </w:p>
+        </w:tc>
+      </w:tr>
+      <w:tr>
+        <w:tc>
+          <w:tcPr>
+            <w:tcW w:type="dxa" w:w="4320"/>
+          </w:tcPr>
+          <w:p>
+            <w:r>
+              <w:rPr>
+                <w:b w:val="0"/>
+              </w:rPr>
+              <w:t>E05 实验报告</w:t>
+            </w:r>
+          </w:p>
+        </w:tc>
+        <w:tc>
+          <w:tcPr>
+            <w:tcW w:type="dxa" w:w="4320"/>
+          </w:tcPr>
+          <w:p>
+            <w:r>
+              <w:rPr>
+                <w:b w:val="0"/>
+              </w:rPr>
+              <w:t>2026-10-07/e05/REPORT_E05.md（4B → 8B 按编号迁移，不劣于原生选择）</w:t>
             </w:r>
           </w:p>
         </w:tc>

</xml_diff>

<commit_message>
Literature review (LIT_REVIEW.md) and patent risk section 12: AtP* prefilter+verify, GCM, ITI per-step injection anticipate parts of the claims
Co-Authored-By: Claude Opus 5.5 <noreply@anthropic.com>
</commit_message>
<xml_diff>
--- a/patent/交底书-基于内容不变锚点的属性承载注意力头定位与调控.docx
+++ b/patent/交底书-基于内容不变锚点的属性承载注意力头定位与调控.docx
@@ -4452,6 +4452,609 @@
       </w:tr>
     </w:tbl>
     <w:p/>
+    <w:p>
+      <w:pPr>
+        <w:pStyle w:val="Heading1"/>
+      </w:pPr>
+      <w:r>
+        <w:t>十二、文献调研后的风险提示（2026-10-07，请代理人重点复核）</w:t>
+      </w:r>
+    </w:p>
+    <w:p>
+      <w:r>
+        <w:rPr>
+          <w:b w:val="0"/>
+        </w:rPr>
+        <w:t>研发方完成了学术文献调研，全文见仓库根目录 LIT_REVIEW.md。调研只覆盖学术文献，</w:t>
+      </w:r>
+      <w:r>
+        <w:rPr>
+          <w:b/>
+        </w:rPr>
+        <w:t>尚未检索专利数据库</w:t>
+      </w:r>
+      <w:r>
+        <w:rPr>
+          <w:b w:val="0"/>
+        </w:rPr>
+        <w:t>（CNIPA / USPTO / EPO），提交前需要补做。</w:t>
+      </w:r>
+    </w:p>
+    <w:p>
+      <w:r>
+        <w:rPr>
+          <w:b w:val="0"/>
+        </w:rPr>
+        <w:t>下面几项现有技术对权利要求影响较大。</w:t>
+      </w:r>
+    </w:p>
+    <w:tbl>
+      <w:tblPr>
+        <w:tblStyle w:val="TableGrid"/>
+        <w:tblW w:type="auto" w:w="0"/>
+        <w:tblLook w:firstColumn="1" w:firstRow="1" w:lastColumn="0" w:lastRow="0" w:noHBand="0" w:noVBand="1" w:val="04A0"/>
+      </w:tblPr>
+      <w:tblGrid>
+        <w:gridCol w:w="2160"/>
+        <w:gridCol w:w="2160"/>
+        <w:gridCol w:w="2160"/>
+        <w:gridCol w:w="2160"/>
+      </w:tblGrid>
+      <w:tr>
+        <w:tc>
+          <w:tcPr>
+            <w:tcW w:type="dxa" w:w="2160"/>
+          </w:tcPr>
+          <w:p>
+            <w:r>
+              <w:rPr>
+                <w:b/>
+              </w:rPr>
+              <w:t>权利要求要素</w:t>
+            </w:r>
+          </w:p>
+        </w:tc>
+        <w:tc>
+          <w:tcPr>
+            <w:tcW w:type="dxa" w:w="2160"/>
+          </w:tcPr>
+          <w:p>
+            <w:r>
+              <w:rPr>
+                <w:b/>
+              </w:rPr>
+              <w:t>最接近的现有技术</w:t>
+            </w:r>
+          </w:p>
+        </w:tc>
+        <w:tc>
+          <w:tcPr>
+            <w:tcW w:type="dxa" w:w="2160"/>
+          </w:tcPr>
+          <w:p>
+            <w:r>
+              <w:rPr>
+                <w:b/>
+              </w:rPr>
+              <w:t>风险</w:t>
+            </w:r>
+          </w:p>
+        </w:tc>
+        <w:tc>
+          <w:tcPr>
+            <w:tcW w:type="dxa" w:w="2160"/>
+          </w:tcPr>
+          <w:p>
+            <w:r>
+              <w:rPr>
+                <w:b/>
+              </w:rPr>
+              <w:t>说明</w:t>
+            </w:r>
+          </w:p>
+        </w:tc>
+      </w:tr>
+      <w:tr>
+        <w:tc>
+          <w:tcPr>
+            <w:tcW w:type="dxa" w:w="2160"/>
+          </w:tcPr>
+          <w:p>
+            <w:r>
+              <w:rPr>
+                <w:b/>
+              </w:rPr>
+              <w:t>两阶段框架本身</w:t>
+            </w:r>
+            <w:r>
+              <w:rPr>
+                <w:b w:val="0"/>
+              </w:rPr>
+              <w:t>（廉价估计预筛 + 少量因果验证）</w:t>
+            </w:r>
+          </w:p>
+        </w:tc>
+        <w:tc>
+          <w:tcPr>
+            <w:tcW w:type="dxa" w:w="2160"/>
+          </w:tcPr>
+          <w:p>
+            <w:r>
+              <w:rPr>
+                <w:b/>
+              </w:rPr>
+              <w:t>AtP</w:t>
+            </w:r>
+            <w:r>
+              <w:rPr>
+                <w:b w:val="0"/>
+              </w:rPr>
+              <w:t>*（Kramár 等，Google DeepMind，arXiv:2403.00745，2024）</w:t>
+            </w:r>
+          </w:p>
+        </w:tc>
+        <w:tc>
+          <w:tcPr>
+            <w:tcW w:type="dxa" w:w="2160"/>
+          </w:tcPr>
+          <w:p>
+            <w:r>
+              <w:rPr>
+                <w:b/>
+              </w:rPr>
+              <w:t>高</w:t>
+            </w:r>
+            <w:r>
+              <w:rPr>
+                <w:b w:val="0"/>
+              </w:rPr>
+              <w:t>（宽泛写法）</w:t>
+            </w:r>
+          </w:p>
+        </w:tc>
+        <w:tc>
+          <w:tcPr>
+            <w:tcW w:type="dxa" w:w="2160"/>
+          </w:tcPr>
+          <w:p>
+            <w:r>
+              <w:rPr>
+                <w:b w:val="0"/>
+              </w:rPr>
+              <w:t>研发方已核实原文：AtP* 明确提出先用归因修补作为 “prefiltering step”，再对排名靠前的节点做激活修补 “verification”</w:t>
+            </w:r>
+          </w:p>
+        </w:tc>
+      </w:tr>
+      <w:tr>
+        <w:tc>
+          <w:tcPr>
+            <w:tcW w:type="dxa" w:w="2160"/>
+          </w:tcPr>
+          <w:p>
+            <w:r>
+              <w:rPr>
+                <w:b w:val="0"/>
+              </w:rPr>
+              <w:t>按因果中介选头用于导向，且优于按探针选头</w:t>
+            </w:r>
+          </w:p>
+        </w:tc>
+        <w:tc>
+          <w:tcPr>
+            <w:tcW w:type="dxa" w:w="2160"/>
+          </w:tcPr>
+          <w:p>
+            <w:r>
+              <w:rPr>
+                <w:b w:val="0"/>
+              </w:rPr>
+              <w:t>GCM（Sankaranarayanan 等，arXiv:2602.16080，2026）</w:t>
+            </w:r>
+          </w:p>
+        </w:tc>
+        <w:tc>
+          <w:tcPr>
+            <w:tcW w:type="dxa" w:w="2160"/>
+          </w:tcPr>
+          <w:p>
+            <w:r>
+              <w:rPr>
+                <w:b w:val="0"/>
+              </w:rPr>
+              <w:t>高</w:t>
+            </w:r>
+          </w:p>
+        </w:tc>
+        <w:tc>
+          <w:tcPr>
+            <w:tcW w:type="dxa" w:w="2160"/>
+          </w:tcPr>
+          <w:p>
+            <w:r>
+              <w:rPr>
+                <w:b w:val="0"/>
+              </w:rPr>
+              <w:t>已核实存在。“两阶段优于只用可读性”这一结论已被部分预见</w:t>
+            </w:r>
+          </w:p>
+        </w:tc>
+      </w:tr>
+      <w:tr>
+        <w:tc>
+          <w:tcPr>
+            <w:tcW w:type="dxa" w:w="2160"/>
+          </w:tcPr>
+          <w:p>
+            <w:r>
+              <w:rPr>
+                <w:b w:val="0"/>
+              </w:rPr>
+              <w:t>第二阶段：逐头导向并取最优</w:t>
+            </w:r>
+          </w:p>
+        </w:tc>
+        <w:tc>
+          <w:tcPr>
+            <w:tcW w:type="dxa" w:w="2160"/>
+          </w:tcPr>
+          <w:p>
+            <w:r>
+              <w:rPr>
+                <w:b w:val="0"/>
+              </w:rPr>
+              <w:t>Darm &amp; Riccardi（arXiv:2502.05945，TMLR 2025）</w:t>
+            </w:r>
+          </w:p>
+        </w:tc>
+        <w:tc>
+          <w:tcPr>
+            <w:tcW w:type="dxa" w:w="2160"/>
+          </w:tcPr>
+          <w:p>
+            <w:r>
+              <w:rPr>
+                <w:b w:val="0"/>
+              </w:rPr>
+              <w:t>中</w:t>
+            </w:r>
+          </w:p>
+        </w:tc>
+        <w:tc>
+          <w:tcPr>
+            <w:tcW w:type="dxa" w:w="2160"/>
+          </w:tcPr>
+          <w:p>
+            <w:r>
+              <w:rPr>
+                <w:b w:val="0"/>
+              </w:rPr>
+              <w:t>逐头导向选优，但没有预筛</w:t>
+            </w:r>
+          </w:p>
+        </w:tc>
+      </w:tr>
+      <w:tr>
+        <w:tc>
+          <w:tcPr>
+            <w:tcW w:type="dxa" w:w="2160"/>
+          </w:tcPr>
+          <w:p>
+            <w:r>
+              <w:rPr>
+                <w:b w:val="0"/>
+              </w:rPr>
+              <w:t>情绪的同场景对照 + 按头消融排序</w:t>
+            </w:r>
+          </w:p>
+        </w:tc>
+        <w:tc>
+          <w:tcPr>
+            <w:tcW w:type="dxa" w:w="2160"/>
+          </w:tcPr>
+          <w:p>
+            <w:r>
+              <w:rPr>
+                <w:b w:val="0"/>
+              </w:rPr>
+              <w:t>Wang 等，Emotion Circuits（arXiv:2510.11328）</w:t>
+            </w:r>
+          </w:p>
+        </w:tc>
+        <w:tc>
+          <w:tcPr>
+            <w:tcW w:type="dxa" w:w="2160"/>
+          </w:tcPr>
+          <w:p>
+            <w:r>
+              <w:rPr>
+                <w:b w:val="0"/>
+              </w:rPr>
+              <w:t>中</w:t>
+            </w:r>
+          </w:p>
+        </w:tc>
+        <w:tc>
+          <w:tcPr>
+            <w:tcW w:type="dxa" w:w="2160"/>
+          </w:tcPr>
+          <w:p>
+            <w:r>
+              <w:rPr>
+                <w:b w:val="0"/>
+              </w:rPr>
+              <w:t>读取位置在提示末尾，不是逐字相同的锚点；没有“预筛 + 少量筛选”；没有跨尺寸迁移</w:t>
+            </w:r>
+          </w:p>
+        </w:tc>
+      </w:tr>
+      <w:tr>
+        <w:tc>
+          <w:tcPr>
+            <w:tcW w:type="dxa" w:w="2160"/>
+          </w:tcPr>
+          <w:p>
+            <w:r>
+              <w:rPr>
+                <w:b/>
+              </w:rPr>
+              <w:t>持续注入（每个生成步）</w:t>
+            </w:r>
+          </w:p>
+        </w:tc>
+        <w:tc>
+          <w:tcPr>
+            <w:tcW w:type="dxa" w:w="2160"/>
+          </w:tcPr>
+          <w:p>
+            <w:r>
+              <w:rPr>
+                <w:b w:val="0"/>
+              </w:rPr>
+              <w:t>ITI（arXiv:2306.03341）、CAA</w:t>
+            </w:r>
+          </w:p>
+        </w:tc>
+        <w:tc>
+          <w:tcPr>
+            <w:tcW w:type="dxa" w:w="2160"/>
+          </w:tcPr>
+          <w:p>
+            <w:r>
+              <w:rPr>
+                <w:b/>
+              </w:rPr>
+              <w:t>高</w:t>
+            </w:r>
+          </w:p>
+        </w:tc>
+        <w:tc>
+          <w:tcPr>
+            <w:tcW w:type="dxa" w:w="2160"/>
+          </w:tcPr>
+          <w:p>
+            <w:r>
+              <w:rPr>
+                <w:b w:val="0"/>
+              </w:rPr>
+              <w:t>ITI 本身就在每个生成步平移所选头的输出。持续注入</w:t>
+            </w:r>
+            <w:r>
+              <w:rPr>
+                <w:b/>
+              </w:rPr>
+              <w:t>不宜</w:t>
+            </w:r>
+            <w:r>
+              <w:rPr>
+                <w:b w:val="0"/>
+              </w:rPr>
+              <w:t>作为区别特征；“一次性干预无效”可以作为实验发现写入说明书</w:t>
+            </w:r>
+          </w:p>
+        </w:tc>
+      </w:tr>
+      <w:tr>
+        <w:tc>
+          <w:tcPr>
+            <w:tcW w:type="dxa" w:w="2160"/>
+          </w:tcPr>
+          <w:p>
+            <w:r>
+              <w:rPr>
+                <w:b w:val="0"/>
+              </w:rPr>
+              <w:t>锚点承载分数</w:t>
+            </w:r>
+          </w:p>
+        </w:tc>
+        <w:tc>
+          <w:tcPr>
+            <w:tcW w:type="dxa" w:w="2160"/>
+          </w:tcPr>
+          <w:p>
+            <w:r>
+              <w:rPr>
+                <w:b w:val="0"/>
+              </w:rPr>
+              <w:t>同场景对照、Tigges 等的 “summarization motif”、“Label Words are Anchors”</w:t>
+            </w:r>
+          </w:p>
+        </w:tc>
+        <w:tc>
+          <w:tcPr>
+            <w:tcW w:type="dxa" w:w="2160"/>
+          </w:tcPr>
+          <w:p>
+            <w:r>
+              <w:rPr>
+                <w:b w:val="0"/>
+              </w:rPr>
+              <w:t>中</w:t>
+            </w:r>
+          </w:p>
+        </w:tc>
+        <w:tc>
+          <w:tcPr>
+            <w:tcW w:type="dxa" w:w="2160"/>
+          </w:tcPr>
+          <w:p>
+            <w:r>
+              <w:rPr>
+                <w:b w:val="0"/>
+              </w:rPr>
+              <w:t>未发现以逐字相同的续写片段作为评分位置的先例，但各组成部分都已存在</w:t>
+            </w:r>
+          </w:p>
+        </w:tc>
+      </w:tr>
+      <w:tr>
+        <w:tc>
+          <w:tcPr>
+            <w:tcW w:type="dxa" w:w="2160"/>
+          </w:tcPr>
+          <w:p>
+            <w:r>
+              <w:rPr>
+                <w:b w:val="0"/>
+              </w:rPr>
+              <w:t>同家族按编号迁移</w:t>
+            </w:r>
+          </w:p>
+        </w:tc>
+        <w:tc>
+          <w:tcPr>
+            <w:tcW w:type="dxa" w:w="2160"/>
+          </w:tcPr>
+          <w:p>
+            <w:r>
+              <w:rPr>
+                <w:b w:val="0"/>
+              </w:rPr>
+              <w:t>跨模型线性映射迁移导向向量 / 探针的多篇工作（如 arXiv:2503.04429、2506.06609、2604.06377）</w:t>
+            </w:r>
+          </w:p>
+        </w:tc>
+        <w:tc>
+          <w:tcPr>
+            <w:tcW w:type="dxa" w:w="2160"/>
+          </w:tcPr>
+          <w:p>
+            <w:r>
+              <w:rPr>
+                <w:b w:val="0"/>
+              </w:rPr>
+              <w:t>新颖性低到中；显而易见性中</w:t>
+            </w:r>
+          </w:p>
+        </w:tc>
+        <w:tc>
+          <w:tcPr>
+            <w:tcW w:type="dxa" w:w="2160"/>
+          </w:tcPr>
+          <w:p>
+            <w:r>
+              <w:rPr>
+                <w:b w:val="0"/>
+              </w:rPr>
+              <w:t>未发现“按层号 + 头号复制头集合，并做不劣于原生选择的检验”的先例；但审查员可能认为对同结构模型复制编号是“容易想到的”</w:t>
+            </w:r>
+          </w:p>
+        </w:tc>
+      </w:tr>
+    </w:tbl>
+    <w:p/>
+    <w:p>
+      <w:r>
+        <w:rPr>
+          <w:b/>
+        </w:rPr>
+        <w:t>建议的收窄方向</w:t>
+      </w:r>
+      <w:r>
+        <w:rPr>
+          <w:b w:val="0"/>
+        </w:rPr>
+        <w:t>（供代理人判断）：独立权利要求同时限定以下几点，以区别于 AtP* 和 GCM：</w:t>
+      </w:r>
+    </w:p>
+    <w:p>
+      <w:pPr>
+        <w:pStyle w:val="ListNumber"/>
+      </w:pPr>
+      <w:r>
+        <w:rPr>
+          <w:b w:val="0"/>
+        </w:rPr>
+        <w:t>第一阶段为</w:t>
+      </w:r>
+      <w:r>
+        <w:rPr>
+          <w:b/>
+        </w:rPr>
+        <w:t>只做前向、闭式计算</w:t>
+      </w:r>
+      <w:r>
+        <w:rPr>
+          <w:b w:val="0"/>
+        </w:rPr>
+        <w:t>的锚点承载分数：在逐 token 相同的锚点位置，扣除内容组方差后计算属性方差占比。AtP* 用梯度，GCM 用因果中介。</w:t>
+      </w:r>
+    </w:p>
+    <w:p>
+      <w:pPr>
+        <w:pStyle w:val="ListNumber"/>
+      </w:pPr>
+      <w:r>
+        <w:rPr>
+          <w:b w:val="0"/>
+        </w:rPr>
+        <w:t>第二阶段为</w:t>
+      </w:r>
+      <w:r>
+        <w:rPr>
+          <w:b/>
+        </w:rPr>
+        <w:t>统一推力</w:t>
+      </w:r>
+      <w:r>
+        <w:rPr>
+          <w:b w:val="0"/>
+        </w:rPr>
+        <w:t>的</w:t>
+      </w:r>
+      <w:r>
+        <w:rPr>
+          <w:b/>
+        </w:rPr>
+        <w:t>带符号</w:t>
+      </w:r>
+      <w:r>
+        <w:rPr>
+          <w:b w:val="0"/>
+        </w:rPr>
+        <w:t>导向效果筛选，并带显著性阈值，只保留正向头。</w:t>
+      </w:r>
+    </w:p>
+    <w:p>
+      <w:pPr>
+        <w:pStyle w:val="ListNumber"/>
+      </w:pPr>
+      <w:r>
+        <w:rPr>
+          <w:b w:val="0"/>
+        </w:rPr>
+        <w:t>用途限定为属性导向，配以说明书中“只用第一阶段会因正反向头相互抵消而失效”的实验证据（E03）。</w:t>
+      </w:r>
+    </w:p>
+    <w:p>
+      <w:r>
+        <w:rPr>
+          <w:b w:val="0"/>
+        </w:rPr>
+        <w:t>“持续注入”只保留为从属特征。</w:t>
+      </w:r>
+    </w:p>
     <w:sectPr>
       <w:pgSz w:w="12240" w:h="15840"/>
       <w:pgMar w:top="1440" w:right="1800" w:bottom="1440" w:left="1800" w:header="720" w:footer="720" w:gutter="0"/>

</xml_diff>

<commit_message>
Patent search (PATENT_SEARCH.md, Google Patents, ~40 docs verified) and disclosure section 12 update: CN121835622A closest to claim 1(a)
Co-Authored-By: Claude Opus 5.5 <noreply@anthropic.com>
</commit_message>
<xml_diff>
--- a/patent/交底书-基于内容不变锚点的属性承载注意力头定位与调控.docx
+++ b/patent/交底书-基于内容不变锚点的属性承载注意力头定位与调控.docx
@@ -4465,19 +4465,19 @@
         <w:rPr>
           <w:b w:val="0"/>
         </w:rPr>
-        <w:t>研发方完成了学术文献调研，全文见仓库根目录 LIT_REVIEW.md。调研只覆盖学术文献，</w:t>
+        <w:t>研发方完成了学术文献调研，全文见仓库根目录 LIT_REVIEW.md。另已用 Google Patents 做了初步专利检索：打开约 40 件文献，逐件核对，详见 patent/PATENT_SEARCH.md。WIPO、Espacenet、CNIPA 检索系统未能访问，</w:t>
       </w:r>
       <w:r>
         <w:rPr>
           <w:b/>
         </w:rPr>
-        <w:t>尚未检索专利数据库</w:t>
+        <w:t>仍需代理人做专业的新颖性检索</w:t>
       </w:r>
       <w:r>
         <w:rPr>
           <w:b w:val="0"/>
         </w:rPr>
-        <w:t>（CNIPA / USPTO / EPO），提交前需要补做。</w:t>
+        <w:t>。</w:t>
       </w:r>
     </w:p>
     <w:p>
@@ -5055,6 +5055,451 @@
         <w:t>“持续注入”只保留为从属特征。</w:t>
       </w:r>
     </w:p>
+    <w:p>
+      <w:r>
+        <w:rPr>
+          <w:b/>
+        </w:rPr>
+        <w:t>专利文献中最接近的几件</w:t>
+      </w:r>
+      <w:r>
+        <w:rPr>
+          <w:b w:val="0"/>
+        </w:rPr>
+        <w:t>（研发方已核实前两件的原文）：</w:t>
+      </w:r>
+    </w:p>
+    <w:tbl>
+      <w:tblPr>
+        <w:tblStyle w:val="TableGrid"/>
+        <w:tblW w:type="auto" w:w="0"/>
+        <w:tblLook w:firstColumn="1" w:firstRow="1" w:lastColumn="0" w:lastRow="0" w:noHBand="0" w:noVBand="1" w:val="04A0"/>
+      </w:tblPr>
+      <w:tblGrid>
+        <w:gridCol w:w="2160"/>
+        <w:gridCol w:w="2160"/>
+        <w:gridCol w:w="2160"/>
+        <w:gridCol w:w="2160"/>
+      </w:tblGrid>
+      <w:tr>
+        <w:tc>
+          <w:tcPr>
+            <w:tcW w:type="dxa" w:w="2160"/>
+          </w:tcPr>
+          <w:p>
+            <w:r>
+              <w:rPr>
+                <w:b/>
+              </w:rPr>
+              <w:t>文献</w:t>
+            </w:r>
+          </w:p>
+        </w:tc>
+        <w:tc>
+          <w:tcPr>
+            <w:tcW w:type="dxa" w:w="2160"/>
+          </w:tcPr>
+          <w:p>
+            <w:r>
+              <w:rPr>
+                <w:b/>
+              </w:rPr>
+              <w:t>申请人 / 公开日</w:t>
+            </w:r>
+          </w:p>
+        </w:tc>
+        <w:tc>
+          <w:tcPr>
+            <w:tcW w:type="dxa" w:w="2160"/>
+          </w:tcPr>
+          <w:p>
+            <w:r>
+              <w:rPr>
+                <w:b/>
+              </w:rPr>
+              <w:t>内容</w:t>
+            </w:r>
+          </w:p>
+        </w:tc>
+        <w:tc>
+          <w:tcPr>
+            <w:tcW w:type="dxa" w:w="2160"/>
+          </w:tcPr>
+          <w:p>
+            <w:r>
+              <w:rPr>
+                <w:b/>
+              </w:rPr>
+              <w:t>与本发明的关系</w:t>
+            </w:r>
+          </w:p>
+        </w:tc>
+      </w:tr>
+      <w:tr>
+        <w:tc>
+          <w:tcPr>
+            <w:tcW w:type="dxa" w:w="2160"/>
+          </w:tcPr>
+          <w:p>
+            <w:r>
+              <w:rPr>
+                <w:b/>
+              </w:rPr>
+              <w:t>CN121835622A</w:t>
+            </w:r>
+          </w:p>
+        </w:tc>
+        <w:tc>
+          <w:tcPr>
+            <w:tcW w:type="dxa" w:w="2160"/>
+          </w:tcPr>
+          <w:p>
+            <w:r>
+              <w:rPr>
+                <w:b w:val="0"/>
+              </w:rPr>
+              <w:t>平安科技，优先权日 2026-01-16，公开日 2026-04-10，审查中</w:t>
+            </w:r>
+          </w:p>
+        </w:tc>
+        <w:tc>
+          <w:tcPr>
+            <w:tcW w:type="dxa" w:w="2160"/>
+          </w:tcPr>
+          <w:p>
+            <w:r>
+              <w:rPr>
+                <w:b w:val="0"/>
+              </w:rPr>
+              <w:t>以“方差解释比例”（同步正交匹配追踪在词表字典上计算）作为每个注意力头的“专门化分数”，取前 k 个头，用系数放大或抑制其输出</w:t>
+            </w:r>
+          </w:p>
+        </w:tc>
+        <w:tc>
+          <w:tcPr>
+            <w:tcW w:type="dxa" w:w="2160"/>
+          </w:tcPr>
+          <w:p>
+            <w:r>
+              <w:rPr>
+                <w:b/>
+              </w:rPr>
+              <w:t>与权利要求 1(a) 最接近，创造性风险高</w:t>
+            </w:r>
+            <w:r>
+              <w:rPr>
+                <w:b w:val="0"/>
+              </w:rPr>
+              <w:t>。区别：其方差由词表原子解释，不是由属性因子解释；没有逐字相同的锚点；没有扣除内容组方差；没有方向筛选</w:t>
+            </w:r>
+          </w:p>
+        </w:tc>
+      </w:tr>
+      <w:tr>
+        <w:tc>
+          <w:tcPr>
+            <w:tcW w:type="dxa" w:w="2160"/>
+          </w:tcPr>
+          <w:p>
+            <w:r>
+              <w:rPr>
+                <w:b w:val="0"/>
+              </w:rPr>
+              <w:t>CN121659903A</w:t>
+            </w:r>
+          </w:p>
+        </w:tc>
+        <w:tc>
+          <w:tcPr>
+            <w:tcW w:type="dxa" w:w="2160"/>
+          </w:tcPr>
+          <w:p>
+            <w:r>
+              <w:rPr>
+                <w:b w:val="0"/>
+              </w:rPr>
+              <w:t>北京航空航天大学，2026-03-13</w:t>
+            </w:r>
+          </w:p>
+        </w:tc>
+        <w:tc>
+          <w:tcPr>
+            <w:tcW w:type="dxa" w:w="2160"/>
+          </w:tcPr>
+          <w:p>
+            <w:r>
+              <w:rPr>
+                <w:b w:val="0"/>
+              </w:rPr>
+              <w:t>以真 / 假知识簇的激活分布差异作为头的敏感度，动态取前 K 个头，再做表示层干预</w:t>
+            </w:r>
+          </w:p>
+        </w:tc>
+        <w:tc>
+          <w:tcPr>
+            <w:tcW w:type="dxa" w:w="2160"/>
+          </w:tcPr>
+          <w:p>
+            <w:r>
+              <w:rPr>
+                <w:b w:val="0"/>
+              </w:rPr>
+              <w:t>与 1(a) 接近</w:t>
+            </w:r>
+          </w:p>
+        </w:tc>
+      </w:tr>
+      <w:tr>
+        <w:tc>
+          <w:tcPr>
+            <w:tcW w:type="dxa" w:w="2160"/>
+          </w:tcPr>
+          <w:p>
+            <w:r>
+              <w:rPr>
+                <w:b w:val="0"/>
+              </w:rPr>
+              <w:t>CN121171488A、CN121962742A</w:t>
+            </w:r>
+          </w:p>
+        </w:tc>
+        <w:tc>
+          <w:tcPr>
+            <w:tcW w:type="dxa" w:w="2160"/>
+          </w:tcPr>
+          <w:p>
+            <w:r>
+              <w:rPr>
+                <w:b w:val="0"/>
+              </w:rPr>
+              <w:t>北京科技大学 / 平安科技</w:t>
+            </w:r>
+          </w:p>
+        </w:tc>
+        <w:tc>
+          <w:tcPr>
+            <w:tcW w:type="dxa" w:w="2160"/>
+          </w:tcPr>
+          <w:p>
+            <w:r>
+              <w:rPr>
+                <w:b w:val="0"/>
+              </w:rPr>
+              <w:t>ITI 式做法：探针或分类器选头，再按头施加方向向量。后者使用“同义不同语言”的成对输入</w:t>
+            </w:r>
+          </w:p>
+        </w:tc>
+        <w:tc>
+          <w:tcPr>
+            <w:tcW w:type="dxa" w:w="2160"/>
+          </w:tcPr>
+          <w:p>
+            <w:r>
+              <w:rPr>
+                <w:b w:val="0"/>
+              </w:rPr>
+              <w:t>与 1(a) 接近</w:t>
+            </w:r>
+          </w:p>
+        </w:tc>
+      </w:tr>
+      <w:tr>
+        <w:tc>
+          <w:tcPr>
+            <w:tcW w:type="dxa" w:w="2160"/>
+          </w:tcPr>
+          <w:p>
+            <w:r>
+              <w:rPr>
+                <w:b w:val="0"/>
+              </w:rPr>
+              <w:t>US20250292760A1</w:t>
+            </w:r>
+          </w:p>
+        </w:tc>
+        <w:tc>
+          <w:tcPr>
+            <w:tcW w:type="dxa" w:w="2160"/>
+          </w:tcPr>
+          <w:p>
+            <w:r>
+              <w:rPr>
+                <w:b w:val="0"/>
+              </w:rPr>
+              <w:t>三菱电机研究实验室，2025-09-18</w:t>
+            </w:r>
+          </w:p>
+        </w:tc>
+        <w:tc>
+          <w:tcPr>
+            <w:tcW w:type="dxa" w:w="2160"/>
+          </w:tcPr>
+          <w:p>
+            <w:r>
+              <w:rPr>
+                <w:b w:val="0"/>
+              </w:rPr>
+              <w:t>音频生成中，在所选的头上按性状方向推动；从属权利要求用逐头分类器选头</w:t>
+            </w:r>
+          </w:p>
+        </w:tc>
+        <w:tc>
+          <w:tcPr>
+            <w:tcW w:type="dxa" w:w="2160"/>
+          </w:tcPr>
+          <w:p>
+            <w:r>
+              <w:rPr>
+                <w:b w:val="0"/>
+              </w:rPr>
+              <w:t>与 1(a)、权利要求 2 相关</w:t>
+            </w:r>
+          </w:p>
+        </w:tc>
+      </w:tr>
+      <w:tr>
+        <w:tc>
+          <w:tcPr>
+            <w:tcW w:type="dxa" w:w="2160"/>
+          </w:tcPr>
+          <w:p>
+            <w:r>
+              <w:rPr>
+                <w:b w:val="0"/>
+              </w:rPr>
+              <w:t>CN121351840A、NVIDIA 同族（US20260087328A1 等）、CN118796999A（已授权）</w:t>
+            </w:r>
+          </w:p>
+        </w:tc>
+        <w:tc>
+          <w:tcPr>
+            <w:tcW w:type="dxa" w:w="2160"/>
+          </w:tcPr>
+          <w:p/>
+        </w:tc>
+        <w:tc>
+          <w:tcPr>
+            <w:tcW w:type="dxa" w:w="2160"/>
+          </w:tcPr>
+          <w:p>
+            <w:r>
+              <w:rPr>
+                <w:b w:val="0"/>
+              </w:rPr>
+              <w:t>每个生成步注入导向向量；NVIDIA 同族还包括“读取内部激活状态后有条件地导向”</w:t>
+            </w:r>
+          </w:p>
+        </w:tc>
+        <w:tc>
+          <w:tcPr>
+            <w:tcW w:type="dxa" w:w="2160"/>
+          </w:tcPr>
+          <w:p>
+            <w:r>
+              <w:rPr>
+                <w:b w:val="0"/>
+              </w:rPr>
+              <w:t>权利要求 2 基本无新颖性；与权利要求 9 的预警分支相关</w:t>
+            </w:r>
+          </w:p>
+        </w:tc>
+      </w:tr>
+    </w:tbl>
+    <w:p/>
+    <w:p>
+      <w:r>
+        <w:rPr>
+          <w:b/>
+        </w:rPr>
+        <w:t>检索结论</w:t>
+      </w:r>
+      <w:r>
+        <w:rPr>
+          <w:b w:val="0"/>
+        </w:rPr>
+        <w:t>：</w:t>
+      </w:r>
+    </w:p>
+    <w:p>
+      <w:pPr>
+        <w:pStyle w:val="ListBullet"/>
+      </w:pPr>
+      <w:r>
+        <w:rPr>
+          <w:b w:val="0"/>
+        </w:rPr>
+        <w:t>没有发现单件文献公开权利要求 1 的完整组合（锚点 + 扣除内容组方差 + 预筛 + 带符号的方向筛选）。</w:t>
+      </w:r>
+    </w:p>
+    <w:p>
+      <w:pPr>
+        <w:pStyle w:val="ListBullet"/>
+      </w:pPr>
+      <w:r>
+        <w:rPr>
+          <w:b w:val="0"/>
+        </w:rPr>
+        <w:t>权利要求 1(b)（方向筛选）的主要风险来自学术文献（AtP*、GCM），而不是专利文献。</w:t>
+      </w:r>
+    </w:p>
+    <w:p>
+      <w:pPr>
+        <w:pStyle w:val="ListBullet"/>
+      </w:pPr>
+      <w:r>
+        <w:rPr>
+          <w:b w:val="0"/>
+        </w:rPr>
+        <w:t>权利要求 9（驱动表情）和权利要求 11（按编号迁移）在专利文献中未发现接近的现有技术，但后者可能被认为显而易见。</w:t>
+      </w:r>
+    </w:p>
+    <w:p>
+      <w:r>
+        <w:rPr>
+          <w:b/>
+        </w:rPr>
+        <w:t>建议</w:t>
+      </w:r>
+      <w:r>
+        <w:rPr>
+          <w:b w:val="0"/>
+        </w:rPr>
+        <w:t>：</w:t>
+      </w:r>
+    </w:p>
+    <w:p>
+      <w:pPr>
+        <w:pStyle w:val="ListNumber"/>
+      </w:pPr>
+      <w:r>
+        <w:rPr>
+          <w:b w:val="0"/>
+        </w:rPr>
+        <w:t>独立权利要求必须同时写入 1(a) 和 1(b)，不能只保护 1(a)。</w:t>
+      </w:r>
+    </w:p>
+    <w:p>
+      <w:pPr>
+        <w:pStyle w:val="ListNumber"/>
+      </w:pPr>
+      <w:r>
+        <w:rPr>
+          <w:b w:val="0"/>
+        </w:rPr>
+        <w:t>持续注入只作为从属特征。</w:t>
+      </w:r>
+    </w:p>
+    <w:p>
+      <w:pPr>
+        <w:pStyle w:val="ListNumber"/>
+      </w:pPr>
+      <w:r>
+        <w:rPr>
+          <w:b w:val="0"/>
+        </w:rPr>
+        <w:t>为证明锚点设计和方向筛选的必要性，建议补充一组对比实验：在同一模型、同一数据上，与 GCM 的归因修补版（对全部头打分）和 ITI 式探针选头做正面比较。</w:t>
+      </w:r>
+    </w:p>
     <w:sectPr>
       <w:pgSz w:w="12240" w:h="15840"/>
       <w:pgMar w:top="1440" w:right="1800" w:bottom="1440" w:left="1800" w:header="720" w:footer="720" w:gutter="0"/>

</xml_diff>

<commit_message>
README and patent disclosure section 13: E06 shows GCM attribution patching dominates two-stage selection; recommend reconsidering the core claim
Co-Authored-By: Claude Opus 5.5 <noreply@anthropic.com>
</commit_message>
<xml_diff>
--- a/patent/交底书-基于内容不变锚点的属性承载注意力头定位与调控.docx
+++ b/patent/交底书-基于内容不变锚点的属性承载注意力头定位与调控.docx
@@ -33,6 +33,36 @@
           <w:i/>
         </w:rPr>
         <w:t>本草稿由研发方整理，不构成法律意见。新颖性和创造性结论、权利要求的最终措辞，以专利代理人检索和撰写为准。</w:t>
+      </w:r>
+    </w:p>
+    <w:p>
+      <w:r>
+        <w:rPr>
+          <w:b/>
+          <w:i/>
+        </w:rPr>
+        <w:t>⚠ 重要（2026-10-07，E06 之后）</w:t>
+      </w:r>
+      <w:r>
+        <w:rPr>
+          <w:b w:val="0"/>
+          <w:i/>
+        </w:rPr>
+        <w:t>：研发方在同一模型、同一数据上，把本发明与 GCM 的归因修补选头做了正面比较，</w:t>
+      </w:r>
+      <w:r>
+        <w:rPr>
+          <w:b/>
+          <w:i/>
+        </w:rPr>
+        <w:t>本发明明显较差</w:t>
+      </w:r>
+      <w:r>
+        <w:rPr>
+          <w:b w:val="0"/>
+          <w:i/>
+        </w:rPr>
+        <w:t>（见第十三节）。提交前请先阅读第十三节，重新评估是否申请，以及保护哪一部分。</w:t>
       </w:r>
     </w:p>
     <w:p>
@@ -5500,6 +5530,561 @@
         <w:t>为证明锚点设计和方向筛选的必要性，建议补充一组对比实验：在同一模型、同一数据上，与 GCM 的归因修补版（对全部头打分）和 ITI 式探针选头做正面比较。</w:t>
       </w:r>
     </w:p>
+    <w:p>
+      <w:pPr>
+        <w:pStyle w:val="Heading1"/>
+      </w:pPr>
+      <w:r>
+        <w:t>十三、与 GCM 归因修补的正面比较（E06，2026-10-07）及其对申请的影响</w:t>
+      </w:r>
+    </w:p>
+    <w:p>
+      <w:r>
+        <w:rPr>
+          <w:b/>
+        </w:rPr>
+        <w:t>实验</w:t>
+      </w:r>
+      <w:r>
+        <w:rPr>
+          <w:b w:val="0"/>
+        </w:rPr>
+        <w:t>：</w:t>
+      </w:r>
+    </w:p>
+    <w:p>
+      <w:pPr>
+        <w:pStyle w:val="ListBullet"/>
+      </w:pPr>
+      <w:r>
+        <w:rPr>
+          <w:b w:val="0"/>
+        </w:rPr>
+        <w:t>方案在产生数据之前登记（commit ae874a1）。</w:t>
+      </w:r>
+    </w:p>
+    <w:p>
+      <w:pPr>
+        <w:pStyle w:val="ListBullet"/>
+      </w:pPr>
+      <w:r>
+        <w:rPr>
+          <w:b w:val="0"/>
+        </w:rPr>
+        <w:t>在 Qwen3-14B 上，用同一份数据、同等总推力，比较四种选头方法：</w:t>
+      </w:r>
+    </w:p>
+    <w:p>
+      <w:pPr>
+        <w:pStyle w:val="ListBullet"/>
+      </w:pPr>
+      <w:r>
+        <w:rPr>
+          <w:b w:val="0"/>
+        </w:rPr>
+        <w:t>本发明的两阶段方法（与 4.1 同一组头）；</w:t>
+      </w:r>
+    </w:p>
+    <w:p>
+      <w:pPr>
+        <w:pStyle w:val="ListBullet"/>
+      </w:pPr>
+      <w:r>
+        <w:rPr>
+          <w:b w:val="0"/>
+        </w:rPr>
+        <w:t>GCM 的归因修补版：对全部 1600 个头打分；</w:t>
+      </w:r>
+    </w:p>
+    <w:p>
+      <w:pPr>
+        <w:pStyle w:val="ListBullet"/>
+      </w:pPr>
+      <w:r>
+        <w:rPr>
+          <w:b w:val="0"/>
+        </w:rPr>
+        <w:t>ITI 式探针选头；</w:t>
+      </w:r>
+    </w:p>
+    <w:p>
+      <w:pPr>
+        <w:pStyle w:val="ListBullet"/>
+      </w:pPr>
+      <w:r>
+        <w:rPr>
+          <w:b w:val="0"/>
+        </w:rPr>
+        <w:t>本发明的变体：第二阶段改用模型自生成的回复。</w:t>
+      </w:r>
+    </w:p>
+    <w:p>
+      <w:pPr>
+        <w:pStyle w:val="ListBullet"/>
+      </w:pPr>
+      <w:r>
+        <w:rPr>
+          <w:b w:val="0"/>
+        </w:rPr>
+        <w:t>40 个测试场景，640 条续写，两路盲评。</w:t>
+      </w:r>
+    </w:p>
+    <w:p>
+      <w:r>
+        <w:rPr>
+          <w:b/>
+        </w:rPr>
+        <w:t>结果</w:t>
+      </w:r>
+      <w:r>
+        <w:rPr>
+          <w:b w:val="0"/>
+        </w:rPr>
+        <w:t>（愤怒程度，满分 4；λ = 8）：</w:t>
+      </w:r>
+    </w:p>
+    <w:tbl>
+      <w:tblPr>
+        <w:tblStyle w:val="TableGrid"/>
+        <w:tblW w:type="auto" w:w="0"/>
+        <w:tblLook w:firstColumn="1" w:firstRow="1" w:lastColumn="0" w:lastRow="0" w:noHBand="0" w:noVBand="1" w:val="04A0"/>
+      </w:tblPr>
+      <w:tblGrid>
+        <w:gridCol w:w="2880"/>
+        <w:gridCol w:w="2880"/>
+        <w:gridCol w:w="2880"/>
+      </w:tblGrid>
+      <w:tr>
+        <w:tc>
+          <w:tcPr>
+            <w:tcW w:type="dxa" w:w="2880"/>
+          </w:tcPr>
+          <w:p>
+            <w:r>
+              <w:rPr>
+                <w:b/>
+              </w:rPr>
+              <w:t>方法</w:t>
+            </w:r>
+          </w:p>
+        </w:tc>
+        <w:tc>
+          <w:tcPr>
+            <w:tcW w:type="dxa" w:w="2880"/>
+          </w:tcPr>
+          <w:p>
+            <w:r>
+              <w:rPr>
+                <w:b/>
+              </w:rPr>
+              <w:t>愤怒均值</w:t>
+            </w:r>
+          </w:p>
+        </w:tc>
+        <w:tc>
+          <w:tcPr>
+            <w:tcW w:type="dxa" w:w="2880"/>
+          </w:tcPr>
+          <w:p>
+            <w:r>
+              <w:rPr>
+                <w:b/>
+              </w:rPr>
+              <w:t>选头耗时</w:t>
+            </w:r>
+          </w:p>
+        </w:tc>
+      </w:tr>
+      <w:tr>
+        <w:tc>
+          <w:tcPr>
+            <w:tcW w:type="dxa" w:w="2880"/>
+          </w:tcPr>
+          <w:p>
+            <w:r>
+              <w:rPr>
+                <w:b/>
+              </w:rPr>
+              <w:t>GCM 归因修补</w:t>
+            </w:r>
+          </w:p>
+        </w:tc>
+        <w:tc>
+          <w:tcPr>
+            <w:tcW w:type="dxa" w:w="2880"/>
+          </w:tcPr>
+          <w:p>
+            <w:r>
+              <w:rPr>
+                <w:b/>
+              </w:rPr>
+              <w:t>3.01</w:t>
+            </w:r>
+          </w:p>
+        </w:tc>
+        <w:tc>
+          <w:tcPr>
+            <w:tcW w:type="dxa" w:w="2880"/>
+          </w:tcPr>
+          <w:p>
+            <w:r>
+              <w:rPr>
+                <w:b/>
+              </w:rPr>
+              <w:t>33 秒</w:t>
+            </w:r>
+            <w:r>
+              <w:rPr>
+                <w:b w:val="0"/>
+              </w:rPr>
+              <w:t>（全部 1600 个头）</w:t>
+            </w:r>
+          </w:p>
+        </w:tc>
+      </w:tr>
+      <w:tr>
+        <w:tc>
+          <w:tcPr>
+            <w:tcW w:type="dxa" w:w="2880"/>
+          </w:tcPr>
+          <w:p>
+            <w:r>
+              <w:rPr>
+                <w:b w:val="0"/>
+              </w:rPr>
+              <w:t>本发明变体（自生成回复）</w:t>
+            </w:r>
+          </w:p>
+        </w:tc>
+        <w:tc>
+          <w:tcPr>
+            <w:tcW w:type="dxa" w:w="2880"/>
+          </w:tcPr>
+          <w:p>
+            <w:r>
+              <w:rPr>
+                <w:b w:val="0"/>
+              </w:rPr>
+              <w:t>2.30</w:t>
+            </w:r>
+          </w:p>
+        </w:tc>
+        <w:tc>
+          <w:tcPr>
+            <w:tcW w:type="dxa" w:w="2880"/>
+          </w:tcPr>
+          <w:p>
+            <w:r>
+              <w:rPr>
+                <w:b w:val="0"/>
+              </w:rPr>
+              <w:t>约 13 分钟</w:t>
+            </w:r>
+          </w:p>
+        </w:tc>
+      </w:tr>
+      <w:tr>
+        <w:tc>
+          <w:tcPr>
+            <w:tcW w:type="dxa" w:w="2880"/>
+          </w:tcPr>
+          <w:p>
+            <w:r>
+              <w:rPr>
+                <w:b w:val="0"/>
+              </w:rPr>
+              <w:t>本发明（两阶段）</w:t>
+            </w:r>
+          </w:p>
+        </w:tc>
+        <w:tc>
+          <w:tcPr>
+            <w:tcW w:type="dxa" w:w="2880"/>
+          </w:tcPr>
+          <w:p>
+            <w:r>
+              <w:rPr>
+                <w:b w:val="0"/>
+              </w:rPr>
+              <w:t>2.03</w:t>
+            </w:r>
+          </w:p>
+        </w:tc>
+        <w:tc>
+          <w:tcPr>
+            <w:tcW w:type="dxa" w:w="2880"/>
+          </w:tcPr>
+          <w:p>
+            <w:r>
+              <w:rPr>
+                <w:b w:val="0"/>
+              </w:rPr>
+              <w:t>约 13 分钟</w:t>
+            </w:r>
+          </w:p>
+        </w:tc>
+      </w:tr>
+      <w:tr>
+        <w:tc>
+          <w:tcPr>
+            <w:tcW w:type="dxa" w:w="2880"/>
+          </w:tcPr>
+          <w:p>
+            <w:r>
+              <w:rPr>
+                <w:b w:val="0"/>
+              </w:rPr>
+              <w:t>ITI</w:t>
+            </w:r>
+          </w:p>
+        </w:tc>
+        <w:tc>
+          <w:tcPr>
+            <w:tcW w:type="dxa" w:w="2880"/>
+          </w:tcPr>
+          <w:p>
+            <w:r>
+              <w:rPr>
+                <w:b w:val="0"/>
+              </w:rPr>
+              <w:t>0.50</w:t>
+            </w:r>
+          </w:p>
+        </w:tc>
+        <w:tc>
+          <w:tcPr>
+            <w:tcW w:type="dxa" w:w="2880"/>
+          </w:tcPr>
+          <w:p>
+            <w:r>
+              <w:rPr>
+                <w:b w:val="0"/>
+              </w:rPr>
+              <w:t>6 秒</w:t>
+            </w:r>
+          </w:p>
+        </w:tc>
+      </w:tr>
+      <w:tr>
+        <w:tc>
+          <w:tcPr>
+            <w:tcW w:type="dxa" w:w="2880"/>
+          </w:tcPr>
+          <w:p>
+            <w:r>
+              <w:rPr>
+                <w:b w:val="0"/>
+              </w:rPr>
+              <w:t>不干预</w:t>
+            </w:r>
+          </w:p>
+        </w:tc>
+        <w:tc>
+          <w:tcPr>
+            <w:tcW w:type="dxa" w:w="2880"/>
+          </w:tcPr>
+          <w:p>
+            <w:r>
+              <w:rPr>
+                <w:b w:val="0"/>
+              </w:rPr>
+              <w:t>0.33</w:t>
+            </w:r>
+          </w:p>
+        </w:tc>
+        <w:tc>
+          <w:tcPr>
+            <w:tcW w:type="dxa" w:w="2880"/>
+          </w:tcPr>
+          <w:p/>
+        </w:tc>
+      </w:tr>
+    </w:tbl>
+    <w:p/>
+    <w:p>
+      <w:pPr>
+        <w:pStyle w:val="ListBullet"/>
+      </w:pPr>
+      <w:r>
+        <w:rPr>
+          <w:b w:val="0"/>
+        </w:rPr>
+        <w:t xml:space="preserve">本发明 − GCM = </w:t>
+      </w:r>
+      <w:r>
+        <w:rPr>
+          <w:b/>
+        </w:rPr>
+        <w:t>−0.99</w:t>
+      </w:r>
+      <w:r>
+        <w:rPr>
+          <w:b w:val="0"/>
+        </w:rPr>
+        <w:t>，95% 置信区间 [−1.38, −0.64]。λ = 4 时为 −1.06，结论相同。</w:t>
+      </w:r>
+    </w:p>
+    <w:p>
+      <w:pPr>
+        <w:pStyle w:val="ListBullet"/>
+      </w:pPr>
+      <w:r>
+        <w:rPr>
+          <w:b w:val="0"/>
+        </w:rPr>
+        <w:t>GCM 的质量代价也更小：λ = 8 时，流畅度 −0.04，本发明为 −0.34。</w:t>
+      </w:r>
+    </w:p>
+    <w:p>
+      <w:r>
+        <w:rPr>
+          <w:b/>
+        </w:rPr>
+        <w:t>结论</w:t>
+      </w:r>
+      <w:r>
+        <w:rPr>
+          <w:b w:val="0"/>
+        </w:rPr>
+        <w:t>：在导向效果、质量代价和选头速度三个方面，本发明都</w:t>
+      </w:r>
+      <w:r>
+        <w:rPr>
+          <w:b/>
+        </w:rPr>
+        <w:t>不如</w:t>
+      </w:r>
+      <w:r>
+        <w:rPr>
+          <w:b w:val="0"/>
+        </w:rPr>
+        <w:t>已公开的 GCM 归因修补方法。原定的核心权利要求（两阶段选头用于导向）即使能获得授权，其技术效果也会被现有技术超越，商业价值有限。</w:t>
+      </w:r>
+    </w:p>
+    <w:p>
+      <w:r>
+        <w:rPr>
+          <w:b/>
+        </w:rPr>
+        <w:t>研发方建议</w:t>
+      </w:r>
+      <w:r>
+        <w:rPr>
+          <w:b w:val="0"/>
+        </w:rPr>
+        <w:t>（供申请人与代理人决策）：</w:t>
+      </w:r>
+    </w:p>
+    <w:p>
+      <w:pPr>
+        <w:pStyle w:val="ListNumber"/>
+      </w:pPr>
+      <w:r>
+        <w:rPr>
+          <w:b/>
+        </w:rPr>
+        <w:t>不以“两阶段选头用于导向”为核心申请</w:t>
+      </w:r>
+      <w:r>
+        <w:rPr>
+          <w:b w:val="0"/>
+        </w:rPr>
+        <w:t>，或推迟申请，等有新的改进后再提交。</w:t>
+      </w:r>
+    </w:p>
+    <w:p>
+      <w:pPr>
+        <w:pStyle w:val="ListNumber"/>
+      </w:pPr>
+      <w:r>
+        <w:rPr>
+          <w:b/>
+        </w:rPr>
+        <w:t>可评估的剩余保护点</w:t>
+      </w:r>
+      <w:r>
+        <w:rPr>
+          <w:b w:val="0"/>
+        </w:rPr>
+        <w:t>：</w:t>
+      </w:r>
+    </w:p>
+    <w:p>
+      <w:pPr>
+        <w:pStyle w:val="ListBullet2"/>
+      </w:pPr>
+      <w:r>
+        <w:rPr>
+          <w:b w:val="0"/>
+        </w:rPr>
+        <w:t>锚点承载分数作为</w:t>
+      </w:r>
+      <w:r>
+        <w:rPr>
+          <w:b/>
+        </w:rPr>
+        <w:t>只需前向计算</w:t>
+      </w:r>
+      <w:r>
+        <w:rPr>
+          <w:b w:val="0"/>
+        </w:rPr>
+        <w:t>的诊断或读数位置选择方法。适用于无法做反向传播的部署环境，例如只提供推理接口的场景。</w:t>
+      </w:r>
+    </w:p>
+    <w:p>
+      <w:pPr>
+        <w:pStyle w:val="ListBullet2"/>
+      </w:pPr>
+      <w:r>
+        <w:rPr>
+          <w:b w:val="0"/>
+        </w:rPr>
+        <w:t>第 9 条：读数驱动表情或预警。专利检索中未发现近似的现有技术。</w:t>
+      </w:r>
+    </w:p>
+    <w:p>
+      <w:pPr>
+        <w:pStyle w:val="ListBullet2"/>
+      </w:pPr>
+      <w:r>
+        <w:rPr>
+          <w:b w:val="0"/>
+        </w:rPr>
+        <w:t>第 11 条：同家族模型按编号迁移，已有确认数据（4.5）。</w:t>
+      </w:r>
+    </w:p>
+    <w:p>
+      <w:r>
+        <w:rPr>
+          <w:b w:val="0"/>
+        </w:rPr>
+        <w:t>这些点的价值需要代理人结合市场判断。</w:t>
+      </w:r>
+    </w:p>
+    <w:p>
+      <w:pPr>
+        <w:pStyle w:val="ListNumber"/>
+      </w:pPr>
+      <w:r>
+        <w:rPr>
+          <w:b w:val="0"/>
+        </w:rPr>
+        <w:t>本发明的研究发现（E02–E06）更适合以</w:t>
+      </w:r>
+      <w:r>
+        <w:rPr>
+          <w:b/>
+        </w:rPr>
+        <w:t>论文</w:t>
+      </w:r>
+      <w:r>
+        <w:rPr>
+          <w:b w:val="0"/>
+        </w:rPr>
+        <w:t>形式发表，但必须在申请决定作出之后。</w:t>
+      </w:r>
+    </w:p>
     <w:sectPr>
       <w:pgSz w:w="12240" w:h="15840"/>
       <w:pgMar w:top="1440" w:right="1800" w:bottom="1440" w:left="1800" w:header="720" w:footer="720" w:gutter="0"/>

</xml_diff>